<commit_message>
Add agent value and framework diagrams to brief
</commit_message>
<xml_diff>
--- a/docs/dynamic-ontology-osdk-demo-architecture-brief.docx
+++ b/docs/dynamic-ontology-osdk-demo-architecture-brief.docx
@@ -19,7 +19,7 @@
               <a:graphicData uri="http://schemas.openxmlformats.org/drawingml/2006/picture">
                 <pic:pic>
                   <pic:nvPicPr>
-                    <pic:cNvPr id="0" name="page-1.png"/>
+                    <pic:cNvPr id="0" name="existing-01.png"/>
                     <pic:cNvPicPr/>
                   </pic:nvPicPr>
                   <pic:blipFill>
@@ -59,7 +59,7 @@
               <a:graphicData uri="http://schemas.openxmlformats.org/drawingml/2006/picture">
                 <pic:pic>
                   <pic:nvPicPr>
-                    <pic:cNvPr id="0" name="page-2.png"/>
+                    <pic:cNvPr id="0" name="existing-02.png"/>
                     <pic:cNvPicPr/>
                   </pic:nvPicPr>
                   <pic:blipFill>
@@ -99,7 +99,7 @@
               <a:graphicData uri="http://schemas.openxmlformats.org/drawingml/2006/picture">
                 <pic:pic>
                   <pic:nvPicPr>
-                    <pic:cNvPr id="0" name="page-3.png"/>
+                    <pic:cNvPr id="0" name="existing-03.png"/>
                     <pic:cNvPicPr/>
                   </pic:nvPicPr>
                   <pic:blipFill>
@@ -139,7 +139,7 @@
               <a:graphicData uri="http://schemas.openxmlformats.org/drawingml/2006/picture">
                 <pic:pic>
                   <pic:nvPicPr>
-                    <pic:cNvPr id="0" name="page-4.png"/>
+                    <pic:cNvPr id="0" name="existing-04.png"/>
                     <pic:cNvPicPr/>
                   </pic:nvPicPr>
                   <pic:blipFill>
@@ -179,7 +179,7 @@
               <a:graphicData uri="http://schemas.openxmlformats.org/drawingml/2006/picture">
                 <pic:pic>
                   <pic:nvPicPr>
-                    <pic:cNvPr id="0" name="page-5.png"/>
+                    <pic:cNvPr id="0" name="existing-05.png"/>
                     <pic:cNvPicPr/>
                   </pic:nvPicPr>
                   <pic:blipFill>
@@ -219,7 +219,7 @@
               <a:graphicData uri="http://schemas.openxmlformats.org/drawingml/2006/picture">
                 <pic:pic>
                   <pic:nvPicPr>
-                    <pic:cNvPr id="0" name="page-6.png"/>
+                    <pic:cNvPr id="0" name="existing-06.png"/>
                     <pic:cNvPicPr/>
                   </pic:nvPicPr>
                   <pic:blipFill>
@@ -259,7 +259,7 @@
               <a:graphicData uri="http://schemas.openxmlformats.org/drawingml/2006/picture">
                 <pic:pic>
                   <pic:nvPicPr>
-                    <pic:cNvPr id="0" name="page-7.png"/>
+                    <pic:cNvPr id="0" name="existing-07.png"/>
                     <pic:cNvPicPr/>
                   </pic:nvPicPr>
                   <pic:blipFill>
@@ -299,7 +299,7 @@
               <a:graphicData uri="http://schemas.openxmlformats.org/drawingml/2006/picture">
                 <pic:pic>
                   <pic:nvPicPr>
-                    <pic:cNvPr id="0" name="page-8.png"/>
+                    <pic:cNvPr id="0" name="existing-08.png"/>
                     <pic:cNvPicPr/>
                   </pic:nvPicPr>
                   <pic:blipFill>
@@ -339,11 +339,91 @@
               <a:graphicData uri="http://schemas.openxmlformats.org/drawingml/2006/picture">
                 <pic:pic>
                   <pic:nvPicPr>
-                    <pic:cNvPr id="0" name="page-9.png"/>
+                    <pic:cNvPr id="0" name="existing-09.png"/>
                     <pic:cNvPicPr/>
                   </pic:nvPicPr>
                   <pic:blipFill>
                     <a:blip r:embed="rId17"/>
+                    <a:stretch>
+                      <a:fillRect/>
+                    </a:stretch>
+                  </pic:blipFill>
+                  <pic:spPr>
+                    <a:xfrm>
+                      <a:off x="0" y="0"/>
+                      <a:ext cx="7452360" cy="9638386"/>
+                    </a:xfrm>
+                    <a:prstGeom prst="rect"/>
+                  </pic:spPr>
+                </pic:pic>
+              </a:graphicData>
+            </a:graphic>
+          </wp:inline>
+        </w:drawing>
+      </w:r>
+    </w:p>
+    <w:p>
+      <w:pPr>
+        <w:spacing w:before="0" w:after="0" w:line="240" w:lineRule="auto"/>
+        <w:jc w:val="center"/>
+      </w:pPr>
+      <w:r>
+        <w:drawing>
+          <wp:inline xmlns:a="http://schemas.openxmlformats.org/drawingml/2006/main" xmlns:pic="http://schemas.openxmlformats.org/drawingml/2006/picture">
+            <wp:extent cx="7452360" cy="9638386"/>
+            <wp:docPr id="10" name="Picture 10"/>
+            <wp:cNvGraphicFramePr>
+              <a:graphicFrameLocks noChangeAspect="1"/>
+            </wp:cNvGraphicFramePr>
+            <a:graphic>
+              <a:graphicData uri="http://schemas.openxmlformats.org/drawingml/2006/picture">
+                <pic:pic>
+                  <pic:nvPicPr>
+                    <pic:cNvPr id="0" name="page-10-agent-value.png"/>
+                    <pic:cNvPicPr/>
+                  </pic:nvPicPr>
+                  <pic:blipFill>
+                    <a:blip r:embed="rId18"/>
+                    <a:stretch>
+                      <a:fillRect/>
+                    </a:stretch>
+                  </pic:blipFill>
+                  <pic:spPr>
+                    <a:xfrm>
+                      <a:off x="0" y="0"/>
+                      <a:ext cx="7452360" cy="9638386"/>
+                    </a:xfrm>
+                    <a:prstGeom prst="rect"/>
+                  </pic:spPr>
+                </pic:pic>
+              </a:graphicData>
+            </a:graphic>
+          </wp:inline>
+        </w:drawing>
+      </w:r>
+    </w:p>
+    <w:p>
+      <w:pPr>
+        <w:spacing w:before="0" w:after="0" w:line="240" w:lineRule="auto"/>
+        <w:jc w:val="center"/>
+      </w:pPr>
+      <w:r>
+        <w:drawing>
+          <wp:inline xmlns:a="http://schemas.openxmlformats.org/drawingml/2006/main" xmlns:pic="http://schemas.openxmlformats.org/drawingml/2006/picture">
+            <wp:extent cx="7452360" cy="9638386"/>
+            <wp:docPr id="11" name="Picture 11"/>
+            <wp:cNvGraphicFramePr>
+              <a:graphicFrameLocks noChangeAspect="1"/>
+            </wp:cNvGraphicFramePr>
+            <a:graphic>
+              <a:graphicData uri="http://schemas.openxmlformats.org/drawingml/2006/picture">
+                <pic:pic>
+                  <pic:nvPicPr>
+                    <pic:cNvPr id="0" name="page-11-framework.png"/>
+                    <pic:cNvPicPr/>
+                  </pic:nvPicPr>
+                  <pic:blipFill>
+                    <a:blip r:embed="rId19"/>
                     <a:stretch>
                       <a:fillRect/>
                     </a:stretch>

</xml_diff>

<commit_message>
Position demo as agent-era trusted data space network
</commit_message>
<xml_diff>
--- a/docs/dynamic-ontology-osdk-demo-architecture-brief.docx
+++ b/docs/dynamic-ontology-osdk-demo-architecture-brief.docx
@@ -14,7 +14,16 @@
           <w:color w:val="165DFF"/>
           <w:sz w:val="48"/>
         </w:rPr>
-        <w:t>动态本体 OSDK 可信数据产品 Demo：从问题到演示的完整说明</w:t>
+        <w:t>面向 Agent 时代的可信数据空间网络 Demo</w:t>
+      </w:r>
+    </w:p>
+    <w:p>
+      <w:r>
+        <w:rPr>
+          <w:rFonts w:ascii="Heiti SC" w:hAnsi="Heiti SC" w:eastAsia="Heiti SC" w:cs="Heiti SC" w:hint="eastAsia"/>
+          <w:b w:val="0"/>
+        </w:rPr>
+        <w:t>副标题：动态本体 OSDK + awiki.ai Agent 网络 + 可信数据产品流转</w:t>
       </w:r>
     </w:p>
     <w:p>
@@ -43,7 +52,7 @@
           <w:rFonts w:ascii="Heiti SC" w:hAnsi="Heiti SC" w:eastAsia="Heiti SC" w:cs="Heiti SC" w:hint="eastAsia"/>
           <w:b w:val="0"/>
         </w:rPr>
-        <w:t>这个 Demo 的目标不是证明“我们能生成一个 SDK”。如果只是生成 SDK，技术难度并不高，也不能形成真正的可信数据产品能力。</w:t>
+        <w:t>这个 Demo 的目标不是证明“我们能生成一个 SDK”。如果只是生成 SDK，技术难度并不高，也不能形成真正的可信数据产品能力，更不能支撑 awiki.ai 想拓展的 Agent 网络市场。</w:t>
       </w:r>
     </w:p>
     <w:p>
@@ -93,7 +102,9 @@
               <w:br/>
               <w:t>再把动态本体按用途、授权、分类分级和质量规则编译成数据产品；</w:t>
               <w:br/>
-              <w:t>最后把数据产品暴露成 Agent 可安全调用的 Product OSDK / MCP Tool。</w:t>
+              <w:t>最后把数据产品暴露成 Agent 可安全调用的 Product OSDK / MCP Tool；</w:t>
+              <w:br/>
+              <w:t>并让买方 Agent、服务方 Agent、数据提供方内部数字员工在 awiki.ai 网络中协作。</w:t>
             </w:r>
           </w:p>
         </w:tc>
@@ -583,6 +594,106 @@
           </w:p>
         </w:tc>
       </w:tr>
+      <w:tr>
+        <w:tc>
+          <w:tcPr>
+            <w:tcW w:type="dxa" w:w="4997"/>
+            <w:vAlign w:val="center"/>
+            <w:tcMar>
+              <w:top w:w="90" w:type="dxa"/>
+              <w:start w:w="100" w:type="dxa"/>
+              <w:bottom w:w="90" w:type="dxa"/>
+              <w:end w:w="100" w:type="dxa"/>
+            </w:tcMar>
+          </w:tcPr>
+          <w:p>
+            <w:pPr>
+              <w:spacing w:after="0"/>
+            </w:pPr>
+            <w:r>
+              <w:rPr>
+                <w:rFonts w:ascii="Heiti SC" w:hAnsi="Heiti SC" w:eastAsia="Heiti SC" w:cs="Heiti SC" w:hint="eastAsia"/>
+                <w:sz w:val="18"/>
+              </w:rPr>
+              <w:t>awiki.ai Agent 网络</w:t>
+            </w:r>
+          </w:p>
+        </w:tc>
+        <w:tc>
+          <w:tcPr>
+            <w:tcW w:type="dxa" w:w="4997"/>
+            <w:vAlign w:val="center"/>
+            <w:tcMar>
+              <w:top w:w="90" w:type="dxa"/>
+              <w:start w:w="100" w:type="dxa"/>
+              <w:bottom w:w="90" w:type="dxa"/>
+              <w:end w:w="100" w:type="dxa"/>
+            </w:tcMar>
+          </w:tcPr>
+          <w:p>
+            <w:pPr>
+              <w:spacing w:after="0"/>
+            </w:pPr>
+            <w:r>
+              <w:rPr>
+                <w:rFonts w:ascii="Heiti SC" w:hAnsi="Heiti SC" w:eastAsia="Heiti SC" w:cs="Heiti SC" w:hint="eastAsia"/>
+                <w:sz w:val="18"/>
+              </w:rPr>
+              <w:t>让 Agent 具备身份、发现、消息协作和异步通知能力，适合承载数据服务交易过程</w:t>
+            </w:r>
+          </w:p>
+        </w:tc>
+      </w:tr>
+      <w:tr>
+        <w:tc>
+          <w:tcPr>
+            <w:tcW w:type="dxa" w:w="4997"/>
+            <w:vAlign w:val="center"/>
+            <w:tcMar>
+              <w:top w:w="90" w:type="dxa"/>
+              <w:start w:w="100" w:type="dxa"/>
+              <w:bottom w:w="90" w:type="dxa"/>
+              <w:end w:w="100" w:type="dxa"/>
+            </w:tcMar>
+          </w:tcPr>
+          <w:p>
+            <w:pPr>
+              <w:spacing w:after="0"/>
+            </w:pPr>
+            <w:r>
+              <w:rPr>
+                <w:rFonts w:ascii="Heiti SC" w:hAnsi="Heiti SC" w:eastAsia="Heiti SC" w:cs="Heiti SC" w:hint="eastAsia"/>
+                <w:sz w:val="18"/>
+              </w:rPr>
+              <w:t>数据服务数字员工部</w:t>
+            </w:r>
+          </w:p>
+        </w:tc>
+        <w:tc>
+          <w:tcPr>
+            <w:tcW w:type="dxa" w:w="4997"/>
+            <w:vAlign w:val="center"/>
+            <w:tcMar>
+              <w:top w:w="90" w:type="dxa"/>
+              <w:start w:w="100" w:type="dxa"/>
+              <w:bottom w:w="90" w:type="dxa"/>
+              <w:end w:w="100" w:type="dxa"/>
+            </w:tcMar>
+          </w:tcPr>
+          <w:p>
+            <w:pPr>
+              <w:spacing w:after="0"/>
+            </w:pPr>
+            <w:r>
+              <w:rPr>
+                <w:rFonts w:ascii="Heiti SC" w:hAnsi="Heiti SC" w:eastAsia="Heiti SC" w:cs="Heiti SC" w:hint="eastAsia"/>
+                <w:sz w:val="18"/>
+              </w:rPr>
+              <w:t>数据提供方内部的一组 Agent，帮助完成产品上架、授权、质量检查、编译、交付和售后复核</w:t>
+            </w:r>
+          </w:p>
+        </w:tc>
+      </w:tr>
     </w:tbl>
     <w:p/>
     <w:p>
@@ -860,6 +971,56 @@
                 <w:sz w:val="18"/>
               </w:rPr>
               <w:t>Agent 发现产品、申请授权、调用 OSDK、适配接口变化、验证 Receipt</w:t>
+            </w:r>
+          </w:p>
+        </w:tc>
+      </w:tr>
+      <w:tr>
+        <w:tc>
+          <w:tcPr>
+            <w:tcW w:type="dxa" w:w="4997"/>
+            <w:vAlign w:val="center"/>
+            <w:tcMar>
+              <w:top w:w="90" w:type="dxa"/>
+              <w:start w:w="100" w:type="dxa"/>
+              <w:bottom w:w="90" w:type="dxa"/>
+              <w:end w:w="100" w:type="dxa"/>
+            </w:tcMar>
+          </w:tcPr>
+          <w:p>
+            <w:pPr>
+              <w:spacing w:after="0"/>
+            </w:pPr>
+            <w:r>
+              <w:rPr>
+                <w:rFonts w:ascii="Heiti SC" w:hAnsi="Heiti SC" w:eastAsia="Heiti SC" w:cs="Heiti SC" w:hint="eastAsia"/>
+                <w:sz w:val="18"/>
+              </w:rPr>
+              <w:t>awiki.ai 能成为数据服务网络底座</w:t>
+            </w:r>
+          </w:p>
+        </w:tc>
+        <w:tc>
+          <w:tcPr>
+            <w:tcW w:type="dxa" w:w="4997"/>
+            <w:vAlign w:val="center"/>
+            <w:tcMar>
+              <w:top w:w="90" w:type="dxa"/>
+              <w:start w:w="100" w:type="dxa"/>
+              <w:bottom w:w="90" w:type="dxa"/>
+              <w:end w:w="100" w:type="dxa"/>
+            </w:tcMar>
+          </w:tcPr>
+          <w:p>
+            <w:pPr>
+              <w:spacing w:after="0"/>
+            </w:pPr>
+            <w:r>
+              <w:rPr>
+                <w:rFonts w:ascii="Heiti SC" w:hAnsi="Heiti SC" w:eastAsia="Heiti SC" w:cs="Heiti SC" w:hint="eastAsia"/>
+                <w:sz w:val="18"/>
+              </w:rPr>
+              <w:t>买方 Agent、服务方 Agent、Provider 内部数字员工通过 Agent 网络协作和异步通知</w:t>
             </w:r>
           </w:p>
         </w:tc>
@@ -5185,7 +5346,2817 @@
         <w:rPr>
           <w:rFonts w:ascii="Heiti SC" w:hAnsi="Heiti SC" w:eastAsia="Heiti SC" w:cs="Heiti SC" w:hint="eastAsia"/>
         </w:rPr>
-        <w:t>5. 场景设计</w:t>
+        <w:t>5. awiki.ai 在本方案中的位置</w:t>
+      </w:r>
+    </w:p>
+    <w:p>
+      <w:r>
+        <w:rPr>
+          <w:rFonts w:ascii="Heiti SC" w:hAnsi="Heiti SC" w:eastAsia="Heiti SC" w:cs="Heiti SC" w:hint="eastAsia"/>
+          <w:b w:val="0"/>
+        </w:rPr>
+        <w:t>如果说动态本体 OSDK 解决的是“数据能力如何被安全调用”，那么 awiki.ai 解决的是“Agent 如何成为可信数据服务网络里的协作主体”。</w:t>
+      </w:r>
+    </w:p>
+    <w:p>
+      <w:r>
+        <w:rPr>
+          <w:rFonts w:ascii="Heiti SC" w:hAnsi="Heiti SC" w:eastAsia="Heiti SC" w:cs="Heiti SC" w:hint="eastAsia"/>
+          <w:b w:val="0"/>
+        </w:rPr>
+        <w:t>两者结合后的定位是：</w:t>
+      </w:r>
+    </w:p>
+    <w:tbl>
+      <w:tblPr>
+        <w:tblW w:type="auto" w:w="0"/>
+        <w:jc w:val="left"/>
+        <w:tblLayout w:type="autofit"/>
+        <w:tblLook w:firstColumn="1" w:firstRow="1" w:lastColumn="0" w:lastRow="0" w:noHBand="0" w:noVBand="1" w:val="04A0"/>
+      </w:tblPr>
+      <w:tblGrid>
+        <w:gridCol w:w="9994"/>
+      </w:tblGrid>
+      <w:tr>
+        <w:tc>
+          <w:tcPr>
+            <w:tcW w:type="dxa" w:w="9994"/>
+            <w:shd w:fill="F6F8FA"/>
+            <w:tcMar>
+              <w:top w:w="110" w:type="dxa"/>
+              <w:start w:w="120" w:type="dxa"/>
+              <w:bottom w:w="110" w:type="dxa"/>
+              <w:end w:w="120" w:type="dxa"/>
+            </w:tcMar>
+          </w:tcPr>
+          <w:p>
+            <w:pPr>
+              <w:spacing w:after="0"/>
+            </w:pPr>
+            <w:r>
+              <w:rPr>
+                <w:rFonts w:ascii="Heiti SC" w:hAnsi="Heiti SC" w:eastAsia="Heiti SC" w:cs="Heiti SC" w:hint="eastAsia"/>
+                <w:color w:val="111827"/>
+                <w:sz w:val="16"/>
+              </w:rPr>
+              <w:t>awiki.ai 承载 Agent 身份、发现、消息、协作和异步通知；</w:t>
+              <w:br/>
+              <w:t>动态本体 OSDK 承载数据产品接口、授权调用和开发者体验；</w:t>
+              <w:br/>
+              <w:t>可信数据空间网关、Policy、Runtime 和 Receipt 承载强制执行和结果可信。</w:t>
+            </w:r>
+          </w:p>
+        </w:tc>
+      </w:tr>
+    </w:tbl>
+    <w:p/>
+    <w:p>
+      <w:r>
+        <w:rPr>
+          <w:rFonts w:ascii="Heiti SC" w:hAnsi="Heiti SC" w:eastAsia="Heiti SC" w:cs="Heiti SC" w:hint="eastAsia"/>
+          <w:b w:val="0"/>
+        </w:rPr>
+        <w:t>这使 Demo 从“可信数据产品执行 Demo”升级为：</w:t>
+      </w:r>
+    </w:p>
+    <w:tbl>
+      <w:tblPr>
+        <w:tblW w:type="auto" w:w="0"/>
+        <w:jc w:val="left"/>
+        <w:tblLayout w:type="autofit"/>
+        <w:tblLook w:firstColumn="1" w:firstRow="1" w:lastColumn="0" w:lastRow="0" w:noHBand="0" w:noVBand="1" w:val="04A0"/>
+      </w:tblPr>
+      <w:tblGrid>
+        <w:gridCol w:w="9994"/>
+      </w:tblGrid>
+      <w:tr>
+        <w:tc>
+          <w:tcPr>
+            <w:tcW w:type="dxa" w:w="9994"/>
+            <w:shd w:fill="F6F8FA"/>
+            <w:tcMar>
+              <w:top w:w="110" w:type="dxa"/>
+              <w:start w:w="120" w:type="dxa"/>
+              <w:bottom w:w="110" w:type="dxa"/>
+              <w:end w:w="120" w:type="dxa"/>
+            </w:tcMar>
+          </w:tcPr>
+          <w:p>
+            <w:pPr>
+              <w:spacing w:after="0"/>
+            </w:pPr>
+            <w:r>
+              <w:rPr>
+                <w:rFonts w:ascii="Heiti SC" w:hAnsi="Heiti SC" w:eastAsia="Heiti SC" w:cs="Heiti SC" w:hint="eastAsia"/>
+                <w:color w:val="111827"/>
+                <w:sz w:val="16"/>
+              </w:rPr>
+              <w:t>面向 Agent 时代的可信数据空间网络 Demo。</w:t>
+            </w:r>
+          </w:p>
+        </w:tc>
+      </w:tr>
+    </w:tbl>
+    <w:p/>
+    <w:p>
+      <w:pPr>
+        <w:pStyle w:val="Heading3"/>
+      </w:pPr>
+      <w:r>
+        <w:rPr>
+          <w:rFonts w:ascii="Heiti SC" w:hAnsi="Heiti SC" w:eastAsia="Heiti SC" w:cs="Heiti SC" w:hint="eastAsia"/>
+        </w:rPr>
+        <w:t>5.1 awiki.ai 适合补哪一层</w:t>
+      </w:r>
+    </w:p>
+    <w:p>
+      <w:r>
+        <w:rPr>
+          <w:rFonts w:ascii="Heiti SC" w:hAnsi="Heiti SC" w:eastAsia="Heiti SC" w:cs="Heiti SC" w:hint="eastAsia"/>
+          <w:b w:val="0"/>
+        </w:rPr>
+        <w:t>在整体架构中，awiki.ai 应该成为 Agent 可信网络层，位于“业务用户/Agent”和“Product OSDK/可信数据空间网关”之间。</w:t>
+      </w:r>
+    </w:p>
+    <w:p>
+      <w:pPr>
+        <w:spacing w:after="40"/>
+      </w:pPr>
+      <w:r>
+        <w:rPr>
+          <w:rFonts w:ascii="Heiti SC" w:hAnsi="Heiti SC" w:eastAsia="Heiti SC" w:cs="Heiti SC" w:hint="eastAsia"/>
+          <w:b/>
+          <w:color w:val="475569"/>
+          <w:sz w:val="18"/>
+        </w:rPr>
+        <w:t>Mermaid 源图（Markdown 中可直接渲染）</w:t>
+      </w:r>
+    </w:p>
+    <w:tbl>
+      <w:tblPr>
+        <w:tblW w:type="auto" w:w="0"/>
+        <w:jc w:val="left"/>
+        <w:tblLayout w:type="autofit"/>
+        <w:tblLook w:firstColumn="1" w:firstRow="1" w:lastColumn="0" w:lastRow="0" w:noHBand="0" w:noVBand="1" w:val="04A0"/>
+      </w:tblPr>
+      <w:tblGrid>
+        <w:gridCol w:w="9994"/>
+      </w:tblGrid>
+      <w:tr>
+        <w:tc>
+          <w:tcPr>
+            <w:tcW w:type="dxa" w:w="9994"/>
+            <w:shd w:fill="F6F8FA"/>
+            <w:tcMar>
+              <w:top w:w="110" w:type="dxa"/>
+              <w:start w:w="120" w:type="dxa"/>
+              <w:bottom w:w="110" w:type="dxa"/>
+              <w:end w:w="120" w:type="dxa"/>
+            </w:tcMar>
+          </w:tcPr>
+          <w:p>
+            <w:pPr>
+              <w:spacing w:after="0"/>
+            </w:pPr>
+            <w:r>
+              <w:rPr>
+                <w:rFonts w:ascii="Heiti SC" w:hAnsi="Heiti SC" w:eastAsia="Heiti SC" w:cs="Heiti SC" w:hint="eastAsia"/>
+                <w:color w:val="111827"/>
+                <w:sz w:val="16"/>
+              </w:rPr>
+              <w:t>flowchart LR</w:t>
+              <w:br/>
+              <w:t xml:space="preserve">    Buyer["买方 Agent&lt;br/&gt;银行、施工方、企业客户"] --&gt; AWiki["awiki.ai Agent 网络&lt;br/&gt;身份、发现、消息、异步通知"]</w:t>
+              <w:br/>
+              <w:t xml:space="preserve">    ProviderFront["服务方前台 Agent&lt;br/&gt;咨询、报价、授权协同"] --&gt; AWiki</w:t>
+              <w:br/>
+              <w:t xml:space="preserve">    ProviderOffice["数据服务数字员工部&lt;br/&gt;建模、质检、编译、交付"] --&gt; AWiki</w:t>
+              <w:br/>
+              <w:t xml:space="preserve">    AWiki --&gt; OSDK["Product OSDK / MCP Tool"]</w:t>
+              <w:br/>
+              <w:t xml:space="preserve">    OSDK --&gt; Gateway["可信数据空间网关"]</w:t>
+              <w:br/>
+              <w:t xml:space="preserve">    Gateway --&gt; Policy["Policy / Entitlement"]</w:t>
+              <w:br/>
+              <w:t xml:space="preserve">    Gateway --&gt; Runtime["Provider Runtime"]</w:t>
+              <w:br/>
+              <w:t xml:space="preserve">    Runtime --&gt; Data["数据域资产"]</w:t>
+              <w:br/>
+              <w:t xml:space="preserve">    Runtime --&gt; Receipt["Execution Receipt"]</w:t>
+              <w:br/>
+              <w:t xml:space="preserve">    Receipt --&gt; AWiki</w:t>
+            </w:r>
+          </w:p>
+        </w:tc>
+      </w:tr>
+    </w:tbl>
+    <w:p/>
+    <w:p>
+      <w:r>
+        <w:rPr>
+          <w:rFonts w:ascii="Heiti SC" w:hAnsi="Heiti SC" w:eastAsia="Heiti SC" w:cs="Heiti SC" w:hint="eastAsia"/>
+          <w:b w:val="0"/>
+        </w:rPr>
+        <w:t>这一层的关键价值是：</w:t>
+      </w:r>
+    </w:p>
+    <w:tbl>
+      <w:tblPr>
+        <w:tblStyle w:val="TableGrid"/>
+        <w:tblW w:type="auto" w:w="0"/>
+        <w:jc w:val="center"/>
+        <w:tblLayout w:type="autofit"/>
+        <w:tblLook w:firstColumn="1" w:firstRow="1" w:lastColumn="0" w:lastRow="0" w:noHBand="0" w:noVBand="1" w:val="04A0"/>
+      </w:tblPr>
+      <w:tblGrid>
+        <w:gridCol w:w="4997"/>
+        <w:gridCol w:w="4997"/>
+      </w:tblGrid>
+      <w:tr>
+        <w:tc>
+          <w:tcPr>
+            <w:tcW w:type="dxa" w:w="4997"/>
+            <w:vAlign w:val="center"/>
+            <w:tcMar>
+              <w:top w:w="90" w:type="dxa"/>
+              <w:start w:w="100" w:type="dxa"/>
+              <w:bottom w:w="90" w:type="dxa"/>
+              <w:end w:w="100" w:type="dxa"/>
+            </w:tcMar>
+            <w:shd w:fill="EAF2FF"/>
+          </w:tcPr>
+          <w:p>
+            <w:pPr>
+              <w:spacing w:after="0"/>
+            </w:pPr>
+            <w:r>
+              <w:rPr>
+                <w:rFonts w:ascii="Heiti SC" w:hAnsi="Heiti SC" w:eastAsia="Heiti SC" w:cs="Heiti SC" w:hint="eastAsia"/>
+                <w:b/>
+                <w:color w:val="1E40AF"/>
+                <w:sz w:val="18"/>
+              </w:rPr>
+              <w:t>awiki.ai 能力</w:t>
+            </w:r>
+          </w:p>
+        </w:tc>
+        <w:tc>
+          <w:tcPr>
+            <w:tcW w:type="dxa" w:w="4997"/>
+            <w:vAlign w:val="center"/>
+            <w:tcMar>
+              <w:top w:w="90" w:type="dxa"/>
+              <w:start w:w="100" w:type="dxa"/>
+              <w:bottom w:w="90" w:type="dxa"/>
+              <w:end w:w="100" w:type="dxa"/>
+            </w:tcMar>
+            <w:shd w:fill="EAF2FF"/>
+          </w:tcPr>
+          <w:p>
+            <w:pPr>
+              <w:spacing w:after="0"/>
+            </w:pPr>
+            <w:r>
+              <w:rPr>
+                <w:rFonts w:ascii="Heiti SC" w:hAnsi="Heiti SC" w:eastAsia="Heiti SC" w:cs="Heiti SC" w:hint="eastAsia"/>
+                <w:b/>
+                <w:color w:val="1E40AF"/>
+                <w:sz w:val="18"/>
+              </w:rPr>
+              <w:t>在数据服务网络中的作用</w:t>
+            </w:r>
+          </w:p>
+        </w:tc>
+      </w:tr>
+      <w:tr>
+        <w:tc>
+          <w:tcPr>
+            <w:tcW w:type="dxa" w:w="4997"/>
+            <w:vAlign w:val="center"/>
+            <w:tcMar>
+              <w:top w:w="90" w:type="dxa"/>
+              <w:start w:w="100" w:type="dxa"/>
+              <w:bottom w:w="90" w:type="dxa"/>
+              <w:end w:w="100" w:type="dxa"/>
+            </w:tcMar>
+          </w:tcPr>
+          <w:p>
+            <w:pPr>
+              <w:spacing w:after="0"/>
+            </w:pPr>
+            <w:r>
+              <w:rPr>
+                <w:rFonts w:ascii="Heiti SC" w:hAnsi="Heiti SC" w:eastAsia="Heiti SC" w:cs="Heiti SC" w:hint="eastAsia"/>
+                <w:sz w:val="18"/>
+              </w:rPr>
+              <w:t>Agent 身份</w:t>
+            </w:r>
+          </w:p>
+        </w:tc>
+        <w:tc>
+          <w:tcPr>
+            <w:tcW w:type="dxa" w:w="4997"/>
+            <w:vAlign w:val="center"/>
+            <w:tcMar>
+              <w:top w:w="90" w:type="dxa"/>
+              <w:start w:w="100" w:type="dxa"/>
+              <w:bottom w:w="90" w:type="dxa"/>
+              <w:end w:w="100" w:type="dxa"/>
+            </w:tcMar>
+          </w:tcPr>
+          <w:p>
+            <w:pPr>
+              <w:spacing w:after="0"/>
+            </w:pPr>
+            <w:r>
+              <w:rPr>
+                <w:rFonts w:ascii="Heiti SC" w:hAnsi="Heiti SC" w:eastAsia="Heiti SC" w:cs="Heiti SC" w:hint="eastAsia"/>
+                <w:sz w:val="18"/>
+              </w:rPr>
+              <w:t>让买方、服务方、Provider 内部 Agent 都成为可识别、可授权、可追踪的主体</w:t>
+            </w:r>
+          </w:p>
+        </w:tc>
+      </w:tr>
+      <w:tr>
+        <w:tc>
+          <w:tcPr>
+            <w:tcW w:type="dxa" w:w="4997"/>
+            <w:vAlign w:val="center"/>
+            <w:tcMar>
+              <w:top w:w="90" w:type="dxa"/>
+              <w:start w:w="100" w:type="dxa"/>
+              <w:bottom w:w="90" w:type="dxa"/>
+              <w:end w:w="100" w:type="dxa"/>
+            </w:tcMar>
+          </w:tcPr>
+          <w:p>
+            <w:pPr>
+              <w:spacing w:after="0"/>
+            </w:pPr>
+            <w:r>
+              <w:rPr>
+                <w:rFonts w:ascii="Heiti SC" w:hAnsi="Heiti SC" w:eastAsia="Heiti SC" w:cs="Heiti SC" w:hint="eastAsia"/>
+                <w:sz w:val="18"/>
+              </w:rPr>
+              <w:t>Agent 发现</w:t>
+            </w:r>
+          </w:p>
+        </w:tc>
+        <w:tc>
+          <w:tcPr>
+            <w:tcW w:type="dxa" w:w="4997"/>
+            <w:vAlign w:val="center"/>
+            <w:tcMar>
+              <w:top w:w="90" w:type="dxa"/>
+              <w:start w:w="100" w:type="dxa"/>
+              <w:bottom w:w="90" w:type="dxa"/>
+              <w:end w:w="100" w:type="dxa"/>
+            </w:tcMar>
+          </w:tcPr>
+          <w:p>
+            <w:pPr>
+              <w:spacing w:after="0"/>
+            </w:pPr>
+            <w:r>
+              <w:rPr>
+                <w:rFonts w:ascii="Heiti SC" w:hAnsi="Heiti SC" w:eastAsia="Heiti SC" w:cs="Heiti SC" w:hint="eastAsia"/>
+                <w:sz w:val="18"/>
+              </w:rPr>
+              <w:t>买方 Agent 可以发现有哪些可信数据服务，而不是人工翻 API 文档</w:t>
+            </w:r>
+          </w:p>
+        </w:tc>
+      </w:tr>
+      <w:tr>
+        <w:tc>
+          <w:tcPr>
+            <w:tcW w:type="dxa" w:w="4997"/>
+            <w:vAlign w:val="center"/>
+            <w:tcMar>
+              <w:top w:w="90" w:type="dxa"/>
+              <w:start w:w="100" w:type="dxa"/>
+              <w:bottom w:w="90" w:type="dxa"/>
+              <w:end w:w="100" w:type="dxa"/>
+            </w:tcMar>
+          </w:tcPr>
+          <w:p>
+            <w:pPr>
+              <w:spacing w:after="0"/>
+            </w:pPr>
+            <w:r>
+              <w:rPr>
+                <w:rFonts w:ascii="Heiti SC" w:hAnsi="Heiti SC" w:eastAsia="Heiti SC" w:cs="Heiti SC" w:hint="eastAsia"/>
+                <w:sz w:val="18"/>
+              </w:rPr>
+              <w:t>Agent 消息</w:t>
+            </w:r>
+          </w:p>
+        </w:tc>
+        <w:tc>
+          <w:tcPr>
+            <w:tcW w:type="dxa" w:w="4997"/>
+            <w:vAlign w:val="center"/>
+            <w:tcMar>
+              <w:top w:w="90" w:type="dxa"/>
+              <w:start w:w="100" w:type="dxa"/>
+              <w:bottom w:w="90" w:type="dxa"/>
+              <w:end w:w="100" w:type="dxa"/>
+            </w:tcMar>
+          </w:tcPr>
+          <w:p>
+            <w:pPr>
+              <w:spacing w:after="0"/>
+            </w:pPr>
+            <w:r>
+              <w:rPr>
+                <w:rFonts w:ascii="Heiti SC" w:hAnsi="Heiti SC" w:eastAsia="Heiti SC" w:cs="Heiti SC" w:hint="eastAsia"/>
+                <w:sz w:val="18"/>
+              </w:rPr>
+              <w:t>授权申请、用途说明、审批补充、交付通知可以变成跨组织会话</w:t>
+            </w:r>
+          </w:p>
+        </w:tc>
+      </w:tr>
+      <w:tr>
+        <w:tc>
+          <w:tcPr>
+            <w:tcW w:type="dxa" w:w="4997"/>
+            <w:vAlign w:val="center"/>
+            <w:tcMar>
+              <w:top w:w="90" w:type="dxa"/>
+              <w:start w:w="100" w:type="dxa"/>
+              <w:bottom w:w="90" w:type="dxa"/>
+              <w:end w:w="100" w:type="dxa"/>
+            </w:tcMar>
+          </w:tcPr>
+          <w:p>
+            <w:pPr>
+              <w:spacing w:after="0"/>
+            </w:pPr>
+            <w:r>
+              <w:rPr>
+                <w:rFonts w:ascii="Heiti SC" w:hAnsi="Heiti SC" w:eastAsia="Heiti SC" w:cs="Heiti SC" w:hint="eastAsia"/>
+                <w:sz w:val="18"/>
+              </w:rPr>
+              <w:t>异步通知</w:t>
+            </w:r>
+          </w:p>
+        </w:tc>
+        <w:tc>
+          <w:tcPr>
+            <w:tcW w:type="dxa" w:w="4997"/>
+            <w:vAlign w:val="center"/>
+            <w:tcMar>
+              <w:top w:w="90" w:type="dxa"/>
+              <w:start w:w="100" w:type="dxa"/>
+              <w:bottom w:w="90" w:type="dxa"/>
+              <w:end w:w="100" w:type="dxa"/>
+            </w:tcMar>
+          </w:tcPr>
+          <w:p>
+            <w:pPr>
+              <w:spacing w:after="0"/>
+            </w:pPr>
+            <w:r>
+              <w:rPr>
+                <w:rFonts w:ascii="Heiti SC" w:hAnsi="Heiti SC" w:eastAsia="Heiti SC" w:cs="Heiti SC" w:hint="eastAsia"/>
+                <w:sz w:val="18"/>
+              </w:rPr>
+              <w:t>数据服务天然可能需要审批、质检、计算和复核，不能只依赖同步 API</w:t>
+            </w:r>
+          </w:p>
+        </w:tc>
+      </w:tr>
+      <w:tr>
+        <w:tc>
+          <w:tcPr>
+            <w:tcW w:type="dxa" w:w="4997"/>
+            <w:vAlign w:val="center"/>
+            <w:tcMar>
+              <w:top w:w="90" w:type="dxa"/>
+              <w:start w:w="100" w:type="dxa"/>
+              <w:bottom w:w="90" w:type="dxa"/>
+              <w:end w:w="100" w:type="dxa"/>
+            </w:tcMar>
+          </w:tcPr>
+          <w:p>
+            <w:pPr>
+              <w:spacing w:after="0"/>
+            </w:pPr>
+            <w:r>
+              <w:rPr>
+                <w:rFonts w:ascii="Heiti SC" w:hAnsi="Heiti SC" w:eastAsia="Heiti SC" w:cs="Heiti SC" w:hint="eastAsia"/>
+                <w:sz w:val="18"/>
+              </w:rPr>
+              <w:t>人-Agent 协同</w:t>
+            </w:r>
+          </w:p>
+        </w:tc>
+        <w:tc>
+          <w:tcPr>
+            <w:tcW w:type="dxa" w:w="4997"/>
+            <w:vAlign w:val="center"/>
+            <w:tcMar>
+              <w:top w:w="90" w:type="dxa"/>
+              <w:start w:w="100" w:type="dxa"/>
+              <w:bottom w:w="90" w:type="dxa"/>
+              <w:end w:w="100" w:type="dxa"/>
+            </w:tcMar>
+          </w:tcPr>
+          <w:p>
+            <w:pPr>
+              <w:spacing w:after="0"/>
+            </w:pPr>
+            <w:r>
+              <w:rPr>
+                <w:rFonts w:ascii="Heiti SC" w:hAnsi="Heiti SC" w:eastAsia="Heiti SC" w:cs="Heiti SC" w:hint="eastAsia"/>
+                <w:sz w:val="18"/>
+              </w:rPr>
+              <w:t>高风险授权、特殊用途合同、争议处理仍可让人类审批介入</w:t>
+            </w:r>
+          </w:p>
+        </w:tc>
+      </w:tr>
+    </w:tbl>
+    <w:p/>
+    <w:p>
+      <w:pPr>
+        <w:pStyle w:val="Heading3"/>
+      </w:pPr>
+      <w:r>
+        <w:rPr>
+          <w:rFonts w:ascii="Heiti SC" w:hAnsi="Heiti SC" w:eastAsia="Heiti SC" w:cs="Heiti SC" w:hint="eastAsia"/>
+        </w:rPr>
+        <w:t>5.2 买方侧 Agent 与服务侧 Agent 如何配合</w:t>
+      </w:r>
+    </w:p>
+    <w:p>
+      <w:r>
+        <w:rPr>
+          <w:rFonts w:ascii="Heiti SC" w:hAnsi="Heiti SC" w:eastAsia="Heiti SC" w:cs="Heiti SC" w:hint="eastAsia"/>
+          <w:b w:val="0"/>
+        </w:rPr>
+        <w:t>买方侧 Agent 代表数据服务需求方，例如银行、施工单位、保险公司或企业客户。它负责把业务目标转成数据服务任务：</w:t>
+      </w:r>
+    </w:p>
+    <w:p>
+      <w:pPr>
+        <w:pStyle w:val="ListBullet"/>
+      </w:pPr>
+      <w:r>
+        <w:rPr>
+          <w:rFonts w:ascii="Heiti SC" w:hAnsi="Heiti SC" w:eastAsia="Heiti SC" w:cs="Heiti SC" w:hint="eastAsia"/>
+          <w:b w:val="0"/>
+        </w:rPr>
+        <w:t>描述需求和用途。</w:t>
+      </w:r>
+    </w:p>
+    <w:p>
+      <w:pPr>
+        <w:pStyle w:val="ListBullet"/>
+      </w:pPr>
+      <w:r>
+        <w:rPr>
+          <w:rFonts w:ascii="Heiti SC" w:hAnsi="Heiti SC" w:eastAsia="Heiti SC" w:cs="Heiti SC" w:hint="eastAsia"/>
+          <w:b w:val="0"/>
+        </w:rPr>
+        <w:t>发现可用数据产品。</w:t>
+      </w:r>
+    </w:p>
+    <w:p>
+      <w:pPr>
+        <w:pStyle w:val="ListBullet"/>
+      </w:pPr>
+      <w:r>
+        <w:rPr>
+          <w:rFonts w:ascii="Heiti SC" w:hAnsi="Heiti SC" w:eastAsia="Heiti SC" w:cs="Heiti SC" w:hint="eastAsia"/>
+          <w:b w:val="0"/>
+        </w:rPr>
+        <w:t>比较产品说明、质量口径、价格和授权要求。</w:t>
+      </w:r>
+    </w:p>
+    <w:p>
+      <w:pPr>
+        <w:pStyle w:val="ListBullet"/>
+      </w:pPr>
+      <w:r>
+        <w:rPr>
+          <w:rFonts w:ascii="Heiti SC" w:hAnsi="Heiti SC" w:eastAsia="Heiti SC" w:cs="Heiti SC" w:hint="eastAsia"/>
+          <w:b w:val="0"/>
+        </w:rPr>
+        <w:t>申请 entitlement。</w:t>
+      </w:r>
+    </w:p>
+    <w:p>
+      <w:pPr>
+        <w:pStyle w:val="ListBullet"/>
+      </w:pPr>
+      <w:r>
+        <w:rPr>
+          <w:rFonts w:ascii="Heiti SC" w:hAnsi="Heiti SC" w:eastAsia="Heiti SC" w:cs="Heiti SC" w:hint="eastAsia"/>
+          <w:b w:val="0"/>
+        </w:rPr>
+        <w:t>调用 OSDK/MCP。</w:t>
+      </w:r>
+    </w:p>
+    <w:p>
+      <w:pPr>
+        <w:pStyle w:val="ListBullet"/>
+      </w:pPr>
+      <w:r>
+        <w:rPr>
+          <w:rFonts w:ascii="Heiti SC" w:hAnsi="Heiti SC" w:eastAsia="Heiti SC" w:cs="Heiti SC" w:hint="eastAsia"/>
+          <w:b w:val="0"/>
+        </w:rPr>
+        <w:t>接收结果和 Receipt。</w:t>
+      </w:r>
+    </w:p>
+    <w:p>
+      <w:pPr>
+        <w:pStyle w:val="ListBullet"/>
+      </w:pPr>
+      <w:r>
+        <w:rPr>
+          <w:rFonts w:ascii="Heiti SC" w:hAnsi="Heiti SC" w:eastAsia="Heiti SC" w:cs="Heiti SC" w:hint="eastAsia"/>
+          <w:b w:val="0"/>
+        </w:rPr>
+        <w:t>请求 Verifier Agent 复核凭证。</w:t>
+      </w:r>
+    </w:p>
+    <w:p>
+      <w:r>
+        <w:rPr>
+          <w:rFonts w:ascii="Heiti SC" w:hAnsi="Heiti SC" w:eastAsia="Heiti SC" w:cs="Heiti SC" w:hint="eastAsia"/>
+          <w:b w:val="0"/>
+        </w:rPr>
+        <w:t>服务侧 Agent 代表数据服务提供方的前台能力。它负责接待、解释、协调和交付：</w:t>
+      </w:r>
+    </w:p>
+    <w:p>
+      <w:pPr>
+        <w:pStyle w:val="ListBullet"/>
+      </w:pPr>
+      <w:r>
+        <w:rPr>
+          <w:rFonts w:ascii="Heiti SC" w:hAnsi="Heiti SC" w:eastAsia="Heiti SC" w:cs="Heiti SC" w:hint="eastAsia"/>
+          <w:b w:val="0"/>
+        </w:rPr>
+        <w:t>回答数据产品能解决什么问题。</w:t>
+      </w:r>
+    </w:p>
+    <w:p>
+      <w:pPr>
+        <w:pStyle w:val="ListBullet"/>
+      </w:pPr>
+      <w:r>
+        <w:rPr>
+          <w:rFonts w:ascii="Heiti SC" w:hAnsi="Heiti SC" w:eastAsia="Heiti SC" w:cs="Heiti SC" w:hint="eastAsia"/>
+          <w:b w:val="0"/>
+        </w:rPr>
+        <w:t>判断是否需要人工审批。</w:t>
+      </w:r>
+    </w:p>
+    <w:p>
+      <w:pPr>
+        <w:pStyle w:val="ListBullet"/>
+      </w:pPr>
+      <w:r>
+        <w:rPr>
+          <w:rFonts w:ascii="Heiti SC" w:hAnsi="Heiti SC" w:eastAsia="Heiti SC" w:cs="Heiti SC" w:hint="eastAsia"/>
+          <w:b w:val="0"/>
+        </w:rPr>
+        <w:t>协调 Policy Agent 签发 entitlement。</w:t>
+      </w:r>
+    </w:p>
+    <w:p>
+      <w:pPr>
+        <w:pStyle w:val="ListBullet"/>
+      </w:pPr>
+      <w:r>
+        <w:rPr>
+          <w:rFonts w:ascii="Heiti SC" w:hAnsi="Heiti SC" w:eastAsia="Heiti SC" w:cs="Heiti SC" w:hint="eastAsia"/>
+          <w:b w:val="0"/>
+        </w:rPr>
+        <w:t>调度内部数据服务数字员工。</w:t>
+      </w:r>
+    </w:p>
+    <w:p>
+      <w:pPr>
+        <w:pStyle w:val="ListBullet"/>
+      </w:pPr>
+      <w:r>
+        <w:rPr>
+          <w:rFonts w:ascii="Heiti SC" w:hAnsi="Heiti SC" w:eastAsia="Heiti SC" w:cs="Heiti SC" w:hint="eastAsia"/>
+          <w:b w:val="0"/>
+        </w:rPr>
+        <w:t>触发 Runtime 执行。</w:t>
+      </w:r>
+    </w:p>
+    <w:p>
+      <w:pPr>
+        <w:pStyle w:val="ListBullet"/>
+      </w:pPr>
+      <w:r>
+        <w:rPr>
+          <w:rFonts w:ascii="Heiti SC" w:hAnsi="Heiti SC" w:eastAsia="Heiti SC" w:cs="Heiti SC" w:hint="eastAsia"/>
+          <w:b w:val="0"/>
+        </w:rPr>
+        <w:t>异步通知进度。</w:t>
+      </w:r>
+    </w:p>
+    <w:p>
+      <w:pPr>
+        <w:pStyle w:val="ListBullet"/>
+      </w:pPr>
+      <w:r>
+        <w:rPr>
+          <w:rFonts w:ascii="Heiti SC" w:hAnsi="Heiti SC" w:eastAsia="Heiti SC" w:cs="Heiti SC" w:hint="eastAsia"/>
+          <w:b w:val="0"/>
+        </w:rPr>
+        <w:t>交付结果、Receipt 和验证说明。</w:t>
+      </w:r>
+    </w:p>
+    <w:p>
+      <w:r>
+        <w:rPr>
+          <w:rFonts w:ascii="Heiti SC" w:hAnsi="Heiti SC" w:eastAsia="Heiti SC" w:cs="Heiti SC" w:hint="eastAsia"/>
+          <w:b w:val="0"/>
+        </w:rPr>
+        <w:t>这就把传统“买数据”的过程变成了 Agent 之间的可信服务协作：</w:t>
+      </w:r>
+    </w:p>
+    <w:tbl>
+      <w:tblPr>
+        <w:tblW w:type="auto" w:w="0"/>
+        <w:jc w:val="left"/>
+        <w:tblLayout w:type="autofit"/>
+        <w:tblLook w:firstColumn="1" w:firstRow="1" w:lastColumn="0" w:lastRow="0" w:noHBand="0" w:noVBand="1" w:val="04A0"/>
+      </w:tblPr>
+      <w:tblGrid>
+        <w:gridCol w:w="9994"/>
+      </w:tblGrid>
+      <w:tr>
+        <w:tc>
+          <w:tcPr>
+            <w:tcW w:type="dxa" w:w="9994"/>
+            <w:shd w:fill="F6F8FA"/>
+            <w:tcMar>
+              <w:top w:w="110" w:type="dxa"/>
+              <w:start w:w="120" w:type="dxa"/>
+              <w:bottom w:w="110" w:type="dxa"/>
+              <w:end w:w="120" w:type="dxa"/>
+            </w:tcMar>
+          </w:tcPr>
+          <w:p>
+            <w:pPr>
+              <w:spacing w:after="0"/>
+            </w:pPr>
+            <w:r>
+              <w:rPr>
+                <w:rFonts w:ascii="Heiti SC" w:hAnsi="Heiti SC" w:eastAsia="Heiti SC" w:cs="Heiti SC" w:hint="eastAsia"/>
+                <w:color w:val="111827"/>
+                <w:sz w:val="16"/>
+              </w:rPr>
+              <w:t>买方 Agent 提出任务；</w:t>
+              <w:br/>
+              <w:t>服务方 Agent 解释产品、申请授权、协调执行；</w:t>
+              <w:br/>
+              <w:t>Provider 内部数字员工完成生产、治理、质检和交付；</w:t>
+              <w:br/>
+              <w:t>Runtime 在数据域内计算；</w:t>
+              <w:br/>
+              <w:t>Receipt 通过 awiki.ai 网络回传和验证。</w:t>
+            </w:r>
+          </w:p>
+        </w:tc>
+      </w:tr>
+    </w:tbl>
+    <w:p/>
+    <w:p>
+      <w:pPr>
+        <w:pStyle w:val="Heading3"/>
+      </w:pPr>
+      <w:r>
+        <w:rPr>
+          <w:rFonts w:ascii="Heiti SC" w:hAnsi="Heiti SC" w:eastAsia="Heiti SC" w:cs="Heiti SC" w:hint="eastAsia"/>
+        </w:rPr>
+        <w:t>5.3 数据交易服务的数字员工部门</w:t>
+      </w:r>
+    </w:p>
+    <w:p>
+      <w:r>
+        <w:rPr>
+          <w:rFonts w:ascii="Heiti SC" w:hAnsi="Heiti SC" w:eastAsia="Heiti SC" w:cs="Heiti SC" w:hint="eastAsia"/>
+          <w:b w:val="0"/>
+        </w:rPr>
+        <w:t>很多数据提供方并不缺数据，真正缺的是持续运营数据服务的人：数据产品经理、数据治理人员、合规审批、质量检查、交付运维和客户成功。awiki.ai 可以把这些角色组织成一个“数据交易服务数字员工部门”。</w:t>
+      </w:r>
+    </w:p>
+    <w:tbl>
+      <w:tblPr>
+        <w:tblStyle w:val="TableGrid"/>
+        <w:tblW w:type="auto" w:w="0"/>
+        <w:jc w:val="center"/>
+        <w:tblLayout w:type="autofit"/>
+        <w:tblLook w:firstColumn="1" w:firstRow="1" w:lastColumn="0" w:lastRow="0" w:noHBand="0" w:noVBand="1" w:val="04A0"/>
+      </w:tblPr>
+      <w:tblGrid>
+        <w:gridCol w:w="3331"/>
+        <w:gridCol w:w="3331"/>
+        <w:gridCol w:w="3331"/>
+      </w:tblGrid>
+      <w:tr>
+        <w:tc>
+          <w:tcPr>
+            <w:tcW w:type="dxa" w:w="3331"/>
+            <w:vAlign w:val="center"/>
+            <w:tcMar>
+              <w:top w:w="90" w:type="dxa"/>
+              <w:start w:w="100" w:type="dxa"/>
+              <w:bottom w:w="90" w:type="dxa"/>
+              <w:end w:w="100" w:type="dxa"/>
+            </w:tcMar>
+            <w:shd w:fill="EAF2FF"/>
+          </w:tcPr>
+          <w:p>
+            <w:pPr>
+              <w:spacing w:after="0"/>
+            </w:pPr>
+            <w:r>
+              <w:rPr>
+                <w:rFonts w:ascii="Heiti SC" w:hAnsi="Heiti SC" w:eastAsia="Heiti SC" w:cs="Heiti SC" w:hint="eastAsia"/>
+                <w:b/>
+                <w:color w:val="1E40AF"/>
+                <w:sz w:val="18"/>
+              </w:rPr>
+              <w:t>数字员工</w:t>
+            </w:r>
+          </w:p>
+        </w:tc>
+        <w:tc>
+          <w:tcPr>
+            <w:tcW w:type="dxa" w:w="3331"/>
+            <w:vAlign w:val="center"/>
+            <w:tcMar>
+              <w:top w:w="90" w:type="dxa"/>
+              <w:start w:w="100" w:type="dxa"/>
+              <w:bottom w:w="90" w:type="dxa"/>
+              <w:end w:w="100" w:type="dxa"/>
+            </w:tcMar>
+            <w:shd w:fill="EAF2FF"/>
+          </w:tcPr>
+          <w:p>
+            <w:pPr>
+              <w:spacing w:after="0"/>
+            </w:pPr>
+            <w:r>
+              <w:rPr>
+                <w:rFonts w:ascii="Heiti SC" w:hAnsi="Heiti SC" w:eastAsia="Heiti SC" w:cs="Heiti SC" w:hint="eastAsia"/>
+                <w:b/>
+                <w:color w:val="1E40AF"/>
+                <w:sz w:val="18"/>
+              </w:rPr>
+              <w:t>负责什么</w:t>
+            </w:r>
+          </w:p>
+        </w:tc>
+        <w:tc>
+          <w:tcPr>
+            <w:tcW w:type="dxa" w:w="3331"/>
+            <w:vAlign w:val="center"/>
+            <w:tcMar>
+              <w:top w:w="90" w:type="dxa"/>
+              <w:start w:w="100" w:type="dxa"/>
+              <w:bottom w:w="90" w:type="dxa"/>
+              <w:end w:w="100" w:type="dxa"/>
+            </w:tcMar>
+            <w:shd w:fill="EAF2FF"/>
+          </w:tcPr>
+          <w:p>
+            <w:pPr>
+              <w:spacing w:after="0"/>
+            </w:pPr>
+            <w:r>
+              <w:rPr>
+                <w:rFonts w:ascii="Heiti SC" w:hAnsi="Heiti SC" w:eastAsia="Heiti SC" w:cs="Heiti SC" w:hint="eastAsia"/>
+                <w:b/>
+                <w:color w:val="1E40AF"/>
+                <w:sz w:val="18"/>
+              </w:rPr>
+              <w:t>降低哪类工作强度</w:t>
+            </w:r>
+          </w:p>
+        </w:tc>
+      </w:tr>
+      <w:tr>
+        <w:tc>
+          <w:tcPr>
+            <w:tcW w:type="dxa" w:w="3331"/>
+            <w:vAlign w:val="center"/>
+            <w:tcMar>
+              <w:top w:w="90" w:type="dxa"/>
+              <w:start w:w="100" w:type="dxa"/>
+              <w:bottom w:w="90" w:type="dxa"/>
+              <w:end w:w="100" w:type="dxa"/>
+            </w:tcMar>
+          </w:tcPr>
+          <w:p>
+            <w:pPr>
+              <w:spacing w:after="0"/>
+            </w:pPr>
+            <w:r>
+              <w:rPr>
+                <w:rFonts w:ascii="Heiti SC" w:hAnsi="Heiti SC" w:eastAsia="Heiti SC" w:cs="Heiti SC" w:hint="eastAsia"/>
+                <w:sz w:val="18"/>
+              </w:rPr>
+              <w:t>数据产品经理 Agent</w:t>
+            </w:r>
+          </w:p>
+        </w:tc>
+        <w:tc>
+          <w:tcPr>
+            <w:tcW w:type="dxa" w:w="3331"/>
+            <w:vAlign w:val="center"/>
+            <w:tcMar>
+              <w:top w:w="90" w:type="dxa"/>
+              <w:start w:w="100" w:type="dxa"/>
+              <w:bottom w:w="90" w:type="dxa"/>
+              <w:end w:w="100" w:type="dxa"/>
+            </w:tcMar>
+          </w:tcPr>
+          <w:p>
+            <w:pPr>
+              <w:spacing w:after="0"/>
+            </w:pPr>
+            <w:r>
+              <w:rPr>
+                <w:rFonts w:ascii="Heiti SC" w:hAnsi="Heiti SC" w:eastAsia="Heiti SC" w:cs="Heiti SC" w:hint="eastAsia"/>
+                <w:sz w:val="18"/>
+              </w:rPr>
+              <w:t>把内部数据能力包装成数据产品，生成产品说明和用途边界</w:t>
+            </w:r>
+          </w:p>
+        </w:tc>
+        <w:tc>
+          <w:tcPr>
+            <w:tcW w:type="dxa" w:w="3331"/>
+            <w:vAlign w:val="center"/>
+            <w:tcMar>
+              <w:top w:w="90" w:type="dxa"/>
+              <w:start w:w="100" w:type="dxa"/>
+              <w:bottom w:w="90" w:type="dxa"/>
+              <w:end w:w="100" w:type="dxa"/>
+            </w:tcMar>
+          </w:tcPr>
+          <w:p>
+            <w:pPr>
+              <w:spacing w:after="0"/>
+            </w:pPr>
+            <w:r>
+              <w:rPr>
+                <w:rFonts w:ascii="Heiti SC" w:hAnsi="Heiti SC" w:eastAsia="Heiti SC" w:cs="Heiti SC" w:hint="eastAsia"/>
+                <w:sz w:val="18"/>
+              </w:rPr>
+              <w:t>降低产品化和售前解释成本</w:t>
+            </w:r>
+          </w:p>
+        </w:tc>
+      </w:tr>
+      <w:tr>
+        <w:tc>
+          <w:tcPr>
+            <w:tcW w:type="dxa" w:w="3331"/>
+            <w:vAlign w:val="center"/>
+            <w:tcMar>
+              <w:top w:w="90" w:type="dxa"/>
+              <w:start w:w="100" w:type="dxa"/>
+              <w:bottom w:w="90" w:type="dxa"/>
+              <w:end w:w="100" w:type="dxa"/>
+            </w:tcMar>
+          </w:tcPr>
+          <w:p>
+            <w:pPr>
+              <w:spacing w:after="0"/>
+            </w:pPr>
+            <w:r>
+              <w:rPr>
+                <w:rFonts w:ascii="Heiti SC" w:hAnsi="Heiti SC" w:eastAsia="Heiti SC" w:cs="Heiti SC" w:hint="eastAsia"/>
+                <w:sz w:val="18"/>
+              </w:rPr>
+              <w:t>本体建模 Agent</w:t>
+            </w:r>
+          </w:p>
+        </w:tc>
+        <w:tc>
+          <w:tcPr>
+            <w:tcW w:type="dxa" w:w="3331"/>
+            <w:vAlign w:val="center"/>
+            <w:tcMar>
+              <w:top w:w="90" w:type="dxa"/>
+              <w:start w:w="100" w:type="dxa"/>
+              <w:bottom w:w="90" w:type="dxa"/>
+              <w:end w:w="100" w:type="dxa"/>
+            </w:tcMar>
+          </w:tcPr>
+          <w:p>
+            <w:pPr>
+              <w:spacing w:after="0"/>
+            </w:pPr>
+            <w:r>
+              <w:rPr>
+                <w:rFonts w:ascii="Heiti SC" w:hAnsi="Heiti SC" w:eastAsia="Heiti SC" w:cs="Heiti SC" w:hint="eastAsia"/>
+                <w:sz w:val="18"/>
+              </w:rPr>
+              <w:t>辅助把源表、文档、GIS、规则映射到动态本体</w:t>
+            </w:r>
+          </w:p>
+        </w:tc>
+        <w:tc>
+          <w:tcPr>
+            <w:tcW w:type="dxa" w:w="3331"/>
+            <w:vAlign w:val="center"/>
+            <w:tcMar>
+              <w:top w:w="90" w:type="dxa"/>
+              <w:start w:w="100" w:type="dxa"/>
+              <w:bottom w:w="90" w:type="dxa"/>
+              <w:end w:w="100" w:type="dxa"/>
+            </w:tcMar>
+          </w:tcPr>
+          <w:p>
+            <w:pPr>
+              <w:spacing w:after="0"/>
+            </w:pPr>
+            <w:r>
+              <w:rPr>
+                <w:rFonts w:ascii="Heiti SC" w:hAnsi="Heiti SC" w:eastAsia="Heiti SC" w:cs="Heiti SC" w:hint="eastAsia"/>
+                <w:sz w:val="18"/>
+              </w:rPr>
+              <w:t>降低建模和口径整理成本</w:t>
+            </w:r>
+          </w:p>
+        </w:tc>
+      </w:tr>
+      <w:tr>
+        <w:tc>
+          <w:tcPr>
+            <w:tcW w:type="dxa" w:w="3331"/>
+            <w:vAlign w:val="center"/>
+            <w:tcMar>
+              <w:top w:w="90" w:type="dxa"/>
+              <w:start w:w="100" w:type="dxa"/>
+              <w:bottom w:w="90" w:type="dxa"/>
+              <w:end w:w="100" w:type="dxa"/>
+            </w:tcMar>
+          </w:tcPr>
+          <w:p>
+            <w:pPr>
+              <w:spacing w:after="0"/>
+            </w:pPr>
+            <w:r>
+              <w:rPr>
+                <w:rFonts w:ascii="Heiti SC" w:hAnsi="Heiti SC" w:eastAsia="Heiti SC" w:cs="Heiti SC" w:hint="eastAsia"/>
+                <w:sz w:val="18"/>
+              </w:rPr>
+              <w:t>分类分级 Agent</w:t>
+            </w:r>
+          </w:p>
+        </w:tc>
+        <w:tc>
+          <w:tcPr>
+            <w:tcW w:type="dxa" w:w="3331"/>
+            <w:vAlign w:val="center"/>
+            <w:tcMar>
+              <w:top w:w="90" w:type="dxa"/>
+              <w:start w:w="100" w:type="dxa"/>
+              <w:bottom w:w="90" w:type="dxa"/>
+              <w:end w:w="100" w:type="dxa"/>
+            </w:tcMar>
+          </w:tcPr>
+          <w:p>
+            <w:pPr>
+              <w:spacing w:after="0"/>
+            </w:pPr>
+            <w:r>
+              <w:rPr>
+                <w:rFonts w:ascii="Heiti SC" w:hAnsi="Heiti SC" w:eastAsia="Heiti SC" w:cs="Heiti SC" w:hint="eastAsia"/>
+                <w:sz w:val="18"/>
+              </w:rPr>
+              <w:t>识别敏感字段，建议 `HIDDEN`、`COMPUTE_ONLY`、`AGGREGATE_ONLY` 等分类</w:t>
+            </w:r>
+          </w:p>
+        </w:tc>
+        <w:tc>
+          <w:tcPr>
+            <w:tcW w:type="dxa" w:w="3331"/>
+            <w:vAlign w:val="center"/>
+            <w:tcMar>
+              <w:top w:w="90" w:type="dxa"/>
+              <w:start w:w="100" w:type="dxa"/>
+              <w:bottom w:w="90" w:type="dxa"/>
+              <w:end w:w="100" w:type="dxa"/>
+            </w:tcMar>
+          </w:tcPr>
+          <w:p>
+            <w:pPr>
+              <w:spacing w:after="0"/>
+            </w:pPr>
+            <w:r>
+              <w:rPr>
+                <w:rFonts w:ascii="Heiti SC" w:hAnsi="Heiti SC" w:eastAsia="Heiti SC" w:cs="Heiti SC" w:hint="eastAsia"/>
+                <w:sz w:val="18"/>
+              </w:rPr>
+              <w:t>降低合规初筛成本</w:t>
+            </w:r>
+          </w:p>
+        </w:tc>
+      </w:tr>
+      <w:tr>
+        <w:tc>
+          <w:tcPr>
+            <w:tcW w:type="dxa" w:w="3331"/>
+            <w:vAlign w:val="center"/>
+            <w:tcMar>
+              <w:top w:w="90" w:type="dxa"/>
+              <w:start w:w="100" w:type="dxa"/>
+              <w:bottom w:w="90" w:type="dxa"/>
+              <w:end w:w="100" w:type="dxa"/>
+            </w:tcMar>
+          </w:tcPr>
+          <w:p>
+            <w:pPr>
+              <w:spacing w:after="0"/>
+            </w:pPr>
+            <w:r>
+              <w:rPr>
+                <w:rFonts w:ascii="Heiti SC" w:hAnsi="Heiti SC" w:eastAsia="Heiti SC" w:cs="Heiti SC" w:hint="eastAsia"/>
+                <w:sz w:val="18"/>
+              </w:rPr>
+              <w:t>质量审计 Agent</w:t>
+            </w:r>
+          </w:p>
+        </w:tc>
+        <w:tc>
+          <w:tcPr>
+            <w:tcW w:type="dxa" w:w="3331"/>
+            <w:vAlign w:val="center"/>
+            <w:tcMar>
+              <w:top w:w="90" w:type="dxa"/>
+              <w:start w:w="100" w:type="dxa"/>
+              <w:bottom w:w="90" w:type="dxa"/>
+              <w:end w:w="100" w:type="dxa"/>
+            </w:tcMar>
+          </w:tcPr>
+          <w:p>
+            <w:pPr>
+              <w:spacing w:after="0"/>
+            </w:pPr>
+            <w:r>
+              <w:rPr>
+                <w:rFonts w:ascii="Heiti SC" w:hAnsi="Heiti SC" w:eastAsia="Heiti SC" w:cs="Heiti SC" w:hint="eastAsia"/>
+                <w:sz w:val="18"/>
+              </w:rPr>
+              <w:t>检查覆盖率、缺失率、时间窗口和异常值</w:t>
+            </w:r>
+          </w:p>
+        </w:tc>
+        <w:tc>
+          <w:tcPr>
+            <w:tcW w:type="dxa" w:w="3331"/>
+            <w:vAlign w:val="center"/>
+            <w:tcMar>
+              <w:top w:w="90" w:type="dxa"/>
+              <w:start w:w="100" w:type="dxa"/>
+              <w:bottom w:w="90" w:type="dxa"/>
+              <w:end w:w="100" w:type="dxa"/>
+            </w:tcMar>
+          </w:tcPr>
+          <w:p>
+            <w:pPr>
+              <w:spacing w:after="0"/>
+            </w:pPr>
+            <w:r>
+              <w:rPr>
+                <w:rFonts w:ascii="Heiti SC" w:hAnsi="Heiti SC" w:eastAsia="Heiti SC" w:cs="Heiti SC" w:hint="eastAsia"/>
+                <w:sz w:val="18"/>
+              </w:rPr>
+              <w:t>降低交付前质检成本</w:t>
+            </w:r>
+          </w:p>
+        </w:tc>
+      </w:tr>
+      <w:tr>
+        <w:tc>
+          <w:tcPr>
+            <w:tcW w:type="dxa" w:w="3331"/>
+            <w:vAlign w:val="center"/>
+            <w:tcMar>
+              <w:top w:w="90" w:type="dxa"/>
+              <w:start w:w="100" w:type="dxa"/>
+              <w:bottom w:w="90" w:type="dxa"/>
+              <w:end w:w="100" w:type="dxa"/>
+            </w:tcMar>
+          </w:tcPr>
+          <w:p>
+            <w:pPr>
+              <w:spacing w:after="0"/>
+            </w:pPr>
+            <w:r>
+              <w:rPr>
+                <w:rFonts w:ascii="Heiti SC" w:hAnsi="Heiti SC" w:eastAsia="Heiti SC" w:cs="Heiti SC" w:hint="eastAsia"/>
+                <w:sz w:val="18"/>
+              </w:rPr>
+              <w:t>产品编译 Agent</w:t>
+            </w:r>
+          </w:p>
+        </w:tc>
+        <w:tc>
+          <w:tcPr>
+            <w:tcW w:type="dxa" w:w="3331"/>
+            <w:vAlign w:val="center"/>
+            <w:tcMar>
+              <w:top w:w="90" w:type="dxa"/>
+              <w:start w:w="100" w:type="dxa"/>
+              <w:bottom w:w="90" w:type="dxa"/>
+              <w:end w:w="100" w:type="dxa"/>
+            </w:tcMar>
+          </w:tcPr>
+          <w:p>
+            <w:pPr>
+              <w:spacing w:after="0"/>
+            </w:pPr>
+            <w:r>
+              <w:rPr>
+                <w:rFonts w:ascii="Heiti SC" w:hAnsi="Heiti SC" w:eastAsia="Heiti SC" w:cs="Heiti SC" w:hint="eastAsia"/>
+                <w:sz w:val="18"/>
+              </w:rPr>
+              <w:t>调用 Product Compiler 生成 OSDK、MCP、OpenAPI 和 Runtime Binding</w:t>
+            </w:r>
+          </w:p>
+        </w:tc>
+        <w:tc>
+          <w:tcPr>
+            <w:tcW w:type="dxa" w:w="3331"/>
+            <w:vAlign w:val="center"/>
+            <w:tcMar>
+              <w:top w:w="90" w:type="dxa"/>
+              <w:start w:w="100" w:type="dxa"/>
+              <w:bottom w:w="90" w:type="dxa"/>
+              <w:end w:w="100" w:type="dxa"/>
+            </w:tcMar>
+          </w:tcPr>
+          <w:p>
+            <w:pPr>
+              <w:spacing w:after="0"/>
+            </w:pPr>
+            <w:r>
+              <w:rPr>
+                <w:rFonts w:ascii="Heiti SC" w:hAnsi="Heiti SC" w:eastAsia="Heiti SC" w:cs="Heiti SC" w:hint="eastAsia"/>
+                <w:sz w:val="18"/>
+              </w:rPr>
+              <w:t>降低发布和版本维护成本</w:t>
+            </w:r>
+          </w:p>
+        </w:tc>
+      </w:tr>
+      <w:tr>
+        <w:tc>
+          <w:tcPr>
+            <w:tcW w:type="dxa" w:w="3331"/>
+            <w:vAlign w:val="center"/>
+            <w:tcMar>
+              <w:top w:w="90" w:type="dxa"/>
+              <w:start w:w="100" w:type="dxa"/>
+              <w:bottom w:w="90" w:type="dxa"/>
+              <w:end w:w="100" w:type="dxa"/>
+            </w:tcMar>
+          </w:tcPr>
+          <w:p>
+            <w:pPr>
+              <w:spacing w:after="0"/>
+            </w:pPr>
+            <w:r>
+              <w:rPr>
+                <w:rFonts w:ascii="Heiti SC" w:hAnsi="Heiti SC" w:eastAsia="Heiti SC" w:cs="Heiti SC" w:hint="eastAsia"/>
+                <w:sz w:val="18"/>
+              </w:rPr>
+              <w:t>授权运营 Agent</w:t>
+            </w:r>
+          </w:p>
+        </w:tc>
+        <w:tc>
+          <w:tcPr>
+            <w:tcW w:type="dxa" w:w="3331"/>
+            <w:vAlign w:val="center"/>
+            <w:tcMar>
+              <w:top w:w="90" w:type="dxa"/>
+              <w:start w:w="100" w:type="dxa"/>
+              <w:bottom w:w="90" w:type="dxa"/>
+              <w:end w:w="100" w:type="dxa"/>
+            </w:tcMar>
+          </w:tcPr>
+          <w:p>
+            <w:pPr>
+              <w:spacing w:after="0"/>
+            </w:pPr>
+            <w:r>
+              <w:rPr>
+                <w:rFonts w:ascii="Heiti SC" w:hAnsi="Heiti SC" w:eastAsia="Heiti SC" w:cs="Heiti SC" w:hint="eastAsia"/>
+                <w:sz w:val="18"/>
+              </w:rPr>
+              <w:t>处理用途、期限、主体、配额、撤销和审批协同</w:t>
+            </w:r>
+          </w:p>
+        </w:tc>
+        <w:tc>
+          <w:tcPr>
+            <w:tcW w:type="dxa" w:w="3331"/>
+            <w:vAlign w:val="center"/>
+            <w:tcMar>
+              <w:top w:w="90" w:type="dxa"/>
+              <w:start w:w="100" w:type="dxa"/>
+              <w:bottom w:w="90" w:type="dxa"/>
+              <w:end w:w="100" w:type="dxa"/>
+            </w:tcMar>
+          </w:tcPr>
+          <w:p>
+            <w:pPr>
+              <w:spacing w:after="0"/>
+            </w:pPr>
+            <w:r>
+              <w:rPr>
+                <w:rFonts w:ascii="Heiti SC" w:hAnsi="Heiti SC" w:eastAsia="Heiti SC" w:cs="Heiti SC" w:hint="eastAsia"/>
+                <w:sz w:val="18"/>
+              </w:rPr>
+              <w:t>降低授权运营成本</w:t>
+            </w:r>
+          </w:p>
+        </w:tc>
+      </w:tr>
+      <w:tr>
+        <w:tc>
+          <w:tcPr>
+            <w:tcW w:type="dxa" w:w="3331"/>
+            <w:vAlign w:val="center"/>
+            <w:tcMar>
+              <w:top w:w="90" w:type="dxa"/>
+              <w:start w:w="100" w:type="dxa"/>
+              <w:bottom w:w="90" w:type="dxa"/>
+              <w:end w:w="100" w:type="dxa"/>
+            </w:tcMar>
+          </w:tcPr>
+          <w:p>
+            <w:pPr>
+              <w:spacing w:after="0"/>
+            </w:pPr>
+            <w:r>
+              <w:rPr>
+                <w:rFonts w:ascii="Heiti SC" w:hAnsi="Heiti SC" w:eastAsia="Heiti SC" w:cs="Heiti SC" w:hint="eastAsia"/>
+                <w:sz w:val="18"/>
+              </w:rPr>
+              <w:t>交付运维 Agent</w:t>
+            </w:r>
+          </w:p>
+        </w:tc>
+        <w:tc>
+          <w:tcPr>
+            <w:tcW w:type="dxa" w:w="3331"/>
+            <w:vAlign w:val="center"/>
+            <w:tcMar>
+              <w:top w:w="90" w:type="dxa"/>
+              <w:start w:w="100" w:type="dxa"/>
+              <w:bottom w:w="90" w:type="dxa"/>
+              <w:end w:w="100" w:type="dxa"/>
+            </w:tcMar>
+          </w:tcPr>
+          <w:p>
+            <w:pPr>
+              <w:spacing w:after="0"/>
+            </w:pPr>
+            <w:r>
+              <w:rPr>
+                <w:rFonts w:ascii="Heiti SC" w:hAnsi="Heiti SC" w:eastAsia="Heiti SC" w:cs="Heiti SC" w:hint="eastAsia"/>
+                <w:sz w:val="18"/>
+              </w:rPr>
+              <w:t>跟踪任务状态、失败重试、异步通知和交付包</w:t>
+            </w:r>
+          </w:p>
+        </w:tc>
+        <w:tc>
+          <w:tcPr>
+            <w:tcW w:type="dxa" w:w="3331"/>
+            <w:vAlign w:val="center"/>
+            <w:tcMar>
+              <w:top w:w="90" w:type="dxa"/>
+              <w:start w:w="100" w:type="dxa"/>
+              <w:bottom w:w="90" w:type="dxa"/>
+              <w:end w:w="100" w:type="dxa"/>
+            </w:tcMar>
+          </w:tcPr>
+          <w:p>
+            <w:pPr>
+              <w:spacing w:after="0"/>
+            </w:pPr>
+            <w:r>
+              <w:rPr>
+                <w:rFonts w:ascii="Heiti SC" w:hAnsi="Heiti SC" w:eastAsia="Heiti SC" w:cs="Heiti SC" w:hint="eastAsia"/>
+                <w:sz w:val="18"/>
+              </w:rPr>
+              <w:t>降低交付过程盯人成本</w:t>
+            </w:r>
+          </w:p>
+        </w:tc>
+      </w:tr>
+      <w:tr>
+        <w:tc>
+          <w:tcPr>
+            <w:tcW w:type="dxa" w:w="3331"/>
+            <w:vAlign w:val="center"/>
+            <w:tcMar>
+              <w:top w:w="90" w:type="dxa"/>
+              <w:start w:w="100" w:type="dxa"/>
+              <w:bottom w:w="90" w:type="dxa"/>
+              <w:end w:w="100" w:type="dxa"/>
+            </w:tcMar>
+          </w:tcPr>
+          <w:p>
+            <w:pPr>
+              <w:spacing w:after="0"/>
+            </w:pPr>
+            <w:r>
+              <w:rPr>
+                <w:rFonts w:ascii="Heiti SC" w:hAnsi="Heiti SC" w:eastAsia="Heiti SC" w:cs="Heiti SC" w:hint="eastAsia"/>
+                <w:sz w:val="18"/>
+              </w:rPr>
+              <w:t>凭证复核 Agent</w:t>
+            </w:r>
+          </w:p>
+        </w:tc>
+        <w:tc>
+          <w:tcPr>
+            <w:tcW w:type="dxa" w:w="3331"/>
+            <w:vAlign w:val="center"/>
+            <w:tcMar>
+              <w:top w:w="90" w:type="dxa"/>
+              <w:start w:w="100" w:type="dxa"/>
+              <w:bottom w:w="90" w:type="dxa"/>
+              <w:end w:w="100" w:type="dxa"/>
+            </w:tcMar>
+          </w:tcPr>
+          <w:p>
+            <w:pPr>
+              <w:spacing w:after="0"/>
+            </w:pPr>
+            <w:r>
+              <w:rPr>
+                <w:rFonts w:ascii="Heiti SC" w:hAnsi="Heiti SC" w:eastAsia="Heiti SC" w:cs="Heiti SC" w:hint="eastAsia"/>
+                <w:sz w:val="18"/>
+              </w:rPr>
+              <w:t>验证 Receipt、签名、hash 和版本链</w:t>
+            </w:r>
+          </w:p>
+        </w:tc>
+        <w:tc>
+          <w:tcPr>
+            <w:tcW w:type="dxa" w:w="3331"/>
+            <w:vAlign w:val="center"/>
+            <w:tcMar>
+              <w:top w:w="90" w:type="dxa"/>
+              <w:start w:w="100" w:type="dxa"/>
+              <w:bottom w:w="90" w:type="dxa"/>
+              <w:end w:w="100" w:type="dxa"/>
+            </w:tcMar>
+          </w:tcPr>
+          <w:p>
+            <w:pPr>
+              <w:spacing w:after="0"/>
+            </w:pPr>
+            <w:r>
+              <w:rPr>
+                <w:rFonts w:ascii="Heiti SC" w:hAnsi="Heiti SC" w:eastAsia="Heiti SC" w:cs="Heiti SC" w:hint="eastAsia"/>
+                <w:sz w:val="18"/>
+              </w:rPr>
+              <w:t>降低售后复核和争议处理成本</w:t>
+            </w:r>
+          </w:p>
+        </w:tc>
+      </w:tr>
+    </w:tbl>
+    <w:p/>
+    <w:p>
+      <w:r>
+        <w:rPr>
+          <w:rFonts w:ascii="Heiti SC" w:hAnsi="Heiti SC" w:eastAsia="Heiti SC" w:cs="Heiti SC" w:hint="eastAsia"/>
+          <w:b w:val="0"/>
+        </w:rPr>
+        <w:t>这个“数字员工部门”是 awiki.ai 拓展数据服务市场的关键抓手。它不要求数据提供方一开始就有完整数据产品团队，而是先帮它把服务流程跑起来。</w:t>
+      </w:r>
+    </w:p>
+    <w:p>
+      <w:pPr>
+        <w:pStyle w:val="Heading3"/>
+      </w:pPr>
+      <w:r>
+        <w:rPr>
+          <w:rFonts w:ascii="Heiti SC" w:hAnsi="Heiti SC" w:eastAsia="Heiti SC" w:cs="Heiti SC" w:hint="eastAsia"/>
+        </w:rPr>
+        <w:t>5.4 异步通知为什么重要</w:t>
+      </w:r>
+    </w:p>
+    <w:p>
+      <w:r>
+        <w:rPr>
+          <w:rFonts w:ascii="Heiti SC" w:hAnsi="Heiti SC" w:eastAsia="Heiti SC" w:cs="Heiti SC" w:hint="eastAsia"/>
+          <w:b w:val="0"/>
+        </w:rPr>
+        <w:t>真实数据服务很少都是秒级同步返回。常见情况包括：</w:t>
+      </w:r>
+    </w:p>
+    <w:p>
+      <w:pPr>
+        <w:pStyle w:val="ListBullet"/>
+      </w:pPr>
+      <w:r>
+        <w:rPr>
+          <w:rFonts w:ascii="Heiti SC" w:hAnsi="Heiti SC" w:eastAsia="Heiti SC" w:cs="Heiti SC" w:hint="eastAsia"/>
+          <w:b w:val="0"/>
+        </w:rPr>
+        <w:t>授权审批需要人工确认。</w:t>
+      </w:r>
+    </w:p>
+    <w:p>
+      <w:pPr>
+        <w:pStyle w:val="ListBullet"/>
+      </w:pPr>
+      <w:r>
+        <w:rPr>
+          <w:rFonts w:ascii="Heiti SC" w:hAnsi="Heiti SC" w:eastAsia="Heiti SC" w:cs="Heiti SC" w:hint="eastAsia"/>
+          <w:b w:val="0"/>
+        </w:rPr>
+        <w:t>数据质量检查需要几分钟。</w:t>
+      </w:r>
+    </w:p>
+    <w:p>
+      <w:pPr>
+        <w:pStyle w:val="ListBullet"/>
+      </w:pPr>
+      <w:r>
+        <w:rPr>
+          <w:rFonts w:ascii="Heiti SC" w:hAnsi="Heiti SC" w:eastAsia="Heiti SC" w:cs="Heiti SC" w:hint="eastAsia"/>
+          <w:b w:val="0"/>
+        </w:rPr>
+        <w:t>GIS 风险计算需要异步任务。</w:t>
+      </w:r>
+    </w:p>
+    <w:p>
+      <w:pPr>
+        <w:pStyle w:val="ListBullet"/>
+      </w:pPr>
+      <w:r>
+        <w:rPr>
+          <w:rFonts w:ascii="Heiti SC" w:hAnsi="Heiti SC" w:eastAsia="Heiti SC" w:cs="Heiti SC" w:hint="eastAsia"/>
+          <w:b w:val="0"/>
+        </w:rPr>
+        <w:t>跨 Provider 联合分析需要等待多个 Runtime。</w:t>
+      </w:r>
+    </w:p>
+    <w:p>
+      <w:pPr>
+        <w:pStyle w:val="ListBullet"/>
+      </w:pPr>
+      <w:r>
+        <w:rPr>
+          <w:rFonts w:ascii="Heiti SC" w:hAnsi="Heiti SC" w:eastAsia="Heiti SC" w:cs="Heiti SC" w:hint="eastAsia"/>
+          <w:b w:val="0"/>
+        </w:rPr>
+        <w:t>特殊用途合同需要补充材料。</w:t>
+      </w:r>
+    </w:p>
+    <w:p>
+      <w:pPr>
+        <w:pStyle w:val="ListBullet"/>
+      </w:pPr>
+      <w:r>
+        <w:rPr>
+          <w:rFonts w:ascii="Heiti SC" w:hAnsi="Heiti SC" w:eastAsia="Heiti SC" w:cs="Heiti SC" w:hint="eastAsia"/>
+          <w:b w:val="0"/>
+        </w:rPr>
+        <w:t>Receipt 复核可能由独立 Verifier Agent 完成。</w:t>
+      </w:r>
+    </w:p>
+    <w:p>
+      <w:r>
+        <w:rPr>
+          <w:rFonts w:ascii="Heiti SC" w:hAnsi="Heiti SC" w:eastAsia="Heiti SC" w:cs="Heiti SC" w:hint="eastAsia"/>
+          <w:b w:val="0"/>
+        </w:rPr>
+        <w:t>awiki.ai 的消息和会话能力可以把这些状态变成自然的协作流：</w:t>
+      </w:r>
+    </w:p>
+    <w:tbl>
+      <w:tblPr>
+        <w:tblW w:type="auto" w:w="0"/>
+        <w:jc w:val="left"/>
+        <w:tblLayout w:type="autofit"/>
+        <w:tblLook w:firstColumn="1" w:firstRow="1" w:lastColumn="0" w:lastRow="0" w:noHBand="0" w:noVBand="1" w:val="04A0"/>
+      </w:tblPr>
+      <w:tblGrid>
+        <w:gridCol w:w="9994"/>
+      </w:tblGrid>
+      <w:tr>
+        <w:tc>
+          <w:tcPr>
+            <w:tcW w:type="dxa" w:w="9994"/>
+            <w:shd w:fill="F6F8FA"/>
+            <w:tcMar>
+              <w:top w:w="110" w:type="dxa"/>
+              <w:start w:w="120" w:type="dxa"/>
+              <w:bottom w:w="110" w:type="dxa"/>
+              <w:end w:w="120" w:type="dxa"/>
+            </w:tcMar>
+          </w:tcPr>
+          <w:p>
+            <w:pPr>
+              <w:spacing w:after="0"/>
+            </w:pPr>
+            <w:r>
+              <w:rPr>
+                <w:rFonts w:ascii="Heiti SC" w:hAnsi="Heiti SC" w:eastAsia="Heiti SC" w:cs="Heiti SC" w:hint="eastAsia"/>
+                <w:color w:val="111827"/>
+                <w:sz w:val="16"/>
+              </w:rPr>
+              <w:t>Buyer Agent:</w:t>
+              <w:br/>
+              <w:t>我要评估企业 A 的用电征信。</w:t>
+              <w:br/>
+              <w:br/>
+              <w:t>Provider Service Agent:</w:t>
+              <w:br/>
+              <w:t>已收到，正在匹配数据产品。</w:t>
+              <w:br/>
+              <w:br/>
+              <w:t>Policy Agent:</w:t>
+              <w:br/>
+              <w:t>需要授权，已生成申请。</w:t>
+              <w:br/>
+              <w:br/>
+              <w:t>Human Approver:</w:t>
+              <w:br/>
+              <w:t>已批准。</w:t>
+              <w:br/>
+              <w:br/>
+              <w:t>Runtime Agent:</w:t>
+              <w:br/>
+              <w:t>任务开始执行。</w:t>
+              <w:br/>
+              <w:br/>
+              <w:t>Quality Agent:</w:t>
+              <w:br/>
+              <w:t>数据覆盖率 92%，满足门槛。</w:t>
+              <w:br/>
+              <w:br/>
+              <w:t>Audit Agent:</w:t>
+              <w:br/>
+              <w:t>Receipt 已签发。</w:t>
+              <w:br/>
+              <w:br/>
+              <w:t>Provider Service Agent:</w:t>
+              <w:br/>
+              <w:t>结果已返回，可验证。</w:t>
+            </w:r>
+          </w:p>
+        </w:tc>
+      </w:tr>
+    </w:tbl>
+    <w:p/>
+    <w:p>
+      <w:r>
+        <w:rPr>
+          <w:rFonts w:ascii="Heiti SC" w:hAnsi="Heiti SC" w:eastAsia="Heiti SC" w:cs="Heiti SC" w:hint="eastAsia"/>
+          <w:b w:val="0"/>
+        </w:rPr>
+        <w:t>这比传统 API 的 `pending / success / failed` 更适合 Agent 时代，因为它保留了协作上下文、责任主体和可复核过程。</w:t>
+      </w:r>
+    </w:p>
+    <w:p>
+      <w:pPr>
+        <w:pStyle w:val="Heading3"/>
+      </w:pPr>
+      <w:r>
+        <w:rPr>
+          <w:rFonts w:ascii="Heiti SC" w:hAnsi="Heiti SC" w:eastAsia="Heiti SC" w:cs="Heiti SC" w:hint="eastAsia"/>
+        </w:rPr>
+        <w:t>5.5 awiki.ai 不替代哪些模块</w:t>
+      </w:r>
+    </w:p>
+    <w:p>
+      <w:r>
+        <w:rPr>
+          <w:rFonts w:ascii="Heiti SC" w:hAnsi="Heiti SC" w:eastAsia="Heiti SC" w:cs="Heiti SC" w:hint="eastAsia"/>
+          <w:b w:val="0"/>
+        </w:rPr>
+        <w:t>边界要讲清楚。awiki.ai 增强 Agent 可信协作网络，但不应该替代数据产品执行边界。</w:t>
+      </w:r>
+    </w:p>
+    <w:tbl>
+      <w:tblPr>
+        <w:tblStyle w:val="TableGrid"/>
+        <w:tblW w:type="auto" w:w="0"/>
+        <w:jc w:val="center"/>
+        <w:tblLayout w:type="autofit"/>
+        <w:tblLook w:firstColumn="1" w:firstRow="1" w:lastColumn="0" w:lastRow="0" w:noHBand="0" w:noVBand="1" w:val="04A0"/>
+      </w:tblPr>
+      <w:tblGrid>
+        <w:gridCol w:w="3331"/>
+        <w:gridCol w:w="3331"/>
+        <w:gridCol w:w="3331"/>
+      </w:tblGrid>
+      <w:tr>
+        <w:tc>
+          <w:tcPr>
+            <w:tcW w:type="dxa" w:w="3331"/>
+            <w:vAlign w:val="center"/>
+            <w:tcMar>
+              <w:top w:w="90" w:type="dxa"/>
+              <w:start w:w="100" w:type="dxa"/>
+              <w:bottom w:w="90" w:type="dxa"/>
+              <w:end w:w="100" w:type="dxa"/>
+            </w:tcMar>
+            <w:shd w:fill="EAF2FF"/>
+          </w:tcPr>
+          <w:p>
+            <w:pPr>
+              <w:spacing w:after="0"/>
+            </w:pPr>
+            <w:r>
+              <w:rPr>
+                <w:rFonts w:ascii="Heiti SC" w:hAnsi="Heiti SC" w:eastAsia="Heiti SC" w:cs="Heiti SC" w:hint="eastAsia"/>
+                <w:b/>
+                <w:color w:val="1E40AF"/>
+                <w:sz w:val="18"/>
+              </w:rPr>
+              <w:t>能力</w:t>
+            </w:r>
+          </w:p>
+        </w:tc>
+        <w:tc>
+          <w:tcPr>
+            <w:tcW w:type="dxa" w:w="3331"/>
+            <w:vAlign w:val="center"/>
+            <w:tcMar>
+              <w:top w:w="90" w:type="dxa"/>
+              <w:start w:w="100" w:type="dxa"/>
+              <w:bottom w:w="90" w:type="dxa"/>
+              <w:end w:w="100" w:type="dxa"/>
+            </w:tcMar>
+            <w:shd w:fill="EAF2FF"/>
+          </w:tcPr>
+          <w:p>
+            <w:pPr>
+              <w:spacing w:after="0"/>
+            </w:pPr>
+            <w:r>
+              <w:rPr>
+                <w:rFonts w:ascii="Heiti SC" w:hAnsi="Heiti SC" w:eastAsia="Heiti SC" w:cs="Heiti SC" w:hint="eastAsia"/>
+                <w:b/>
+                <w:color w:val="1E40AF"/>
+                <w:sz w:val="18"/>
+              </w:rPr>
+              <w:t>awiki.ai 适合承担吗</w:t>
+            </w:r>
+          </w:p>
+        </w:tc>
+        <w:tc>
+          <w:tcPr>
+            <w:tcW w:type="dxa" w:w="3331"/>
+            <w:vAlign w:val="center"/>
+            <w:tcMar>
+              <w:top w:w="90" w:type="dxa"/>
+              <w:start w:w="100" w:type="dxa"/>
+              <w:bottom w:w="90" w:type="dxa"/>
+              <w:end w:w="100" w:type="dxa"/>
+            </w:tcMar>
+            <w:shd w:fill="EAF2FF"/>
+          </w:tcPr>
+          <w:p>
+            <w:pPr>
+              <w:spacing w:after="0"/>
+            </w:pPr>
+            <w:r>
+              <w:rPr>
+                <w:rFonts w:ascii="Heiti SC" w:hAnsi="Heiti SC" w:eastAsia="Heiti SC" w:cs="Heiti SC" w:hint="eastAsia"/>
+                <w:b/>
+                <w:color w:val="1E40AF"/>
+                <w:sz w:val="18"/>
+              </w:rPr>
+              <w:t>本方案中应由谁承担</w:t>
+            </w:r>
+          </w:p>
+        </w:tc>
+      </w:tr>
+      <w:tr>
+        <w:tc>
+          <w:tcPr>
+            <w:tcW w:type="dxa" w:w="3331"/>
+            <w:vAlign w:val="center"/>
+            <w:tcMar>
+              <w:top w:w="90" w:type="dxa"/>
+              <w:start w:w="100" w:type="dxa"/>
+              <w:bottom w:w="90" w:type="dxa"/>
+              <w:end w:w="100" w:type="dxa"/>
+            </w:tcMar>
+          </w:tcPr>
+          <w:p>
+            <w:pPr>
+              <w:spacing w:after="0"/>
+            </w:pPr>
+            <w:r>
+              <w:rPr>
+                <w:rFonts w:ascii="Heiti SC" w:hAnsi="Heiti SC" w:eastAsia="Heiti SC" w:cs="Heiti SC" w:hint="eastAsia"/>
+                <w:sz w:val="18"/>
+              </w:rPr>
+              <w:t>Agent 身份、发现、消息</w:t>
+            </w:r>
+          </w:p>
+        </w:tc>
+        <w:tc>
+          <w:tcPr>
+            <w:tcW w:type="dxa" w:w="3331"/>
+            <w:vAlign w:val="center"/>
+            <w:tcMar>
+              <w:top w:w="90" w:type="dxa"/>
+              <w:start w:w="100" w:type="dxa"/>
+              <w:bottom w:w="90" w:type="dxa"/>
+              <w:end w:w="100" w:type="dxa"/>
+            </w:tcMar>
+          </w:tcPr>
+          <w:p>
+            <w:pPr>
+              <w:spacing w:after="0"/>
+            </w:pPr>
+            <w:r>
+              <w:rPr>
+                <w:rFonts w:ascii="Heiti SC" w:hAnsi="Heiti SC" w:eastAsia="Heiti SC" w:cs="Heiti SC" w:hint="eastAsia"/>
+                <w:sz w:val="18"/>
+              </w:rPr>
+              <w:t>适合</w:t>
+            </w:r>
+          </w:p>
+        </w:tc>
+        <w:tc>
+          <w:tcPr>
+            <w:tcW w:type="dxa" w:w="3331"/>
+            <w:vAlign w:val="center"/>
+            <w:tcMar>
+              <w:top w:w="90" w:type="dxa"/>
+              <w:start w:w="100" w:type="dxa"/>
+              <w:bottom w:w="90" w:type="dxa"/>
+              <w:end w:w="100" w:type="dxa"/>
+            </w:tcMar>
+          </w:tcPr>
+          <w:p>
+            <w:pPr>
+              <w:spacing w:after="0"/>
+            </w:pPr>
+            <w:r>
+              <w:rPr>
+                <w:rFonts w:ascii="Heiti SC" w:hAnsi="Heiti SC" w:eastAsia="Heiti SC" w:cs="Heiti SC" w:hint="eastAsia"/>
+                <w:sz w:val="18"/>
+              </w:rPr>
+              <w:t>awiki.ai Agent 网络</w:t>
+            </w:r>
+          </w:p>
+        </w:tc>
+      </w:tr>
+      <w:tr>
+        <w:tc>
+          <w:tcPr>
+            <w:tcW w:type="dxa" w:w="3331"/>
+            <w:vAlign w:val="center"/>
+            <w:tcMar>
+              <w:top w:w="90" w:type="dxa"/>
+              <w:start w:w="100" w:type="dxa"/>
+              <w:bottom w:w="90" w:type="dxa"/>
+              <w:end w:w="100" w:type="dxa"/>
+            </w:tcMar>
+          </w:tcPr>
+          <w:p>
+            <w:pPr>
+              <w:spacing w:after="0"/>
+            </w:pPr>
+            <w:r>
+              <w:rPr>
+                <w:rFonts w:ascii="Heiti SC" w:hAnsi="Heiti SC" w:eastAsia="Heiti SC" w:cs="Heiti SC" w:hint="eastAsia"/>
+                <w:sz w:val="18"/>
+              </w:rPr>
+              <w:t>异步任务通知</w:t>
+            </w:r>
+          </w:p>
+        </w:tc>
+        <w:tc>
+          <w:tcPr>
+            <w:tcW w:type="dxa" w:w="3331"/>
+            <w:vAlign w:val="center"/>
+            <w:tcMar>
+              <w:top w:w="90" w:type="dxa"/>
+              <w:start w:w="100" w:type="dxa"/>
+              <w:bottom w:w="90" w:type="dxa"/>
+              <w:end w:w="100" w:type="dxa"/>
+            </w:tcMar>
+          </w:tcPr>
+          <w:p>
+            <w:pPr>
+              <w:spacing w:after="0"/>
+            </w:pPr>
+            <w:r>
+              <w:rPr>
+                <w:rFonts w:ascii="Heiti SC" w:hAnsi="Heiti SC" w:eastAsia="Heiti SC" w:cs="Heiti SC" w:hint="eastAsia"/>
+                <w:sz w:val="18"/>
+              </w:rPr>
+              <w:t>适合</w:t>
+            </w:r>
+          </w:p>
+        </w:tc>
+        <w:tc>
+          <w:tcPr>
+            <w:tcW w:type="dxa" w:w="3331"/>
+            <w:vAlign w:val="center"/>
+            <w:tcMar>
+              <w:top w:w="90" w:type="dxa"/>
+              <w:start w:w="100" w:type="dxa"/>
+              <w:bottom w:w="90" w:type="dxa"/>
+              <w:end w:w="100" w:type="dxa"/>
+            </w:tcMar>
+          </w:tcPr>
+          <w:p>
+            <w:pPr>
+              <w:spacing w:after="0"/>
+            </w:pPr>
+            <w:r>
+              <w:rPr>
+                <w:rFonts w:ascii="Heiti SC" w:hAnsi="Heiti SC" w:eastAsia="Heiti SC" w:cs="Heiti SC" w:hint="eastAsia"/>
+                <w:sz w:val="18"/>
+              </w:rPr>
+              <w:t>awiki.ai + Gateway/Audit 事件</w:t>
+            </w:r>
+          </w:p>
+        </w:tc>
+      </w:tr>
+      <w:tr>
+        <w:tc>
+          <w:tcPr>
+            <w:tcW w:type="dxa" w:w="3331"/>
+            <w:vAlign w:val="center"/>
+            <w:tcMar>
+              <w:top w:w="90" w:type="dxa"/>
+              <w:start w:w="100" w:type="dxa"/>
+              <w:bottom w:w="90" w:type="dxa"/>
+              <w:end w:w="100" w:type="dxa"/>
+            </w:tcMar>
+          </w:tcPr>
+          <w:p>
+            <w:pPr>
+              <w:spacing w:after="0"/>
+            </w:pPr>
+            <w:r>
+              <w:rPr>
+                <w:rFonts w:ascii="Heiti SC" w:hAnsi="Heiti SC" w:eastAsia="Heiti SC" w:cs="Heiti SC" w:hint="eastAsia"/>
+                <w:sz w:val="18"/>
+              </w:rPr>
+              <w:t>数据产品接口生成</w:t>
+            </w:r>
+          </w:p>
+        </w:tc>
+        <w:tc>
+          <w:tcPr>
+            <w:tcW w:type="dxa" w:w="3331"/>
+            <w:vAlign w:val="center"/>
+            <w:tcMar>
+              <w:top w:w="90" w:type="dxa"/>
+              <w:start w:w="100" w:type="dxa"/>
+              <w:bottom w:w="90" w:type="dxa"/>
+              <w:end w:w="100" w:type="dxa"/>
+            </w:tcMar>
+          </w:tcPr>
+          <w:p>
+            <w:pPr>
+              <w:spacing w:after="0"/>
+            </w:pPr>
+            <w:r>
+              <w:rPr>
+                <w:rFonts w:ascii="Heiti SC" w:hAnsi="Heiti SC" w:eastAsia="Heiti SC" w:cs="Heiti SC" w:hint="eastAsia"/>
+                <w:sz w:val="18"/>
+              </w:rPr>
+              <w:t>不适合替代</w:t>
+            </w:r>
+          </w:p>
+        </w:tc>
+        <w:tc>
+          <w:tcPr>
+            <w:tcW w:type="dxa" w:w="3331"/>
+            <w:vAlign w:val="center"/>
+            <w:tcMar>
+              <w:top w:w="90" w:type="dxa"/>
+              <w:start w:w="100" w:type="dxa"/>
+              <w:bottom w:w="90" w:type="dxa"/>
+              <w:end w:w="100" w:type="dxa"/>
+            </w:tcMar>
+          </w:tcPr>
+          <w:p>
+            <w:pPr>
+              <w:spacing w:after="0"/>
+            </w:pPr>
+            <w:r>
+              <w:rPr>
+                <w:rFonts w:ascii="Heiti SC" w:hAnsi="Heiti SC" w:eastAsia="Heiti SC" w:cs="Heiti SC" w:hint="eastAsia"/>
+                <w:sz w:val="18"/>
+              </w:rPr>
+              <w:t>Product Compiler / OSDK Generator</w:t>
+            </w:r>
+          </w:p>
+        </w:tc>
+      </w:tr>
+      <w:tr>
+        <w:tc>
+          <w:tcPr>
+            <w:tcW w:type="dxa" w:w="3331"/>
+            <w:vAlign w:val="center"/>
+            <w:tcMar>
+              <w:top w:w="90" w:type="dxa"/>
+              <w:start w:w="100" w:type="dxa"/>
+              <w:bottom w:w="90" w:type="dxa"/>
+              <w:end w:w="100" w:type="dxa"/>
+            </w:tcMar>
+          </w:tcPr>
+          <w:p>
+            <w:pPr>
+              <w:spacing w:after="0"/>
+            </w:pPr>
+            <w:r>
+              <w:rPr>
+                <w:rFonts w:ascii="Heiti SC" w:hAnsi="Heiti SC" w:eastAsia="Heiti SC" w:cs="Heiti SC" w:hint="eastAsia"/>
+                <w:sz w:val="18"/>
+              </w:rPr>
+              <w:t>字段分类分级裁剪</w:t>
+            </w:r>
+          </w:p>
+        </w:tc>
+        <w:tc>
+          <w:tcPr>
+            <w:tcW w:type="dxa" w:w="3331"/>
+            <w:vAlign w:val="center"/>
+            <w:tcMar>
+              <w:top w:w="90" w:type="dxa"/>
+              <w:start w:w="100" w:type="dxa"/>
+              <w:bottom w:w="90" w:type="dxa"/>
+              <w:end w:w="100" w:type="dxa"/>
+            </w:tcMar>
+          </w:tcPr>
+          <w:p>
+            <w:pPr>
+              <w:spacing w:after="0"/>
+            </w:pPr>
+            <w:r>
+              <w:rPr>
+                <w:rFonts w:ascii="Heiti SC" w:hAnsi="Heiti SC" w:eastAsia="Heiti SC" w:cs="Heiti SC" w:hint="eastAsia"/>
+                <w:sz w:val="18"/>
+              </w:rPr>
+              <w:t>不适合替代</w:t>
+            </w:r>
+          </w:p>
+        </w:tc>
+        <w:tc>
+          <w:tcPr>
+            <w:tcW w:type="dxa" w:w="3331"/>
+            <w:vAlign w:val="center"/>
+            <w:tcMar>
+              <w:top w:w="90" w:type="dxa"/>
+              <w:start w:w="100" w:type="dxa"/>
+              <w:bottom w:w="90" w:type="dxa"/>
+              <w:end w:w="100" w:type="dxa"/>
+            </w:tcMar>
+          </w:tcPr>
+          <w:p>
+            <w:pPr>
+              <w:spacing w:after="0"/>
+            </w:pPr>
+            <w:r>
+              <w:rPr>
+                <w:rFonts w:ascii="Heiti SC" w:hAnsi="Heiti SC" w:eastAsia="Heiti SC" w:cs="Heiti SC" w:hint="eastAsia"/>
+                <w:sz w:val="18"/>
+              </w:rPr>
+              <w:t>Product Compiler</w:t>
+            </w:r>
+          </w:p>
+        </w:tc>
+      </w:tr>
+      <w:tr>
+        <w:tc>
+          <w:tcPr>
+            <w:tcW w:type="dxa" w:w="3331"/>
+            <w:vAlign w:val="center"/>
+            <w:tcMar>
+              <w:top w:w="90" w:type="dxa"/>
+              <w:start w:w="100" w:type="dxa"/>
+              <w:bottom w:w="90" w:type="dxa"/>
+              <w:end w:w="100" w:type="dxa"/>
+            </w:tcMar>
+          </w:tcPr>
+          <w:p>
+            <w:pPr>
+              <w:spacing w:after="0"/>
+            </w:pPr>
+            <w:r>
+              <w:rPr>
+                <w:rFonts w:ascii="Heiti SC" w:hAnsi="Heiti SC" w:eastAsia="Heiti SC" w:cs="Heiti SC" w:hint="eastAsia"/>
+                <w:sz w:val="18"/>
+              </w:rPr>
+              <w:t>授权最终裁决</w:t>
+            </w:r>
+          </w:p>
+        </w:tc>
+        <w:tc>
+          <w:tcPr>
+            <w:tcW w:type="dxa" w:w="3331"/>
+            <w:vAlign w:val="center"/>
+            <w:tcMar>
+              <w:top w:w="90" w:type="dxa"/>
+              <w:start w:w="100" w:type="dxa"/>
+              <w:bottom w:w="90" w:type="dxa"/>
+              <w:end w:w="100" w:type="dxa"/>
+            </w:tcMar>
+          </w:tcPr>
+          <w:p>
+            <w:pPr>
+              <w:spacing w:after="0"/>
+            </w:pPr>
+            <w:r>
+              <w:rPr>
+                <w:rFonts w:ascii="Heiti SC" w:hAnsi="Heiti SC" w:eastAsia="Heiti SC" w:cs="Heiti SC" w:hint="eastAsia"/>
+                <w:sz w:val="18"/>
+              </w:rPr>
+              <w:t>不应只靠消息层</w:t>
+            </w:r>
+          </w:p>
+        </w:tc>
+        <w:tc>
+          <w:tcPr>
+            <w:tcW w:type="dxa" w:w="3331"/>
+            <w:vAlign w:val="center"/>
+            <w:tcMar>
+              <w:top w:w="90" w:type="dxa"/>
+              <w:start w:w="100" w:type="dxa"/>
+              <w:bottom w:w="90" w:type="dxa"/>
+              <w:end w:w="100" w:type="dxa"/>
+            </w:tcMar>
+          </w:tcPr>
+          <w:p>
+            <w:pPr>
+              <w:spacing w:after="0"/>
+            </w:pPr>
+            <w:r>
+              <w:rPr>
+                <w:rFonts w:ascii="Heiti SC" w:hAnsi="Heiti SC" w:eastAsia="Heiti SC" w:cs="Heiti SC" w:hint="eastAsia"/>
+                <w:sz w:val="18"/>
+              </w:rPr>
+              <w:t>Policy Service</w:t>
+            </w:r>
+          </w:p>
+        </w:tc>
+      </w:tr>
+      <w:tr>
+        <w:tc>
+          <w:tcPr>
+            <w:tcW w:type="dxa" w:w="3331"/>
+            <w:vAlign w:val="center"/>
+            <w:tcMar>
+              <w:top w:w="90" w:type="dxa"/>
+              <w:start w:w="100" w:type="dxa"/>
+              <w:bottom w:w="90" w:type="dxa"/>
+              <w:end w:w="100" w:type="dxa"/>
+            </w:tcMar>
+          </w:tcPr>
+          <w:p>
+            <w:pPr>
+              <w:spacing w:after="0"/>
+            </w:pPr>
+            <w:r>
+              <w:rPr>
+                <w:rFonts w:ascii="Heiti SC" w:hAnsi="Heiti SC" w:eastAsia="Heiti SC" w:cs="Heiti SC" w:hint="eastAsia"/>
+                <w:sz w:val="18"/>
+              </w:rPr>
+              <w:t>原始数据访问</w:t>
+            </w:r>
+          </w:p>
+        </w:tc>
+        <w:tc>
+          <w:tcPr>
+            <w:tcW w:type="dxa" w:w="3331"/>
+            <w:vAlign w:val="center"/>
+            <w:tcMar>
+              <w:top w:w="90" w:type="dxa"/>
+              <w:start w:w="100" w:type="dxa"/>
+              <w:bottom w:w="90" w:type="dxa"/>
+              <w:end w:w="100" w:type="dxa"/>
+            </w:tcMar>
+          </w:tcPr>
+          <w:p>
+            <w:pPr>
+              <w:spacing w:after="0"/>
+            </w:pPr>
+            <w:r>
+              <w:rPr>
+                <w:rFonts w:ascii="Heiti SC" w:hAnsi="Heiti SC" w:eastAsia="Heiti SC" w:cs="Heiti SC" w:hint="eastAsia"/>
+                <w:sz w:val="18"/>
+              </w:rPr>
+              <w:t>不适合</w:t>
+            </w:r>
+          </w:p>
+        </w:tc>
+        <w:tc>
+          <w:tcPr>
+            <w:tcW w:type="dxa" w:w="3331"/>
+            <w:vAlign w:val="center"/>
+            <w:tcMar>
+              <w:top w:w="90" w:type="dxa"/>
+              <w:start w:w="100" w:type="dxa"/>
+              <w:bottom w:w="90" w:type="dxa"/>
+              <w:end w:w="100" w:type="dxa"/>
+            </w:tcMar>
+          </w:tcPr>
+          <w:p>
+            <w:pPr>
+              <w:spacing w:after="0"/>
+            </w:pPr>
+            <w:r>
+              <w:rPr>
+                <w:rFonts w:ascii="Heiti SC" w:hAnsi="Heiti SC" w:eastAsia="Heiti SC" w:cs="Heiti SC" w:hint="eastAsia"/>
+                <w:sz w:val="18"/>
+              </w:rPr>
+              <w:t>Provider Runtime 内部</w:t>
+            </w:r>
+          </w:p>
+        </w:tc>
+      </w:tr>
+      <w:tr>
+        <w:tc>
+          <w:tcPr>
+            <w:tcW w:type="dxa" w:w="3331"/>
+            <w:vAlign w:val="center"/>
+            <w:tcMar>
+              <w:top w:w="90" w:type="dxa"/>
+              <w:start w:w="100" w:type="dxa"/>
+              <w:bottom w:w="90" w:type="dxa"/>
+              <w:end w:w="100" w:type="dxa"/>
+            </w:tcMar>
+          </w:tcPr>
+          <w:p>
+            <w:pPr>
+              <w:spacing w:after="0"/>
+            </w:pPr>
+            <w:r>
+              <w:rPr>
+                <w:rFonts w:ascii="Heiti SC" w:hAnsi="Heiti SC" w:eastAsia="Heiti SC" w:cs="Heiti SC" w:hint="eastAsia"/>
+                <w:sz w:val="18"/>
+              </w:rPr>
+              <w:t>Receipt 签发</w:t>
+            </w:r>
+          </w:p>
+        </w:tc>
+        <w:tc>
+          <w:tcPr>
+            <w:tcW w:type="dxa" w:w="3331"/>
+            <w:vAlign w:val="center"/>
+            <w:tcMar>
+              <w:top w:w="90" w:type="dxa"/>
+              <w:start w:w="100" w:type="dxa"/>
+              <w:bottom w:w="90" w:type="dxa"/>
+              <w:end w:w="100" w:type="dxa"/>
+            </w:tcMar>
+          </w:tcPr>
+          <w:p>
+            <w:pPr>
+              <w:spacing w:after="0"/>
+            </w:pPr>
+            <w:r>
+              <w:rPr>
+                <w:rFonts w:ascii="Heiti SC" w:hAnsi="Heiti SC" w:eastAsia="Heiti SC" w:cs="Heiti SC" w:hint="eastAsia"/>
+                <w:sz w:val="18"/>
+              </w:rPr>
+              <w:t>不适合替代</w:t>
+            </w:r>
+          </w:p>
+        </w:tc>
+        <w:tc>
+          <w:tcPr>
+            <w:tcW w:type="dxa" w:w="3331"/>
+            <w:vAlign w:val="center"/>
+            <w:tcMar>
+              <w:top w:w="90" w:type="dxa"/>
+              <w:start w:w="100" w:type="dxa"/>
+              <w:bottom w:w="90" w:type="dxa"/>
+              <w:end w:w="100" w:type="dxa"/>
+            </w:tcMar>
+          </w:tcPr>
+          <w:p>
+            <w:pPr>
+              <w:spacing w:after="0"/>
+            </w:pPr>
+            <w:r>
+              <w:rPr>
+                <w:rFonts w:ascii="Heiti SC" w:hAnsi="Heiti SC" w:eastAsia="Heiti SC" w:cs="Heiti SC" w:hint="eastAsia"/>
+                <w:sz w:val="18"/>
+              </w:rPr>
+              <w:t>Audit Service / Runtime 私钥</w:t>
+            </w:r>
+          </w:p>
+        </w:tc>
+      </w:tr>
+      <w:tr>
+        <w:tc>
+          <w:tcPr>
+            <w:tcW w:type="dxa" w:w="3331"/>
+            <w:vAlign w:val="center"/>
+            <w:tcMar>
+              <w:top w:w="90" w:type="dxa"/>
+              <w:start w:w="100" w:type="dxa"/>
+              <w:bottom w:w="90" w:type="dxa"/>
+              <w:end w:w="100" w:type="dxa"/>
+            </w:tcMar>
+          </w:tcPr>
+          <w:p>
+            <w:pPr>
+              <w:spacing w:after="0"/>
+            </w:pPr>
+            <w:r>
+              <w:rPr>
+                <w:rFonts w:ascii="Heiti SC" w:hAnsi="Heiti SC" w:eastAsia="Heiti SC" w:cs="Heiti SC" w:hint="eastAsia"/>
+                <w:sz w:val="18"/>
+              </w:rPr>
+              <w:t>数据空间强制执行</w:t>
+            </w:r>
+          </w:p>
+        </w:tc>
+        <w:tc>
+          <w:tcPr>
+            <w:tcW w:type="dxa" w:w="3331"/>
+            <w:vAlign w:val="center"/>
+            <w:tcMar>
+              <w:top w:w="90" w:type="dxa"/>
+              <w:start w:w="100" w:type="dxa"/>
+              <w:bottom w:w="90" w:type="dxa"/>
+              <w:end w:w="100" w:type="dxa"/>
+            </w:tcMar>
+          </w:tcPr>
+          <w:p>
+            <w:pPr>
+              <w:spacing w:after="0"/>
+            </w:pPr>
+            <w:r>
+              <w:rPr>
+                <w:rFonts w:ascii="Heiti SC" w:hAnsi="Heiti SC" w:eastAsia="Heiti SC" w:cs="Heiti SC" w:hint="eastAsia"/>
+                <w:sz w:val="18"/>
+              </w:rPr>
+              <w:t>不适合单独承担</w:t>
+            </w:r>
+          </w:p>
+        </w:tc>
+        <w:tc>
+          <w:tcPr>
+            <w:tcW w:type="dxa" w:w="3331"/>
+            <w:vAlign w:val="center"/>
+            <w:tcMar>
+              <w:top w:w="90" w:type="dxa"/>
+              <w:start w:w="100" w:type="dxa"/>
+              <w:bottom w:w="90" w:type="dxa"/>
+              <w:end w:w="100" w:type="dxa"/>
+            </w:tcMar>
+          </w:tcPr>
+          <w:p>
+            <w:pPr>
+              <w:spacing w:after="0"/>
+            </w:pPr>
+            <w:r>
+              <w:rPr>
+                <w:rFonts w:ascii="Heiti SC" w:hAnsi="Heiti SC" w:eastAsia="Heiti SC" w:cs="Heiti SC" w:hint="eastAsia"/>
+                <w:sz w:val="18"/>
+              </w:rPr>
+              <w:t>Trusted Data Space Gateway</w:t>
+            </w:r>
+          </w:p>
+        </w:tc>
+      </w:tr>
+    </w:tbl>
+    <w:p/>
+    <w:p>
+      <w:r>
+        <w:rPr>
+          <w:rFonts w:ascii="Heiti SC" w:hAnsi="Heiti SC" w:eastAsia="Heiti SC" w:cs="Heiti SC" w:hint="eastAsia"/>
+          <w:b w:val="0"/>
+        </w:rPr>
+        <w:t>因此，最稳妥的组合方式是：</w:t>
+      </w:r>
+    </w:p>
+    <w:tbl>
+      <w:tblPr>
+        <w:tblW w:type="auto" w:w="0"/>
+        <w:jc w:val="left"/>
+        <w:tblLayout w:type="autofit"/>
+        <w:tblLook w:firstColumn="1" w:firstRow="1" w:lastColumn="0" w:lastRow="0" w:noHBand="0" w:noVBand="1" w:val="04A0"/>
+      </w:tblPr>
+      <w:tblGrid>
+        <w:gridCol w:w="9994"/>
+      </w:tblGrid>
+      <w:tr>
+        <w:tc>
+          <w:tcPr>
+            <w:tcW w:type="dxa" w:w="9994"/>
+            <w:shd w:fill="F6F8FA"/>
+            <w:tcMar>
+              <w:top w:w="110" w:type="dxa"/>
+              <w:start w:w="120" w:type="dxa"/>
+              <w:bottom w:w="110" w:type="dxa"/>
+              <w:end w:w="120" w:type="dxa"/>
+            </w:tcMar>
+          </w:tcPr>
+          <w:p>
+            <w:pPr>
+              <w:spacing w:after="0"/>
+            </w:pPr>
+            <w:r>
+              <w:rPr>
+                <w:rFonts w:ascii="Heiti SC" w:hAnsi="Heiti SC" w:eastAsia="Heiti SC" w:cs="Heiti SC" w:hint="eastAsia"/>
+                <w:color w:val="111827"/>
+                <w:sz w:val="16"/>
+              </w:rPr>
+              <w:t>awiki.ai 负责 Agent 网络协作；</w:t>
+              <w:br/>
+              <w:t>OSDK 负责产品调用体验；</w:t>
+              <w:br/>
+              <w:t>Gateway/Policy/Runtime/Receipt 负责可信执行闭环。</w:t>
+            </w:r>
+          </w:p>
+        </w:tc>
+      </w:tr>
+    </w:tbl>
+    <w:p/>
+    <w:p>
+      <w:pPr>
+        <w:pStyle w:val="Heading3"/>
+      </w:pPr>
+      <w:r>
+        <w:rPr>
+          <w:rFonts w:ascii="Heiti SC" w:hAnsi="Heiti SC" w:eastAsia="Heiti SC" w:cs="Heiti SC" w:hint="eastAsia"/>
+        </w:rPr>
+        <w:t>5.6 Demo 应该新增的 awiki.ai 视角</w:t>
+      </w:r>
+    </w:p>
+    <w:p>
+      <w:r>
+        <w:rPr>
+          <w:rFonts w:ascii="Heiti SC" w:hAnsi="Heiti SC" w:eastAsia="Heiti SC" w:cs="Heiti SC" w:hint="eastAsia"/>
+          <w:b w:val="0"/>
+        </w:rPr>
+        <w:t>为了让 awiki.ai 的价值更明显，Demo Console 可以新增一个“Agent 可信网络 / 数据服务数字员工部”视角，展示三条泳道：</w:t>
+      </w:r>
+    </w:p>
+    <w:tbl>
+      <w:tblPr>
+        <w:tblStyle w:val="TableGrid"/>
+        <w:tblW w:type="auto" w:w="0"/>
+        <w:jc w:val="center"/>
+        <w:tblLayout w:type="autofit"/>
+        <w:tblLook w:firstColumn="1" w:firstRow="1" w:lastColumn="0" w:lastRow="0" w:noHBand="0" w:noVBand="1" w:val="04A0"/>
+      </w:tblPr>
+      <w:tblGrid>
+        <w:gridCol w:w="4997"/>
+        <w:gridCol w:w="4997"/>
+      </w:tblGrid>
+      <w:tr>
+        <w:tc>
+          <w:tcPr>
+            <w:tcW w:type="dxa" w:w="4997"/>
+            <w:vAlign w:val="center"/>
+            <w:tcMar>
+              <w:top w:w="90" w:type="dxa"/>
+              <w:start w:w="100" w:type="dxa"/>
+              <w:bottom w:w="90" w:type="dxa"/>
+              <w:end w:w="100" w:type="dxa"/>
+            </w:tcMar>
+            <w:shd w:fill="EAF2FF"/>
+          </w:tcPr>
+          <w:p>
+            <w:pPr>
+              <w:spacing w:after="0"/>
+            </w:pPr>
+            <w:r>
+              <w:rPr>
+                <w:rFonts w:ascii="Heiti SC" w:hAnsi="Heiti SC" w:eastAsia="Heiti SC" w:cs="Heiti SC" w:hint="eastAsia"/>
+                <w:b/>
+                <w:color w:val="1E40AF"/>
+                <w:sz w:val="18"/>
+              </w:rPr>
+              <w:t>泳道</w:t>
+            </w:r>
+          </w:p>
+        </w:tc>
+        <w:tc>
+          <w:tcPr>
+            <w:tcW w:type="dxa" w:w="4997"/>
+            <w:vAlign w:val="center"/>
+            <w:tcMar>
+              <w:top w:w="90" w:type="dxa"/>
+              <w:start w:w="100" w:type="dxa"/>
+              <w:bottom w:w="90" w:type="dxa"/>
+              <w:end w:w="100" w:type="dxa"/>
+            </w:tcMar>
+            <w:shd w:fill="EAF2FF"/>
+          </w:tcPr>
+          <w:p>
+            <w:pPr>
+              <w:spacing w:after="0"/>
+            </w:pPr>
+            <w:r>
+              <w:rPr>
+                <w:rFonts w:ascii="Heiti SC" w:hAnsi="Heiti SC" w:eastAsia="Heiti SC" w:cs="Heiti SC" w:hint="eastAsia"/>
+                <w:b/>
+                <w:color w:val="1E40AF"/>
+                <w:sz w:val="18"/>
+              </w:rPr>
+              <w:t>展示内容</w:t>
+            </w:r>
+          </w:p>
+        </w:tc>
+      </w:tr>
+      <w:tr>
+        <w:tc>
+          <w:tcPr>
+            <w:tcW w:type="dxa" w:w="4997"/>
+            <w:vAlign w:val="center"/>
+            <w:tcMar>
+              <w:top w:w="90" w:type="dxa"/>
+              <w:start w:w="100" w:type="dxa"/>
+              <w:bottom w:w="90" w:type="dxa"/>
+              <w:end w:w="100" w:type="dxa"/>
+            </w:tcMar>
+          </w:tcPr>
+          <w:p>
+            <w:pPr>
+              <w:spacing w:after="0"/>
+            </w:pPr>
+            <w:r>
+              <w:rPr>
+                <w:rFonts w:ascii="Heiti SC" w:hAnsi="Heiti SC" w:eastAsia="Heiti SC" w:cs="Heiti SC" w:hint="eastAsia"/>
+                <w:sz w:val="18"/>
+              </w:rPr>
+              <w:t>买方 Agent</w:t>
+            </w:r>
+          </w:p>
+        </w:tc>
+        <w:tc>
+          <w:tcPr>
+            <w:tcW w:type="dxa" w:w="4997"/>
+            <w:vAlign w:val="center"/>
+            <w:tcMar>
+              <w:top w:w="90" w:type="dxa"/>
+              <w:start w:w="100" w:type="dxa"/>
+              <w:bottom w:w="90" w:type="dxa"/>
+              <w:end w:w="100" w:type="dxa"/>
+            </w:tcMar>
+          </w:tcPr>
+          <w:p>
+            <w:pPr>
+              <w:spacing w:after="0"/>
+            </w:pPr>
+            <w:r>
+              <w:rPr>
+                <w:rFonts w:ascii="Heiti SC" w:hAnsi="Heiti SC" w:eastAsia="Heiti SC" w:cs="Heiti SC" w:hint="eastAsia"/>
+                <w:sz w:val="18"/>
+              </w:rPr>
+              <w:t>业务目标、产品发现、授权申请、OSDK 调用、Receipt 验证</w:t>
+            </w:r>
+          </w:p>
+        </w:tc>
+      </w:tr>
+      <w:tr>
+        <w:tc>
+          <w:tcPr>
+            <w:tcW w:type="dxa" w:w="4997"/>
+            <w:vAlign w:val="center"/>
+            <w:tcMar>
+              <w:top w:w="90" w:type="dxa"/>
+              <w:start w:w="100" w:type="dxa"/>
+              <w:bottom w:w="90" w:type="dxa"/>
+              <w:end w:w="100" w:type="dxa"/>
+            </w:tcMar>
+          </w:tcPr>
+          <w:p>
+            <w:pPr>
+              <w:spacing w:after="0"/>
+            </w:pPr>
+            <w:r>
+              <w:rPr>
+                <w:rFonts w:ascii="Heiti SC" w:hAnsi="Heiti SC" w:eastAsia="Heiti SC" w:cs="Heiti SC" w:hint="eastAsia"/>
+                <w:sz w:val="18"/>
+              </w:rPr>
+              <w:t>服务方前台 Agent</w:t>
+            </w:r>
+          </w:p>
+        </w:tc>
+        <w:tc>
+          <w:tcPr>
+            <w:tcW w:type="dxa" w:w="4997"/>
+            <w:vAlign w:val="center"/>
+            <w:tcMar>
+              <w:top w:w="90" w:type="dxa"/>
+              <w:start w:w="100" w:type="dxa"/>
+              <w:bottom w:w="90" w:type="dxa"/>
+              <w:end w:w="100" w:type="dxa"/>
+            </w:tcMar>
+          </w:tcPr>
+          <w:p>
+            <w:pPr>
+              <w:spacing w:after="0"/>
+            </w:pPr>
+            <w:r>
+              <w:rPr>
+                <w:rFonts w:ascii="Heiti SC" w:hAnsi="Heiti SC" w:eastAsia="Heiti SC" w:cs="Heiti SC" w:hint="eastAsia"/>
+                <w:sz w:val="18"/>
+              </w:rPr>
+              <w:t>产品解释、报价/用途确认、授权协同、进度通知、结果交付</w:t>
+            </w:r>
+          </w:p>
+        </w:tc>
+      </w:tr>
+      <w:tr>
+        <w:tc>
+          <w:tcPr>
+            <w:tcW w:type="dxa" w:w="4997"/>
+            <w:vAlign w:val="center"/>
+            <w:tcMar>
+              <w:top w:w="90" w:type="dxa"/>
+              <w:start w:w="100" w:type="dxa"/>
+              <w:bottom w:w="90" w:type="dxa"/>
+              <w:end w:w="100" w:type="dxa"/>
+            </w:tcMar>
+          </w:tcPr>
+          <w:p>
+            <w:pPr>
+              <w:spacing w:after="0"/>
+            </w:pPr>
+            <w:r>
+              <w:rPr>
+                <w:rFonts w:ascii="Heiti SC" w:hAnsi="Heiti SC" w:eastAsia="Heiti SC" w:cs="Heiti SC" w:hint="eastAsia"/>
+                <w:sz w:val="18"/>
+              </w:rPr>
+              <w:t>数据提供方内部数字员工</w:t>
+            </w:r>
+          </w:p>
+        </w:tc>
+        <w:tc>
+          <w:tcPr>
+            <w:tcW w:type="dxa" w:w="4997"/>
+            <w:vAlign w:val="center"/>
+            <w:tcMar>
+              <w:top w:w="90" w:type="dxa"/>
+              <w:start w:w="100" w:type="dxa"/>
+              <w:bottom w:w="90" w:type="dxa"/>
+              <w:end w:w="100" w:type="dxa"/>
+            </w:tcMar>
+          </w:tcPr>
+          <w:p>
+            <w:pPr>
+              <w:spacing w:after="0"/>
+            </w:pPr>
+            <w:r>
+              <w:rPr>
+                <w:rFonts w:ascii="Heiti SC" w:hAnsi="Heiti SC" w:eastAsia="Heiti SC" w:cs="Heiti SC" w:hint="eastAsia"/>
+                <w:sz w:val="18"/>
+              </w:rPr>
+              <w:t>本体建模、分类分级、质量检查、产品编译、Runtime 调度、凭证复核</w:t>
+            </w:r>
+          </w:p>
+        </w:tc>
+      </w:tr>
+    </w:tbl>
+    <w:p/>
+    <w:p>
+      <w:r>
+        <w:rPr>
+          <w:rFonts w:ascii="Heiti SC" w:hAnsi="Heiti SC" w:eastAsia="Heiti SC" w:cs="Heiti SC" w:hint="eastAsia"/>
+          <w:b w:val="0"/>
+        </w:rPr>
+        <w:t>用电征信场景可以这样演示：</w:t>
+      </w:r>
+    </w:p>
+    <w:p>
+      <w:pPr>
+        <w:spacing w:after="40"/>
+      </w:pPr>
+      <w:r>
+        <w:rPr>
+          <w:rFonts w:ascii="Heiti SC" w:hAnsi="Heiti SC" w:eastAsia="Heiti SC" w:cs="Heiti SC" w:hint="eastAsia"/>
+          <w:b/>
+          <w:color w:val="475569"/>
+          <w:sz w:val="18"/>
+        </w:rPr>
+        <w:t>Mermaid 源图（Markdown 中可直接渲染）</w:t>
+      </w:r>
+    </w:p>
+    <w:tbl>
+      <w:tblPr>
+        <w:tblW w:type="auto" w:w="0"/>
+        <w:jc w:val="left"/>
+        <w:tblLayout w:type="autofit"/>
+        <w:tblLook w:firstColumn="1" w:firstRow="1" w:lastColumn="0" w:lastRow="0" w:noHBand="0" w:noVBand="1" w:val="04A0"/>
+      </w:tblPr>
+      <w:tblGrid>
+        <w:gridCol w:w="9994"/>
+      </w:tblGrid>
+      <w:tr>
+        <w:tc>
+          <w:tcPr>
+            <w:tcW w:type="dxa" w:w="9994"/>
+            <w:shd w:fill="F6F8FA"/>
+            <w:tcMar>
+              <w:top w:w="110" w:type="dxa"/>
+              <w:start w:w="120" w:type="dxa"/>
+              <w:bottom w:w="110" w:type="dxa"/>
+              <w:end w:w="120" w:type="dxa"/>
+            </w:tcMar>
+          </w:tcPr>
+          <w:p>
+            <w:pPr>
+              <w:spacing w:after="0"/>
+            </w:pPr>
+            <w:r>
+              <w:rPr>
+                <w:rFonts w:ascii="Heiti SC" w:hAnsi="Heiti SC" w:eastAsia="Heiti SC" w:cs="Heiti SC" w:hint="eastAsia"/>
+                <w:color w:val="111827"/>
+                <w:sz w:val="16"/>
+              </w:rPr>
+              <w:t>sequenceDiagram</w:t>
+              <w:br/>
+              <w:t xml:space="preserve">    participant B as 买方 Bank Agent</w:t>
+              <w:br/>
+              <w:t xml:space="preserve">    participant A as awiki.ai Agent Network</w:t>
+              <w:br/>
+              <w:t xml:space="preserve">    participant S as 服务方 Service Agent</w:t>
+              <w:br/>
+              <w:t xml:space="preserve">    participant P as Policy Agent</w:t>
+              <w:br/>
+              <w:t xml:space="preserve">    participant D as 数据产品数字员工</w:t>
+              <w:br/>
+              <w:t xml:space="preserve">    participant R as Provider Runtime</w:t>
+              <w:br/>
+              <w:t xml:space="preserve">    participant V as Receipt Verifier</w:t>
+              <w:br/>
+              <w:br/>
+              <w:t xml:space="preserve">    B-&gt;&gt;A: 发现企业用电征信数据服务</w:t>
+              <w:br/>
+              <w:t xml:space="preserve">    A-&gt;&gt;S: 路由到 Provider Service Agent</w:t>
+              <w:br/>
+              <w:t xml:space="preserve">    S-&gt;&gt;B: 返回产品说明、OSDK/MCP、用途要求</w:t>
+              <w:br/>
+              <w:t xml:space="preserve">    B-&gt;&gt;S: 申请授权</w:t>
+              <w:br/>
+              <w:t xml:space="preserve">    S-&gt;&gt;P: 校验用途、主体、期限、配额</w:t>
+              <w:br/>
+              <w:t xml:space="preserve">    P-&gt;&gt;S: 签发 entitlement_id</w:t>
+              <w:br/>
+              <w:t xml:space="preserve">    B-&gt;&gt;R: 通过 OSDK/Gateway 调用产品动作</w:t>
+              <w:br/>
+              <w:t xml:space="preserve">    R-&gt;&gt;D: 本体映射、质量检查、特征计算</w:t>
+              <w:br/>
+              <w:t xml:space="preserve">    R-&gt;&gt;B: 返回 CreditResult</w:t>
+              <w:br/>
+              <w:t xml:space="preserve">    R-&gt;&gt;V: 签发并登记 Receipt</w:t>
+              <w:br/>
+              <w:t xml:space="preserve">    V-&gt;&gt;B: 异步通知凭证验证结果</w:t>
+            </w:r>
+          </w:p>
+        </w:tc>
+      </w:tr>
+    </w:tbl>
+    <w:p/>
+    <w:p>
+      <w:r>
+        <w:rPr>
+          <w:rFonts w:ascii="Heiti SC" w:hAnsi="Heiti SC" w:eastAsia="Heiti SC" w:cs="Heiti SC" w:hint="eastAsia"/>
+          <w:b w:val="0"/>
+        </w:rPr>
+        <w:t>这一视角会让“数据交易服务的数字员工部门”变得具体：它不是一个管理概念，而是一组可参与生产、授权、交付和复核的 Agent。</w:t>
+      </w:r>
+    </w:p>
+    <w:p>
+      <w:pPr>
+        <w:pStyle w:val="Heading2"/>
+      </w:pPr>
+      <w:r>
+        <w:rPr>
+          <w:rFonts w:ascii="Heiti SC" w:hAnsi="Heiti SC" w:eastAsia="Heiti SC" w:cs="Heiti SC" w:hint="eastAsia"/>
+        </w:rPr>
+        <w:t>6. 场景设计</w:t>
       </w:r>
     </w:p>
     <w:p>
@@ -5205,7 +8176,7 @@
         <w:rPr>
           <w:rFonts w:ascii="Heiti SC" w:hAnsi="Heiti SC" w:eastAsia="Heiti SC" w:cs="Heiti SC" w:hint="eastAsia"/>
         </w:rPr>
-        <w:t>5.1 场景一：企业用电征信可信数据产品</w:t>
+        <w:t>6.1 场景一：企业用电征信可信数据产品</w:t>
       </w:r>
     </w:p>
     <w:p>
@@ -5444,7 +8415,7 @@
         <w:rPr>
           <w:rFonts w:ascii="Heiti SC" w:hAnsi="Heiti SC" w:eastAsia="Heiti SC" w:cs="Heiti SC" w:hint="eastAsia"/>
         </w:rPr>
-        <w:t>5.2 场景二：长春城市生命线开挖风险产品</w:t>
+        <w:t>6.2 场景二：长春城市生命线开挖风险产品</w:t>
       </w:r>
     </w:p>
     <w:p>
@@ -5625,7 +8596,7 @@
         <w:rPr>
           <w:rFonts w:ascii="Heiti SC" w:hAnsi="Heiti SC" w:eastAsia="Heiti SC" w:cs="Heiti SC" w:hint="eastAsia"/>
         </w:rPr>
-        <w:t>5.3 场景三：动态本体运维</w:t>
+        <w:t>6.3 场景三：动态本体运维</w:t>
       </w:r>
     </w:p>
     <w:p>
@@ -5753,7 +8724,7 @@
         <w:rPr>
           <w:rFonts w:ascii="Heiti SC" w:hAnsi="Heiti SC" w:eastAsia="Heiti SC" w:cs="Heiti SC" w:hint="eastAsia"/>
         </w:rPr>
-        <w:t>6. 基于架构的 Demo 演示路径</w:t>
+        <w:t>7. 基于架构的 Demo 演示路径</w:t>
       </w:r>
     </w:p>
     <w:p>
@@ -5773,7 +8744,7 @@
         <w:rPr>
           <w:rFonts w:ascii="Heiti SC" w:hAnsi="Heiti SC" w:eastAsia="Heiti SC" w:cs="Heiti SC" w:hint="eastAsia"/>
         </w:rPr>
-        <w:t>6.1 Demo 开场：先讲目标和问题</w:t>
+        <w:t>7.1 Demo 开场：先讲目标和问题</w:t>
       </w:r>
     </w:p>
     <w:p>
@@ -6214,7 +9185,7 @@
         <w:rPr>
           <w:rFonts w:ascii="Heiti SC" w:hAnsi="Heiti SC" w:eastAsia="Heiti SC" w:cs="Heiti SC" w:hint="eastAsia"/>
         </w:rPr>
-        <w:t>6.2 用电征信 Demo：从企业查询到可信结果</w:t>
+        <w:t>7.2 用电征信 Demo：从企业查询到可信结果</w:t>
       </w:r>
     </w:p>
     <w:p>
@@ -7026,7 +9997,7 @@
         <w:rPr>
           <w:rFonts w:ascii="Heiti SC" w:hAnsi="Heiti SC" w:eastAsia="Heiti SC" w:cs="Heiti SC" w:hint="eastAsia"/>
         </w:rPr>
-        <w:t>6.3 长春开挖风险 Demo：敏感坐标只参与计算不输出</w:t>
+        <w:t>7.3 长春开挖风险 Demo：敏感坐标只参与计算不输出</w:t>
       </w:r>
     </w:p>
     <w:p>
@@ -7569,7 +10540,7 @@
         <w:rPr>
           <w:rFonts w:ascii="Heiti SC" w:hAnsi="Heiti SC" w:eastAsia="Heiti SC" w:cs="Heiti SC" w:hint="eastAsia"/>
         </w:rPr>
-        <w:t>6.4 动态本体运维 Demo：证明本体真的会影响接口</w:t>
+        <w:t>7.4 动态本体运维 Demo：证明本体真的会影响接口</w:t>
       </w:r>
     </w:p>
     <w:p>
@@ -7782,7 +10753,7 @@
         <w:rPr>
           <w:rFonts w:ascii="Heiti SC" w:hAnsi="Heiti SC" w:eastAsia="Heiti SC" w:cs="Heiti SC" w:hint="eastAsia"/>
         </w:rPr>
-        <w:t>6.5 部署视图 Demo：说明 OSDK workload 和可信网关</w:t>
+        <w:t>7.5 部署视图 Demo：说明 OSDK workload 和可信网关</w:t>
       </w:r>
     </w:p>
     <w:p>
@@ -8109,7 +11080,7 @@
         <w:rPr>
           <w:rFonts w:ascii="Heiti SC" w:hAnsi="Heiti SC" w:eastAsia="Heiti SC" w:cs="Heiti SC" w:hint="eastAsia"/>
         </w:rPr>
-        <w:t>7. Execution Receipt 如何解释</w:t>
+        <w:t>8. Execution Receipt 如何解释</w:t>
       </w:r>
     </w:p>
     <w:p>
@@ -8321,7 +11292,7 @@
         <w:rPr>
           <w:rFonts w:ascii="Heiti SC" w:hAnsi="Heiti SC" w:eastAsia="Heiti SC" w:cs="Heiti SC" w:hint="eastAsia"/>
         </w:rPr>
-        <w:t>8. 实施门槛评估</w:t>
+        <w:t>9. 实施门槛评估</w:t>
       </w:r>
     </w:p>
     <w:p>
@@ -8341,7 +11312,7 @@
         <w:rPr>
           <w:rFonts w:ascii="Heiti SC" w:hAnsi="Heiti SC" w:eastAsia="Heiti SC" w:cs="Heiti SC" w:hint="eastAsia"/>
         </w:rPr>
-        <w:t>8.1 难度较低的部分</w:t>
+        <w:t>9.1 难度较低的部分</w:t>
       </w:r>
     </w:p>
     <w:tbl>
@@ -8746,7 +11717,7 @@
         <w:rPr>
           <w:rFonts w:ascii="Heiti SC" w:hAnsi="Heiti SC" w:eastAsia="Heiti SC" w:cs="Heiti SC" w:hint="eastAsia"/>
         </w:rPr>
-        <w:t>8.2 真正困难的部分</w:t>
+        <w:t>9.2 真正困难的部分</w:t>
       </w:r>
     </w:p>
     <w:tbl>
@@ -9497,7 +12468,7 @@
         <w:rPr>
           <w:rFonts w:ascii="Heiti SC" w:hAnsi="Heiti SC" w:eastAsia="Heiti SC" w:cs="Heiti SC" w:hint="eastAsia"/>
         </w:rPr>
-        <w:t>9. 对外表达建议</w:t>
+        <w:t>10. 对外表达建议</w:t>
       </w:r>
     </w:p>
     <w:p>
@@ -9589,13 +12560,15 @@
                 <w:color w:val="111827"/>
                 <w:sz w:val="16"/>
               </w:rPr>
-              <w:t>我们把动态本体治理后的数据能力编译成可被 Agent 调用的数据产品接口。</w:t>
+              <w:t>awiki.ai 面向 Agent 时代重做可信数据服务网络。</w:t>
               <w:br/>
-              <w:t>客户或 Agent 像调用普通 SDK 一样调用产品动作；</w:t>
+              <w:t>买方 Agent 在网络中发现、申请和调用数据服务；</w:t>
               <w:br/>
-              <w:t>但这个 SDK 不能越权、不能查原始表、不能绕过授权。</w:t>
+              <w:t>服务方 Agent 和数据服务数字员工完成产品解释、授权协同、质检、编译、交付和复核；</w:t>
               <w:br/>
-              <w:t>实际计算在受控 Runtime 内完成，每次结果都有可验证凭证。</w:t>
+              <w:t>动态本体 OSDK 把数据能力变成可授权、可执行、可验证的数据产品；</w:t>
+              <w:br/>
+              <w:t>Runtime 在数据域内计算，Receipt 证明结果可信。</w:t>
             </w:r>
           </w:p>
         </w:tc>
@@ -9643,11 +12616,61 @@
                 <w:color w:val="111827"/>
                 <w:sz w:val="16"/>
               </w:rPr>
-              <w:t>像调 SDK 一样调数据产品；</w:t>
+              <w:t>用 Agent 网络重做数据交易：</w:t>
               <w:br/>
-              <w:t>像走数据空间一样受控流转；</w:t>
+              <w:t>不是交易数据文件，而是交易可授权、可执行、可验证的数据能力。</w:t>
+            </w:r>
+          </w:p>
+        </w:tc>
+      </w:tr>
+    </w:tbl>
+    <w:p/>
+    <w:p>
+      <w:r>
+        <w:rPr>
+          <w:rFonts w:ascii="Heiti SC" w:hAnsi="Heiti SC" w:eastAsia="Heiti SC" w:cs="Heiti SC" w:hint="eastAsia"/>
+          <w:b w:val="0"/>
+        </w:rPr>
+        <w:t>面向数据提供方的版本：</w:t>
+      </w:r>
+    </w:p>
+    <w:tbl>
+      <w:tblPr>
+        <w:tblW w:type="auto" w:w="0"/>
+        <w:jc w:val="left"/>
+        <w:tblLayout w:type="autofit"/>
+        <w:tblLook w:firstColumn="1" w:firstRow="1" w:lastColumn="0" w:lastRow="0" w:noHBand="0" w:noVBand="1" w:val="04A0"/>
+      </w:tblPr>
+      <w:tblGrid>
+        <w:gridCol w:w="9994"/>
+      </w:tblGrid>
+      <w:tr>
+        <w:tc>
+          <w:tcPr>
+            <w:tcW w:type="dxa" w:w="9994"/>
+            <w:shd w:fill="F6F8FA"/>
+            <w:tcMar>
+              <w:top w:w="110" w:type="dxa"/>
+              <w:start w:w="120" w:type="dxa"/>
+              <w:bottom w:w="110" w:type="dxa"/>
+              <w:end w:w="120" w:type="dxa"/>
+            </w:tcMar>
+          </w:tcPr>
+          <w:p>
+            <w:pPr>
+              <w:spacing w:after="0"/>
+            </w:pPr>
+            <w:r>
+              <w:rPr>
+                <w:rFonts w:ascii="Heiti SC" w:hAnsi="Heiti SC" w:eastAsia="Heiti SC" w:cs="Heiti SC" w:hint="eastAsia"/>
+                <w:color w:val="111827"/>
+                <w:sz w:val="16"/>
+              </w:rPr>
+              <w:t>awiki.ai 可以为数据提供方搭建一个数据交易服务数字员工部，</w:t>
               <w:br/>
-              <w:t>像验签一样验证结果可信。</w:t>
+              <w:t>帮助完成数据产品上架、授权运营、质量检查、OSDK 编译、异步交付和凭证复核；</w:t>
+              <w:br/>
+              <w:t>让没有完整数据产品团队的机构，也能低成本进入可信数据服务市场。</w:t>
             </w:r>
           </w:p>
         </w:tc>
@@ -10510,6 +13533,106 @@
                 <w:sz w:val="18"/>
               </w:rPr>
               <w:t>执行凭证，证明一次结果基于指定授权、应用、本体、产品和 Runtime 产生</w:t>
+            </w:r>
+          </w:p>
+        </w:tc>
+      </w:tr>
+      <w:tr>
+        <w:tc>
+          <w:tcPr>
+            <w:tcW w:type="dxa" w:w="4997"/>
+            <w:vAlign w:val="center"/>
+            <w:tcMar>
+              <w:top w:w="90" w:type="dxa"/>
+              <w:start w:w="100" w:type="dxa"/>
+              <w:bottom w:w="90" w:type="dxa"/>
+              <w:end w:w="100" w:type="dxa"/>
+            </w:tcMar>
+          </w:tcPr>
+          <w:p>
+            <w:pPr>
+              <w:spacing w:after="0"/>
+            </w:pPr>
+            <w:r>
+              <w:rPr>
+                <w:rFonts w:ascii="Heiti SC" w:hAnsi="Heiti SC" w:eastAsia="Heiti SC" w:cs="Heiti SC" w:hint="eastAsia"/>
+                <w:sz w:val="18"/>
+              </w:rPr>
+              <w:t>awiki.ai Agent Network</w:t>
+            </w:r>
+          </w:p>
+        </w:tc>
+        <w:tc>
+          <w:tcPr>
+            <w:tcW w:type="dxa" w:w="4997"/>
+            <w:vAlign w:val="center"/>
+            <w:tcMar>
+              <w:top w:w="90" w:type="dxa"/>
+              <w:start w:w="100" w:type="dxa"/>
+              <w:bottom w:w="90" w:type="dxa"/>
+              <w:end w:w="100" w:type="dxa"/>
+            </w:tcMar>
+          </w:tcPr>
+          <w:p>
+            <w:pPr>
+              <w:spacing w:after="0"/>
+            </w:pPr>
+            <w:r>
+              <w:rPr>
+                <w:rFonts w:ascii="Heiti SC" w:hAnsi="Heiti SC" w:eastAsia="Heiti SC" w:cs="Heiti SC" w:hint="eastAsia"/>
+                <w:sz w:val="18"/>
+              </w:rPr>
+              <w:t>面向 Agent 的身份、发现、消息协作和异步通知网络</w:t>
+            </w:r>
+          </w:p>
+        </w:tc>
+      </w:tr>
+      <w:tr>
+        <w:tc>
+          <w:tcPr>
+            <w:tcW w:type="dxa" w:w="4997"/>
+            <w:vAlign w:val="center"/>
+            <w:tcMar>
+              <w:top w:w="90" w:type="dxa"/>
+              <w:start w:w="100" w:type="dxa"/>
+              <w:bottom w:w="90" w:type="dxa"/>
+              <w:end w:w="100" w:type="dxa"/>
+            </w:tcMar>
+          </w:tcPr>
+          <w:p>
+            <w:pPr>
+              <w:spacing w:after="0"/>
+            </w:pPr>
+            <w:r>
+              <w:rPr>
+                <w:rFonts w:ascii="Heiti SC" w:hAnsi="Heiti SC" w:eastAsia="Heiti SC" w:cs="Heiti SC" w:hint="eastAsia"/>
+                <w:sz w:val="18"/>
+              </w:rPr>
+              <w:t>数据服务数字员工部</w:t>
+            </w:r>
+          </w:p>
+        </w:tc>
+        <w:tc>
+          <w:tcPr>
+            <w:tcW w:type="dxa" w:w="4997"/>
+            <w:vAlign w:val="center"/>
+            <w:tcMar>
+              <w:top w:w="90" w:type="dxa"/>
+              <w:start w:w="100" w:type="dxa"/>
+              <w:bottom w:w="90" w:type="dxa"/>
+              <w:end w:w="100" w:type="dxa"/>
+            </w:tcMar>
+          </w:tcPr>
+          <w:p>
+            <w:pPr>
+              <w:spacing w:after="0"/>
+            </w:pPr>
+            <w:r>
+              <w:rPr>
+                <w:rFonts w:ascii="Heiti SC" w:hAnsi="Heiti SC" w:eastAsia="Heiti SC" w:cs="Heiti SC" w:hint="eastAsia"/>
+                <w:sz w:val="18"/>
+              </w:rPr>
+              <w:t>数据提供方内部的一组 Agent，负责数据产品生产、授权运营、交付和复核</w:t>
             </w:r>
           </w:p>
         </w:tc>

</xml_diff>

<commit_message>
Clarify data ops agents and upstream ontology platforms
</commit_message>
<xml_diff>
--- a/docs/dynamic-ontology-osdk-demo-architecture-brief.docx
+++ b/docs/dynamic-ontology-osdk-demo-architecture-brief.docx
@@ -694,6 +694,106 @@
           </w:p>
         </w:tc>
       </w:tr>
+      <w:tr>
+        <w:tc>
+          <w:tcPr>
+            <w:tcW w:type="dxa" w:w="4997"/>
+            <w:vAlign w:val="center"/>
+            <w:tcMar>
+              <w:top w:w="90" w:type="dxa"/>
+              <w:start w:w="100" w:type="dxa"/>
+              <w:bottom w:w="90" w:type="dxa"/>
+              <w:end w:w="100" w:type="dxa"/>
+            </w:tcMar>
+          </w:tcPr>
+          <w:p>
+            <w:pPr>
+              <w:spacing w:after="0"/>
+            </w:pPr>
+            <w:r>
+              <w:rPr>
+                <w:rFonts w:ascii="Heiti SC" w:hAnsi="Heiti SC" w:eastAsia="Heiti SC" w:cs="Heiti SC" w:hint="eastAsia"/>
+                <w:sz w:val="18"/>
+              </w:rPr>
+              <w:t>数据运营 Agent</w:t>
+            </w:r>
+          </w:p>
+        </w:tc>
+        <w:tc>
+          <w:tcPr>
+            <w:tcW w:type="dxa" w:w="4997"/>
+            <w:vAlign w:val="center"/>
+            <w:tcMar>
+              <w:top w:w="90" w:type="dxa"/>
+              <w:start w:w="100" w:type="dxa"/>
+              <w:bottom w:w="90" w:type="dxa"/>
+              <w:end w:w="100" w:type="dxa"/>
+            </w:tcMar>
+          </w:tcPr>
+          <w:p>
+            <w:pPr>
+              <w:spacing w:after="0"/>
+            </w:pPr>
+            <w:r>
+              <w:rPr>
+                <w:rFonts w:ascii="Heiti SC" w:hAnsi="Heiti SC" w:eastAsia="Heiti SC" w:cs="Heiti SC" w:hint="eastAsia"/>
+                <w:sz w:val="18"/>
+              </w:rPr>
+              <w:t>数据提供方内部的技术型 Agent，能受控调用目录、数据平台、质量、编译、部署和审计工具，但关键动作需要人工确认</w:t>
+            </w:r>
+          </w:p>
+        </w:tc>
+      </w:tr>
+      <w:tr>
+        <w:tc>
+          <w:tcPr>
+            <w:tcW w:type="dxa" w:w="4997"/>
+            <w:vAlign w:val="center"/>
+            <w:tcMar>
+              <w:top w:w="90" w:type="dxa"/>
+              <w:start w:w="100" w:type="dxa"/>
+              <w:bottom w:w="90" w:type="dxa"/>
+              <w:end w:w="100" w:type="dxa"/>
+            </w:tcMar>
+          </w:tcPr>
+          <w:p>
+            <w:pPr>
+              <w:spacing w:after="0"/>
+            </w:pPr>
+            <w:r>
+              <w:rPr>
+                <w:rFonts w:ascii="Heiti SC" w:hAnsi="Heiti SC" w:eastAsia="Heiti SC" w:cs="Heiti SC" w:hint="eastAsia"/>
+                <w:sz w:val="18"/>
+              </w:rPr>
+              <w:t>OntoFlow / 动态本体平台</w:t>
+            </w:r>
+          </w:p>
+        </w:tc>
+        <w:tc>
+          <w:tcPr>
+            <w:tcW w:type="dxa" w:w="4997"/>
+            <w:vAlign w:val="center"/>
+            <w:tcMar>
+              <w:top w:w="90" w:type="dxa"/>
+              <w:start w:w="100" w:type="dxa"/>
+              <w:bottom w:w="90" w:type="dxa"/>
+              <w:end w:w="100" w:type="dxa"/>
+            </w:tcMar>
+          </w:tcPr>
+          <w:p>
+            <w:pPr>
+              <w:spacing w:after="0"/>
+            </w:pPr>
+            <w:r>
+              <w:rPr>
+                <w:rFonts w:ascii="Heiti SC" w:hAnsi="Heiti SC" w:eastAsia="Heiti SC" w:cs="Heiti SC" w:hint="eastAsia"/>
+                <w:sz w:val="18"/>
+              </w:rPr>
+              <w:t>OSDK 的上游建模和生产能力，可作为 awiki.ai Agent 网络中的可操作 skill 对象</w:t>
+            </w:r>
+          </w:p>
+        </w:tc>
+      </w:tr>
     </w:tbl>
     <w:p/>
     <w:p>
@@ -1021,6 +1121,56 @@
                 <w:sz w:val="18"/>
               </w:rPr>
               <w:t>买方 Agent、服务方 Agent、Provider 内部数字员工通过 Agent 网络协作和异步通知</w:t>
+            </w:r>
+          </w:p>
+        </w:tc>
+      </w:tr>
+      <w:tr>
+        <w:tc>
+          <w:tcPr>
+            <w:tcW w:type="dxa" w:w="4997"/>
+            <w:vAlign w:val="center"/>
+            <w:tcMar>
+              <w:top w:w="90" w:type="dxa"/>
+              <w:start w:w="100" w:type="dxa"/>
+              <w:bottom w:w="90" w:type="dxa"/>
+              <w:end w:w="100" w:type="dxa"/>
+            </w:tcMar>
+          </w:tcPr>
+          <w:p>
+            <w:pPr>
+              <w:spacing w:after="0"/>
+            </w:pPr>
+            <w:r>
+              <w:rPr>
+                <w:rFonts w:ascii="Heiti SC" w:hAnsi="Heiti SC" w:eastAsia="Heiti SC" w:cs="Heiti SC" w:hint="eastAsia"/>
+                <w:sz w:val="18"/>
+              </w:rPr>
+              <w:t>上游本体平台可以被纳入生态</w:t>
+            </w:r>
+          </w:p>
+        </w:tc>
+        <w:tc>
+          <w:tcPr>
+            <w:tcW w:type="dxa" w:w="4997"/>
+            <w:vAlign w:val="center"/>
+            <w:tcMar>
+              <w:top w:w="90" w:type="dxa"/>
+              <w:start w:w="100" w:type="dxa"/>
+              <w:bottom w:w="90" w:type="dxa"/>
+              <w:end w:w="100" w:type="dxa"/>
+            </w:tcMar>
+          </w:tcPr>
+          <w:p>
+            <w:pPr>
+              <w:spacing w:after="0"/>
+            </w:pPr>
+            <w:r>
+              <w:rPr>
+                <w:rFonts w:ascii="Heiti SC" w:hAnsi="Heiti SC" w:eastAsia="Heiti SC" w:cs="Heiti SC" w:hint="eastAsia"/>
+                <w:sz w:val="18"/>
+              </w:rPr>
+              <w:t>OntoFlow 或其他动态本体平台负责编排建模、加工和实例化，输出 DOIR 或产品投影供 OSDK 编译</w:t>
             </w:r>
           </w:p>
         </w:tc>
@@ -6860,7 +7010,1042 @@
         <w:rPr>
           <w:rFonts w:ascii="Heiti SC" w:hAnsi="Heiti SC" w:eastAsia="Heiti SC" w:cs="Heiti SC" w:hint="eastAsia"/>
         </w:rPr>
-        <w:t>5.4 异步通知为什么重要</w:t>
+        <w:t>5.4 数据运营 Agent 需要什么能力边界</w:t>
+      </w:r>
+    </w:p>
+    <w:p>
+      <w:r>
+        <w:rPr>
+          <w:rFonts w:ascii="Heiti SC" w:hAnsi="Heiti SC" w:eastAsia="Heiti SC" w:cs="Heiti SC" w:hint="eastAsia"/>
+          <w:b w:val="0"/>
+        </w:rPr>
+        <w:t>数据交易服务的数字员工不是普通客服机器人。它们要真正降低数据提供方的工作强度，就必须具备更多全栈技术访问能力：能看数据目录、读元数据、跑质量检查、调用动态本体平台、触发产品编译、检查 Runtime Binding、提交发布申请、跟踪任务、读取审计日志。</w:t>
+      </w:r>
+    </w:p>
+    <w:p>
+      <w:r>
+        <w:rPr>
+          <w:rFonts w:ascii="Heiti SC" w:hAnsi="Heiti SC" w:eastAsia="Heiti SC" w:cs="Heiti SC" w:hint="eastAsia"/>
+          <w:b w:val="0"/>
+        </w:rPr>
+        <w:t>但这不意味着 Agent 可以自由访问生产数据或自由发布数据产品。正确边界是：</w:t>
+      </w:r>
+    </w:p>
+    <w:tbl>
+      <w:tblPr>
+        <w:tblW w:type="auto" w:w="0"/>
+        <w:jc w:val="left"/>
+        <w:tblLayout w:type="autofit"/>
+        <w:tblLook w:firstColumn="1" w:firstRow="1" w:lastColumn="0" w:lastRow="0" w:noHBand="0" w:noVBand="1" w:val="04A0"/>
+      </w:tblPr>
+      <w:tblGrid>
+        <w:gridCol w:w="9994"/>
+      </w:tblGrid>
+      <w:tr>
+        <w:tc>
+          <w:tcPr>
+            <w:tcW w:type="dxa" w:w="9994"/>
+            <w:shd w:fill="F6F8FA"/>
+            <w:tcMar>
+              <w:top w:w="110" w:type="dxa"/>
+              <w:start w:w="120" w:type="dxa"/>
+              <w:bottom w:w="110" w:type="dxa"/>
+              <w:end w:w="120" w:type="dxa"/>
+            </w:tcMar>
+          </w:tcPr>
+          <w:p>
+            <w:pPr>
+              <w:spacing w:after="0"/>
+            </w:pPr>
+            <w:r>
+              <w:rPr>
+                <w:rFonts w:ascii="Heiti SC" w:hAnsi="Heiti SC" w:eastAsia="Heiti SC" w:cs="Heiti SC" w:hint="eastAsia"/>
+                <w:color w:val="111827"/>
+                <w:sz w:val="16"/>
+              </w:rPr>
+              <w:t>内部生产侧：Agent 可以受控调用数据平台、动态本体平台、质量平台、编译器和运维工具；</w:t>
+              <w:br/>
+              <w:t>外部服务侧：Agent 只能通过 Product OSDK / MCP Tool / Gateway 调用已发布的数据产品；</w:t>
+              <w:br/>
+              <w:t>高风险动作：必须有人类审批或双人复核，不能完全交给 Agent 自主决定。</w:t>
+            </w:r>
+          </w:p>
+        </w:tc>
+      </w:tr>
+    </w:tbl>
+    <w:p/>
+    <w:p>
+      <w:r>
+        <w:rPr>
+          <w:rFonts w:ascii="Heiti SC" w:hAnsi="Heiti SC" w:eastAsia="Heiti SC" w:cs="Heiti SC" w:hint="eastAsia"/>
+          <w:b w:val="0"/>
+        </w:rPr>
+        <w:t>这也是“OSDK 向外、平台向内”的分工：</w:t>
+      </w:r>
+    </w:p>
+    <w:tbl>
+      <w:tblPr>
+        <w:tblStyle w:val="TableGrid"/>
+        <w:tblW w:type="auto" w:w="0"/>
+        <w:jc w:val="center"/>
+        <w:tblLayout w:type="autofit"/>
+        <w:tblLook w:firstColumn="1" w:firstRow="1" w:lastColumn="0" w:lastRow="0" w:noHBand="0" w:noVBand="1" w:val="04A0"/>
+      </w:tblPr>
+      <w:tblGrid>
+        <w:gridCol w:w="3331"/>
+        <w:gridCol w:w="3331"/>
+        <w:gridCol w:w="3331"/>
+      </w:tblGrid>
+      <w:tr>
+        <w:tc>
+          <w:tcPr>
+            <w:tcW w:type="dxa" w:w="3331"/>
+            <w:vAlign w:val="center"/>
+            <w:tcMar>
+              <w:top w:w="90" w:type="dxa"/>
+              <w:start w:w="100" w:type="dxa"/>
+              <w:bottom w:w="90" w:type="dxa"/>
+              <w:end w:w="100" w:type="dxa"/>
+            </w:tcMar>
+            <w:shd w:fill="EAF2FF"/>
+          </w:tcPr>
+          <w:p>
+            <w:pPr>
+              <w:spacing w:after="0"/>
+            </w:pPr>
+            <w:r>
+              <w:rPr>
+                <w:rFonts w:ascii="Heiti SC" w:hAnsi="Heiti SC" w:eastAsia="Heiti SC" w:cs="Heiti SC" w:hint="eastAsia"/>
+                <w:b/>
+                <w:color w:val="1E40AF"/>
+                <w:sz w:val="18"/>
+              </w:rPr>
+              <w:t>场景</w:t>
+            </w:r>
+          </w:p>
+        </w:tc>
+        <w:tc>
+          <w:tcPr>
+            <w:tcW w:type="dxa" w:w="3331"/>
+            <w:vAlign w:val="center"/>
+            <w:tcMar>
+              <w:top w:w="90" w:type="dxa"/>
+              <w:start w:w="100" w:type="dxa"/>
+              <w:bottom w:w="90" w:type="dxa"/>
+              <w:end w:w="100" w:type="dxa"/>
+            </w:tcMar>
+            <w:shd w:fill="EAF2FF"/>
+          </w:tcPr>
+          <w:p>
+            <w:pPr>
+              <w:spacing w:after="0"/>
+            </w:pPr>
+            <w:r>
+              <w:rPr>
+                <w:rFonts w:ascii="Heiti SC" w:hAnsi="Heiti SC" w:eastAsia="Heiti SC" w:cs="Heiti SC" w:hint="eastAsia"/>
+                <w:b/>
+                <w:color w:val="1E40AF"/>
+                <w:sz w:val="18"/>
+              </w:rPr>
+              <w:t>Agent 应该用什么能力</w:t>
+            </w:r>
+          </w:p>
+        </w:tc>
+        <w:tc>
+          <w:tcPr>
+            <w:tcW w:type="dxa" w:w="3331"/>
+            <w:vAlign w:val="center"/>
+            <w:tcMar>
+              <w:top w:w="90" w:type="dxa"/>
+              <w:start w:w="100" w:type="dxa"/>
+              <w:bottom w:w="90" w:type="dxa"/>
+              <w:end w:w="100" w:type="dxa"/>
+            </w:tcMar>
+            <w:shd w:fill="EAF2FF"/>
+          </w:tcPr>
+          <w:p>
+            <w:pPr>
+              <w:spacing w:after="0"/>
+            </w:pPr>
+            <w:r>
+              <w:rPr>
+                <w:rFonts w:ascii="Heiti SC" w:hAnsi="Heiti SC" w:eastAsia="Heiti SC" w:cs="Heiti SC" w:hint="eastAsia"/>
+                <w:b/>
+                <w:color w:val="1E40AF"/>
+                <w:sz w:val="18"/>
+              </w:rPr>
+              <w:t>为什么</w:t>
+            </w:r>
+          </w:p>
+        </w:tc>
+      </w:tr>
+      <w:tr>
+        <w:tc>
+          <w:tcPr>
+            <w:tcW w:type="dxa" w:w="3331"/>
+            <w:vAlign w:val="center"/>
+            <w:tcMar>
+              <w:top w:w="90" w:type="dxa"/>
+              <w:start w:w="100" w:type="dxa"/>
+              <w:bottom w:w="90" w:type="dxa"/>
+              <w:end w:w="100" w:type="dxa"/>
+            </w:tcMar>
+          </w:tcPr>
+          <w:p>
+            <w:pPr>
+              <w:spacing w:after="0"/>
+            </w:pPr>
+            <w:r>
+              <w:rPr>
+                <w:rFonts w:ascii="Heiti SC" w:hAnsi="Heiti SC" w:eastAsia="Heiti SC" w:cs="Heiti SC" w:hint="eastAsia"/>
+                <w:sz w:val="18"/>
+              </w:rPr>
+              <w:t>发现源表、字段、口径和血缘</w:t>
+            </w:r>
+          </w:p>
+        </w:tc>
+        <w:tc>
+          <w:tcPr>
+            <w:tcW w:type="dxa" w:w="3331"/>
+            <w:vAlign w:val="center"/>
+            <w:tcMar>
+              <w:top w:w="90" w:type="dxa"/>
+              <w:start w:w="100" w:type="dxa"/>
+              <w:bottom w:w="90" w:type="dxa"/>
+              <w:end w:w="100" w:type="dxa"/>
+            </w:tcMar>
+          </w:tcPr>
+          <w:p>
+            <w:pPr>
+              <w:spacing w:after="0"/>
+            </w:pPr>
+            <w:r>
+              <w:rPr>
+                <w:rFonts w:ascii="Heiti SC" w:hAnsi="Heiti SC" w:eastAsia="Heiti SC" w:cs="Heiti SC" w:hint="eastAsia"/>
+                <w:sz w:val="18"/>
+              </w:rPr>
+              <w:t>数据目录、数据平台、动态本体平台 API</w:t>
+            </w:r>
+          </w:p>
+        </w:tc>
+        <w:tc>
+          <w:tcPr>
+            <w:tcW w:type="dxa" w:w="3331"/>
+            <w:vAlign w:val="center"/>
+            <w:tcMar>
+              <w:top w:w="90" w:type="dxa"/>
+              <w:start w:w="100" w:type="dxa"/>
+              <w:bottom w:w="90" w:type="dxa"/>
+              <w:end w:w="100" w:type="dxa"/>
+            </w:tcMar>
+          </w:tcPr>
+          <w:p>
+            <w:pPr>
+              <w:spacing w:after="0"/>
+            </w:pPr>
+            <w:r>
+              <w:rPr>
+                <w:rFonts w:ascii="Heiti SC" w:hAnsi="Heiti SC" w:eastAsia="Heiti SC" w:cs="Heiti SC" w:hint="eastAsia"/>
+                <w:sz w:val="18"/>
+              </w:rPr>
+              <w:t>这是数据提供方内部生产工作，需要充分利用现有平台能力</w:t>
+            </w:r>
+          </w:p>
+        </w:tc>
+      </w:tr>
+      <w:tr>
+        <w:tc>
+          <w:tcPr>
+            <w:tcW w:type="dxa" w:w="3331"/>
+            <w:vAlign w:val="center"/>
+            <w:tcMar>
+              <w:top w:w="90" w:type="dxa"/>
+              <w:start w:w="100" w:type="dxa"/>
+              <w:bottom w:w="90" w:type="dxa"/>
+              <w:end w:w="100" w:type="dxa"/>
+            </w:tcMar>
+          </w:tcPr>
+          <w:p>
+            <w:pPr>
+              <w:spacing w:after="0"/>
+            </w:pPr>
+            <w:r>
+              <w:rPr>
+                <w:rFonts w:ascii="Heiti SC" w:hAnsi="Heiti SC" w:eastAsia="Heiti SC" w:cs="Heiti SC" w:hint="eastAsia"/>
+                <w:sz w:val="18"/>
+              </w:rPr>
+              <w:t>建模、映射、分类分级建议</w:t>
+            </w:r>
+          </w:p>
+        </w:tc>
+        <w:tc>
+          <w:tcPr>
+            <w:tcW w:type="dxa" w:w="3331"/>
+            <w:vAlign w:val="center"/>
+            <w:tcMar>
+              <w:top w:w="90" w:type="dxa"/>
+              <w:start w:w="100" w:type="dxa"/>
+              <w:bottom w:w="90" w:type="dxa"/>
+              <w:end w:w="100" w:type="dxa"/>
+            </w:tcMar>
+          </w:tcPr>
+          <w:p>
+            <w:pPr>
+              <w:spacing w:after="0"/>
+            </w:pPr>
+            <w:r>
+              <w:rPr>
+                <w:rFonts w:ascii="Heiti SC" w:hAnsi="Heiti SC" w:eastAsia="Heiti SC" w:cs="Heiti SC" w:hint="eastAsia"/>
+                <w:sz w:val="18"/>
+              </w:rPr>
+              <w:t>OntoFlow / 动态本体平台、LLM 辅助分析、规则库</w:t>
+            </w:r>
+          </w:p>
+        </w:tc>
+        <w:tc>
+          <w:tcPr>
+            <w:tcW w:type="dxa" w:w="3331"/>
+            <w:vAlign w:val="center"/>
+            <w:tcMar>
+              <w:top w:w="90" w:type="dxa"/>
+              <w:start w:w="100" w:type="dxa"/>
+              <w:bottom w:w="90" w:type="dxa"/>
+              <w:end w:w="100" w:type="dxa"/>
+            </w:tcMar>
+          </w:tcPr>
+          <w:p>
+            <w:pPr>
+              <w:spacing w:after="0"/>
+            </w:pPr>
+            <w:r>
+              <w:rPr>
+                <w:rFonts w:ascii="Heiti SC" w:hAnsi="Heiti SC" w:eastAsia="Heiti SC" w:cs="Heiti SC" w:hint="eastAsia"/>
+                <w:sz w:val="18"/>
+              </w:rPr>
+              <w:t>需要理解底层结构和业务语义，不能只靠已发布 OSDK</w:t>
+            </w:r>
+          </w:p>
+        </w:tc>
+      </w:tr>
+      <w:tr>
+        <w:tc>
+          <w:tcPr>
+            <w:tcW w:type="dxa" w:w="3331"/>
+            <w:vAlign w:val="center"/>
+            <w:tcMar>
+              <w:top w:w="90" w:type="dxa"/>
+              <w:start w:w="100" w:type="dxa"/>
+              <w:bottom w:w="90" w:type="dxa"/>
+              <w:end w:w="100" w:type="dxa"/>
+            </w:tcMar>
+          </w:tcPr>
+          <w:p>
+            <w:pPr>
+              <w:spacing w:after="0"/>
+            </w:pPr>
+            <w:r>
+              <w:rPr>
+                <w:rFonts w:ascii="Heiti SC" w:hAnsi="Heiti SC" w:eastAsia="Heiti SC" w:cs="Heiti SC" w:hint="eastAsia"/>
+                <w:sz w:val="18"/>
+              </w:rPr>
+              <w:t>质量检查和样例验证</w:t>
+            </w:r>
+          </w:p>
+        </w:tc>
+        <w:tc>
+          <w:tcPr>
+            <w:tcW w:type="dxa" w:w="3331"/>
+            <w:vAlign w:val="center"/>
+            <w:tcMar>
+              <w:top w:w="90" w:type="dxa"/>
+              <w:start w:w="100" w:type="dxa"/>
+              <w:bottom w:w="90" w:type="dxa"/>
+              <w:end w:w="100" w:type="dxa"/>
+            </w:tcMar>
+          </w:tcPr>
+          <w:p>
+            <w:pPr>
+              <w:spacing w:after="0"/>
+            </w:pPr>
+            <w:r>
+              <w:rPr>
+                <w:rFonts w:ascii="Heiti SC" w:hAnsi="Heiti SC" w:eastAsia="Heiti SC" w:cs="Heiti SC" w:hint="eastAsia"/>
+                <w:sz w:val="18"/>
+              </w:rPr>
+              <w:t>质量平台、DuckDB/SQL、GIS/图计算、测试数据集</w:t>
+            </w:r>
+          </w:p>
+        </w:tc>
+        <w:tc>
+          <w:tcPr>
+            <w:tcW w:type="dxa" w:w="3331"/>
+            <w:vAlign w:val="center"/>
+            <w:tcMar>
+              <w:top w:w="90" w:type="dxa"/>
+              <w:start w:w="100" w:type="dxa"/>
+              <w:bottom w:w="90" w:type="dxa"/>
+              <w:end w:w="100" w:type="dxa"/>
+            </w:tcMar>
+          </w:tcPr>
+          <w:p>
+            <w:pPr>
+              <w:spacing w:after="0"/>
+            </w:pPr>
+            <w:r>
+              <w:rPr>
+                <w:rFonts w:ascii="Heiti SC" w:hAnsi="Heiti SC" w:eastAsia="Heiti SC" w:cs="Heiti SC" w:hint="eastAsia"/>
+                <w:sz w:val="18"/>
+              </w:rPr>
+              <w:t>这是产品发布前的内部质检</w:t>
+            </w:r>
+          </w:p>
+        </w:tc>
+      </w:tr>
+      <w:tr>
+        <w:tc>
+          <w:tcPr>
+            <w:tcW w:type="dxa" w:w="3331"/>
+            <w:vAlign w:val="center"/>
+            <w:tcMar>
+              <w:top w:w="90" w:type="dxa"/>
+              <w:start w:w="100" w:type="dxa"/>
+              <w:bottom w:w="90" w:type="dxa"/>
+              <w:end w:w="100" w:type="dxa"/>
+            </w:tcMar>
+          </w:tcPr>
+          <w:p>
+            <w:pPr>
+              <w:spacing w:after="0"/>
+            </w:pPr>
+            <w:r>
+              <w:rPr>
+                <w:rFonts w:ascii="Heiti SC" w:hAnsi="Heiti SC" w:eastAsia="Heiti SC" w:cs="Heiti SC" w:hint="eastAsia"/>
+                <w:sz w:val="18"/>
+              </w:rPr>
+              <w:t>产品编译和接口收缩</w:t>
+            </w:r>
+          </w:p>
+        </w:tc>
+        <w:tc>
+          <w:tcPr>
+            <w:tcW w:type="dxa" w:w="3331"/>
+            <w:vAlign w:val="center"/>
+            <w:tcMar>
+              <w:top w:w="90" w:type="dxa"/>
+              <w:start w:w="100" w:type="dxa"/>
+              <w:bottom w:w="90" w:type="dxa"/>
+              <w:end w:w="100" w:type="dxa"/>
+            </w:tcMar>
+          </w:tcPr>
+          <w:p>
+            <w:pPr>
+              <w:spacing w:after="0"/>
+            </w:pPr>
+            <w:r>
+              <w:rPr>
+                <w:rFonts w:ascii="Heiti SC" w:hAnsi="Heiti SC" w:eastAsia="Heiti SC" w:cs="Heiti SC" w:hint="eastAsia"/>
+                <w:sz w:val="18"/>
+              </w:rPr>
+              <w:t>Product Compiler / OSDK Generator</w:t>
+            </w:r>
+          </w:p>
+        </w:tc>
+        <w:tc>
+          <w:tcPr>
+            <w:tcW w:type="dxa" w:w="3331"/>
+            <w:vAlign w:val="center"/>
+            <w:tcMar>
+              <w:top w:w="90" w:type="dxa"/>
+              <w:start w:w="100" w:type="dxa"/>
+              <w:bottom w:w="90" w:type="dxa"/>
+              <w:end w:w="100" w:type="dxa"/>
+            </w:tcMar>
+          </w:tcPr>
+          <w:p>
+            <w:pPr>
+              <w:spacing w:after="0"/>
+            </w:pPr>
+            <w:r>
+              <w:rPr>
+                <w:rFonts w:ascii="Heiti SC" w:hAnsi="Heiti SC" w:eastAsia="Heiti SC" w:cs="Heiti SC" w:hint="eastAsia"/>
+                <w:sz w:val="18"/>
+              </w:rPr>
+              <w:t>把内部能力裁剪成可授权的数据产品接口</w:t>
+            </w:r>
+          </w:p>
+        </w:tc>
+      </w:tr>
+      <w:tr>
+        <w:tc>
+          <w:tcPr>
+            <w:tcW w:type="dxa" w:w="3331"/>
+            <w:vAlign w:val="center"/>
+            <w:tcMar>
+              <w:top w:w="90" w:type="dxa"/>
+              <w:start w:w="100" w:type="dxa"/>
+              <w:bottom w:w="90" w:type="dxa"/>
+              <w:end w:w="100" w:type="dxa"/>
+            </w:tcMar>
+          </w:tcPr>
+          <w:p>
+            <w:pPr>
+              <w:spacing w:after="0"/>
+            </w:pPr>
+            <w:r>
+              <w:rPr>
+                <w:rFonts w:ascii="Heiti SC" w:hAnsi="Heiti SC" w:eastAsia="Heiti SC" w:cs="Heiti SC" w:hint="eastAsia"/>
+                <w:sz w:val="18"/>
+              </w:rPr>
+              <w:t>发布、授权、撤销、外发结果</w:t>
+            </w:r>
+          </w:p>
+        </w:tc>
+        <w:tc>
+          <w:tcPr>
+            <w:tcW w:type="dxa" w:w="3331"/>
+            <w:vAlign w:val="center"/>
+            <w:tcMar>
+              <w:top w:w="90" w:type="dxa"/>
+              <w:start w:w="100" w:type="dxa"/>
+              <w:bottom w:w="90" w:type="dxa"/>
+              <w:end w:w="100" w:type="dxa"/>
+            </w:tcMar>
+          </w:tcPr>
+          <w:p>
+            <w:pPr>
+              <w:spacing w:after="0"/>
+            </w:pPr>
+            <w:r>
+              <w:rPr>
+                <w:rFonts w:ascii="Heiti SC" w:hAnsi="Heiti SC" w:eastAsia="Heiti SC" w:cs="Heiti SC" w:hint="eastAsia"/>
+                <w:sz w:val="18"/>
+              </w:rPr>
+              <w:t>Policy、Gateway、Audit、Receipt</w:t>
+            </w:r>
+          </w:p>
+        </w:tc>
+        <w:tc>
+          <w:tcPr>
+            <w:tcW w:type="dxa" w:w="3331"/>
+            <w:vAlign w:val="center"/>
+            <w:tcMar>
+              <w:top w:w="90" w:type="dxa"/>
+              <w:start w:w="100" w:type="dxa"/>
+              <w:bottom w:w="90" w:type="dxa"/>
+              <w:end w:w="100" w:type="dxa"/>
+            </w:tcMar>
+          </w:tcPr>
+          <w:p>
+            <w:pPr>
+              <w:spacing w:after="0"/>
+            </w:pPr>
+            <w:r>
+              <w:rPr>
+                <w:rFonts w:ascii="Heiti SC" w:hAnsi="Heiti SC" w:eastAsia="Heiti SC" w:cs="Heiti SC" w:hint="eastAsia"/>
+                <w:sz w:val="18"/>
+              </w:rPr>
+              <w:t>这是可信数据空间边界，必须强制执行</w:t>
+            </w:r>
+          </w:p>
+        </w:tc>
+      </w:tr>
+      <w:tr>
+        <w:tc>
+          <w:tcPr>
+            <w:tcW w:type="dxa" w:w="3331"/>
+            <w:vAlign w:val="center"/>
+            <w:tcMar>
+              <w:top w:w="90" w:type="dxa"/>
+              <w:start w:w="100" w:type="dxa"/>
+              <w:bottom w:w="90" w:type="dxa"/>
+              <w:end w:w="100" w:type="dxa"/>
+            </w:tcMar>
+          </w:tcPr>
+          <w:p>
+            <w:pPr>
+              <w:spacing w:after="0"/>
+            </w:pPr>
+            <w:r>
+              <w:rPr>
+                <w:rFonts w:ascii="Heiti SC" w:hAnsi="Heiti SC" w:eastAsia="Heiti SC" w:cs="Heiti SC" w:hint="eastAsia"/>
+                <w:sz w:val="18"/>
+              </w:rPr>
+              <w:t>买方或外部 Agent 调用产品</w:t>
+            </w:r>
+          </w:p>
+        </w:tc>
+        <w:tc>
+          <w:tcPr>
+            <w:tcW w:type="dxa" w:w="3331"/>
+            <w:vAlign w:val="center"/>
+            <w:tcMar>
+              <w:top w:w="90" w:type="dxa"/>
+              <w:start w:w="100" w:type="dxa"/>
+              <w:bottom w:w="90" w:type="dxa"/>
+              <w:end w:w="100" w:type="dxa"/>
+            </w:tcMar>
+          </w:tcPr>
+          <w:p>
+            <w:pPr>
+              <w:spacing w:after="0"/>
+            </w:pPr>
+            <w:r>
+              <w:rPr>
+                <w:rFonts w:ascii="Heiti SC" w:hAnsi="Heiti SC" w:eastAsia="Heiti SC" w:cs="Heiti SC" w:hint="eastAsia"/>
+                <w:sz w:val="18"/>
+              </w:rPr>
+              <w:t>Product OSDK / MCP Tool</w:t>
+            </w:r>
+          </w:p>
+        </w:tc>
+        <w:tc>
+          <w:tcPr>
+            <w:tcW w:type="dxa" w:w="3331"/>
+            <w:vAlign w:val="center"/>
+            <w:tcMar>
+              <w:top w:w="90" w:type="dxa"/>
+              <w:start w:w="100" w:type="dxa"/>
+              <w:bottom w:w="90" w:type="dxa"/>
+              <w:end w:w="100" w:type="dxa"/>
+            </w:tcMar>
+          </w:tcPr>
+          <w:p>
+            <w:pPr>
+              <w:spacing w:after="0"/>
+            </w:pPr>
+            <w:r>
+              <w:rPr>
+                <w:rFonts w:ascii="Heiti SC" w:hAnsi="Heiti SC" w:eastAsia="Heiti SC" w:cs="Heiti SC" w:hint="eastAsia"/>
+                <w:sz w:val="18"/>
+              </w:rPr>
+              <w:t>外部 Agent 不应直接碰底层表、文件、SQL 或连接串</w:t>
+            </w:r>
+          </w:p>
+        </w:tc>
+      </w:tr>
+    </w:tbl>
+    <w:p/>
+    <w:p>
+      <w:r>
+        <w:rPr>
+          <w:rFonts w:ascii="Heiti SC" w:hAnsi="Heiti SC" w:eastAsia="Heiti SC" w:cs="Heiti SC" w:hint="eastAsia"/>
+          <w:b w:val="0"/>
+        </w:rPr>
+        <w:t>因此，数据运营 Agent 的权限要按动作风险分层：</w:t>
+      </w:r>
+    </w:p>
+    <w:tbl>
+      <w:tblPr>
+        <w:tblStyle w:val="TableGrid"/>
+        <w:tblW w:type="auto" w:w="0"/>
+        <w:jc w:val="center"/>
+        <w:tblLayout w:type="autofit"/>
+        <w:tblLook w:firstColumn="1" w:firstRow="1" w:lastColumn="0" w:lastRow="0" w:noHBand="0" w:noVBand="1" w:val="04A0"/>
+      </w:tblPr>
+      <w:tblGrid>
+        <w:gridCol w:w="3331"/>
+        <w:gridCol w:w="3331"/>
+        <w:gridCol w:w="3331"/>
+      </w:tblGrid>
+      <w:tr>
+        <w:tc>
+          <w:tcPr>
+            <w:tcW w:type="dxa" w:w="3331"/>
+            <w:vAlign w:val="center"/>
+            <w:tcMar>
+              <w:top w:w="90" w:type="dxa"/>
+              <w:start w:w="100" w:type="dxa"/>
+              <w:bottom w:w="90" w:type="dxa"/>
+              <w:end w:w="100" w:type="dxa"/>
+            </w:tcMar>
+            <w:shd w:fill="EAF2FF"/>
+          </w:tcPr>
+          <w:p>
+            <w:pPr>
+              <w:spacing w:after="0"/>
+            </w:pPr>
+            <w:r>
+              <w:rPr>
+                <w:rFonts w:ascii="Heiti SC" w:hAnsi="Heiti SC" w:eastAsia="Heiti SC" w:cs="Heiti SC" w:hint="eastAsia"/>
+                <w:b/>
+                <w:color w:val="1E40AF"/>
+                <w:sz w:val="18"/>
+              </w:rPr>
+              <w:t>风险级别</w:t>
+            </w:r>
+          </w:p>
+        </w:tc>
+        <w:tc>
+          <w:tcPr>
+            <w:tcW w:type="dxa" w:w="3331"/>
+            <w:vAlign w:val="center"/>
+            <w:tcMar>
+              <w:top w:w="90" w:type="dxa"/>
+              <w:start w:w="100" w:type="dxa"/>
+              <w:bottom w:w="90" w:type="dxa"/>
+              <w:end w:w="100" w:type="dxa"/>
+            </w:tcMar>
+            <w:shd w:fill="EAF2FF"/>
+          </w:tcPr>
+          <w:p>
+            <w:pPr>
+              <w:spacing w:after="0"/>
+            </w:pPr>
+            <w:r>
+              <w:rPr>
+                <w:rFonts w:ascii="Heiti SC" w:hAnsi="Heiti SC" w:eastAsia="Heiti SC" w:cs="Heiti SC" w:hint="eastAsia"/>
+                <w:b/>
+                <w:color w:val="1E40AF"/>
+                <w:sz w:val="18"/>
+              </w:rPr>
+              <w:t>可自动执行</w:t>
+            </w:r>
+          </w:p>
+        </w:tc>
+        <w:tc>
+          <w:tcPr>
+            <w:tcW w:type="dxa" w:w="3331"/>
+            <w:vAlign w:val="center"/>
+            <w:tcMar>
+              <w:top w:w="90" w:type="dxa"/>
+              <w:start w:w="100" w:type="dxa"/>
+              <w:bottom w:w="90" w:type="dxa"/>
+              <w:end w:w="100" w:type="dxa"/>
+            </w:tcMar>
+            <w:shd w:fill="EAF2FF"/>
+          </w:tcPr>
+          <w:p>
+            <w:pPr>
+              <w:spacing w:after="0"/>
+            </w:pPr>
+            <w:r>
+              <w:rPr>
+                <w:rFonts w:ascii="Heiti SC" w:hAnsi="Heiti SC" w:eastAsia="Heiti SC" w:cs="Heiti SC" w:hint="eastAsia"/>
+                <w:b/>
+                <w:color w:val="1E40AF"/>
+                <w:sz w:val="18"/>
+              </w:rPr>
+              <w:t>必须人工确认</w:t>
+            </w:r>
+          </w:p>
+        </w:tc>
+      </w:tr>
+      <w:tr>
+        <w:tc>
+          <w:tcPr>
+            <w:tcW w:type="dxa" w:w="3331"/>
+            <w:vAlign w:val="center"/>
+            <w:tcMar>
+              <w:top w:w="90" w:type="dxa"/>
+              <w:start w:w="100" w:type="dxa"/>
+              <w:bottom w:w="90" w:type="dxa"/>
+              <w:end w:w="100" w:type="dxa"/>
+            </w:tcMar>
+          </w:tcPr>
+          <w:p>
+            <w:pPr>
+              <w:spacing w:after="0"/>
+            </w:pPr>
+            <w:r>
+              <w:rPr>
+                <w:rFonts w:ascii="Heiti SC" w:hAnsi="Heiti SC" w:eastAsia="Heiti SC" w:cs="Heiti SC" w:hint="eastAsia"/>
+                <w:sz w:val="18"/>
+              </w:rPr>
+              <w:t>低风险</w:t>
+            </w:r>
+          </w:p>
+        </w:tc>
+        <w:tc>
+          <w:tcPr>
+            <w:tcW w:type="dxa" w:w="3331"/>
+            <w:vAlign w:val="center"/>
+            <w:tcMar>
+              <w:top w:w="90" w:type="dxa"/>
+              <w:start w:w="100" w:type="dxa"/>
+              <w:bottom w:w="90" w:type="dxa"/>
+              <w:end w:w="100" w:type="dxa"/>
+            </w:tcMar>
+          </w:tcPr>
+          <w:p>
+            <w:pPr>
+              <w:spacing w:after="0"/>
+            </w:pPr>
+            <w:r>
+              <w:rPr>
+                <w:rFonts w:ascii="Heiti SC" w:hAnsi="Heiti SC" w:eastAsia="Heiti SC" w:cs="Heiti SC" w:hint="eastAsia"/>
+                <w:sz w:val="18"/>
+              </w:rPr>
+              <w:t>读取元数据、生成说明、草拟映射、生成测试报告</w:t>
+            </w:r>
+          </w:p>
+        </w:tc>
+        <w:tc>
+          <w:tcPr>
+            <w:tcW w:type="dxa" w:w="3331"/>
+            <w:vAlign w:val="center"/>
+            <w:tcMar>
+              <w:top w:w="90" w:type="dxa"/>
+              <w:start w:w="100" w:type="dxa"/>
+              <w:bottom w:w="90" w:type="dxa"/>
+              <w:end w:w="100" w:type="dxa"/>
+            </w:tcMar>
+          </w:tcPr>
+          <w:p>
+            <w:pPr>
+              <w:spacing w:after="0"/>
+            </w:pPr>
+            <w:r>
+              <w:rPr>
+                <w:rFonts w:ascii="Heiti SC" w:hAnsi="Heiti SC" w:eastAsia="Heiti SC" w:cs="Heiti SC" w:hint="eastAsia"/>
+                <w:sz w:val="18"/>
+              </w:rPr>
+              <w:t>通常不需要</w:t>
+            </w:r>
+          </w:p>
+        </w:tc>
+      </w:tr>
+      <w:tr>
+        <w:tc>
+          <w:tcPr>
+            <w:tcW w:type="dxa" w:w="3331"/>
+            <w:vAlign w:val="center"/>
+            <w:tcMar>
+              <w:top w:w="90" w:type="dxa"/>
+              <w:start w:w="100" w:type="dxa"/>
+              <w:bottom w:w="90" w:type="dxa"/>
+              <w:end w:w="100" w:type="dxa"/>
+            </w:tcMar>
+          </w:tcPr>
+          <w:p>
+            <w:pPr>
+              <w:spacing w:after="0"/>
+            </w:pPr>
+            <w:r>
+              <w:rPr>
+                <w:rFonts w:ascii="Heiti SC" w:hAnsi="Heiti SC" w:eastAsia="Heiti SC" w:cs="Heiti SC" w:hint="eastAsia"/>
+                <w:sz w:val="18"/>
+              </w:rPr>
+              <w:t>中风险</w:t>
+            </w:r>
+          </w:p>
+        </w:tc>
+        <w:tc>
+          <w:tcPr>
+            <w:tcW w:type="dxa" w:w="3331"/>
+            <w:vAlign w:val="center"/>
+            <w:tcMar>
+              <w:top w:w="90" w:type="dxa"/>
+              <w:start w:w="100" w:type="dxa"/>
+              <w:bottom w:w="90" w:type="dxa"/>
+              <w:end w:w="100" w:type="dxa"/>
+            </w:tcMar>
+          </w:tcPr>
+          <w:p>
+            <w:pPr>
+              <w:spacing w:after="0"/>
+            </w:pPr>
+            <w:r>
+              <w:rPr>
+                <w:rFonts w:ascii="Heiti SC" w:hAnsi="Heiti SC" w:eastAsia="Heiti SC" w:cs="Heiti SC" w:hint="eastAsia"/>
+                <w:sz w:val="18"/>
+              </w:rPr>
+              <w:t>运行质量任务、生成产品草案、发起编译、模拟授权</w:t>
+            </w:r>
+          </w:p>
+        </w:tc>
+        <w:tc>
+          <w:tcPr>
+            <w:tcW w:type="dxa" w:w="3331"/>
+            <w:vAlign w:val="center"/>
+            <w:tcMar>
+              <w:top w:w="90" w:type="dxa"/>
+              <w:start w:w="100" w:type="dxa"/>
+              <w:bottom w:w="90" w:type="dxa"/>
+              <w:end w:w="100" w:type="dxa"/>
+            </w:tcMar>
+          </w:tcPr>
+          <w:p>
+            <w:pPr>
+              <w:spacing w:after="0"/>
+            </w:pPr>
+            <w:r>
+              <w:rPr>
+                <w:rFonts w:ascii="Heiti SC" w:hAnsi="Heiti SC" w:eastAsia="Heiti SC" w:cs="Heiti SC" w:hint="eastAsia"/>
+                <w:sz w:val="18"/>
+              </w:rPr>
+              <w:t>发布前需要业务或数据负责人确认</w:t>
+            </w:r>
+          </w:p>
+        </w:tc>
+      </w:tr>
+      <w:tr>
+        <w:tc>
+          <w:tcPr>
+            <w:tcW w:type="dxa" w:w="3331"/>
+            <w:vAlign w:val="center"/>
+            <w:tcMar>
+              <w:top w:w="90" w:type="dxa"/>
+              <w:start w:w="100" w:type="dxa"/>
+              <w:bottom w:w="90" w:type="dxa"/>
+              <w:end w:w="100" w:type="dxa"/>
+            </w:tcMar>
+          </w:tcPr>
+          <w:p>
+            <w:pPr>
+              <w:spacing w:after="0"/>
+            </w:pPr>
+            <w:r>
+              <w:rPr>
+                <w:rFonts w:ascii="Heiti SC" w:hAnsi="Heiti SC" w:eastAsia="Heiti SC" w:cs="Heiti SC" w:hint="eastAsia"/>
+                <w:sz w:val="18"/>
+              </w:rPr>
+              <w:t>高风险</w:t>
+            </w:r>
+          </w:p>
+        </w:tc>
+        <w:tc>
+          <w:tcPr>
+            <w:tcW w:type="dxa" w:w="3331"/>
+            <w:vAlign w:val="center"/>
+            <w:tcMar>
+              <w:top w:w="90" w:type="dxa"/>
+              <w:start w:w="100" w:type="dxa"/>
+              <w:bottom w:w="90" w:type="dxa"/>
+              <w:end w:w="100" w:type="dxa"/>
+            </w:tcMar>
+          </w:tcPr>
+          <w:p>
+            <w:pPr>
+              <w:spacing w:after="0"/>
+            </w:pPr>
+            <w:r>
+              <w:rPr>
+                <w:rFonts w:ascii="Heiti SC" w:hAnsi="Heiti SC" w:eastAsia="Heiti SC" w:cs="Heiti SC" w:hint="eastAsia"/>
+                <w:sz w:val="18"/>
+              </w:rPr>
+              <w:t>发布产品、扩大可见范围、批准特殊用途、撤销关键授权</w:t>
+            </w:r>
+          </w:p>
+        </w:tc>
+        <w:tc>
+          <w:tcPr>
+            <w:tcW w:type="dxa" w:w="3331"/>
+            <w:vAlign w:val="center"/>
+            <w:tcMar>
+              <w:top w:w="90" w:type="dxa"/>
+              <w:start w:w="100" w:type="dxa"/>
+              <w:bottom w:w="90" w:type="dxa"/>
+              <w:end w:w="100" w:type="dxa"/>
+            </w:tcMar>
+          </w:tcPr>
+          <w:p>
+            <w:pPr>
+              <w:spacing w:after="0"/>
+            </w:pPr>
+            <w:r>
+              <w:rPr>
+                <w:rFonts w:ascii="Heiti SC" w:hAnsi="Heiti SC" w:eastAsia="Heiti SC" w:cs="Heiti SC" w:hint="eastAsia"/>
+                <w:sz w:val="18"/>
+              </w:rPr>
+              <w:t>必须人工审批</w:t>
+            </w:r>
+          </w:p>
+        </w:tc>
+      </w:tr>
+      <w:tr>
+        <w:tc>
+          <w:tcPr>
+            <w:tcW w:type="dxa" w:w="3331"/>
+            <w:vAlign w:val="center"/>
+            <w:tcMar>
+              <w:top w:w="90" w:type="dxa"/>
+              <w:start w:w="100" w:type="dxa"/>
+              <w:bottom w:w="90" w:type="dxa"/>
+              <w:end w:w="100" w:type="dxa"/>
+            </w:tcMar>
+          </w:tcPr>
+          <w:p>
+            <w:pPr>
+              <w:spacing w:after="0"/>
+            </w:pPr>
+            <w:r>
+              <w:rPr>
+                <w:rFonts w:ascii="Heiti SC" w:hAnsi="Heiti SC" w:eastAsia="Heiti SC" w:cs="Heiti SC" w:hint="eastAsia"/>
+                <w:sz w:val="18"/>
+              </w:rPr>
+              <w:t>禁止默认自动化</w:t>
+            </w:r>
+          </w:p>
+        </w:tc>
+        <w:tc>
+          <w:tcPr>
+            <w:tcW w:type="dxa" w:w="3331"/>
+            <w:vAlign w:val="center"/>
+            <w:tcMar>
+              <w:top w:w="90" w:type="dxa"/>
+              <w:start w:w="100" w:type="dxa"/>
+              <w:bottom w:w="90" w:type="dxa"/>
+              <w:end w:w="100" w:type="dxa"/>
+            </w:tcMar>
+          </w:tcPr>
+          <w:p>
+            <w:pPr>
+              <w:spacing w:after="0"/>
+            </w:pPr>
+            <w:r>
+              <w:rPr>
+                <w:rFonts w:ascii="Heiti SC" w:hAnsi="Heiti SC" w:eastAsia="Heiti SC" w:cs="Heiti SC" w:hint="eastAsia"/>
+                <w:sz w:val="18"/>
+              </w:rPr>
+              <w:t>导出原始数据、修改生产源数据、绕过 Policy、直接签发 Receipt</w:t>
+            </w:r>
+          </w:p>
+        </w:tc>
+        <w:tc>
+          <w:tcPr>
+            <w:tcW w:type="dxa" w:w="3331"/>
+            <w:vAlign w:val="center"/>
+            <w:tcMar>
+              <w:top w:w="90" w:type="dxa"/>
+              <w:start w:w="100" w:type="dxa"/>
+              <w:bottom w:w="90" w:type="dxa"/>
+              <w:end w:w="100" w:type="dxa"/>
+            </w:tcMar>
+          </w:tcPr>
+          <w:p>
+            <w:pPr>
+              <w:spacing w:after="0"/>
+            </w:pPr>
+            <w:r>
+              <w:rPr>
+                <w:rFonts w:ascii="Heiti SC" w:hAnsi="Heiti SC" w:eastAsia="Heiti SC" w:cs="Heiti SC" w:hint="eastAsia"/>
+                <w:sz w:val="18"/>
+              </w:rPr>
+              <w:t>不应开放给 Agent</w:t>
+            </w:r>
+          </w:p>
+        </w:tc>
+      </w:tr>
+    </w:tbl>
+    <w:p/>
+    <w:p>
+      <w:r>
+        <w:rPr>
+          <w:rFonts w:ascii="Heiti SC" w:hAnsi="Heiti SC" w:eastAsia="Heiti SC" w:cs="Heiti SC" w:hint="eastAsia"/>
+          <w:b w:val="0"/>
+        </w:rPr>
+        <w:t>这会让“数据服务数字员工部”更可信：Agent 有足够工具完成繁琐技术工作，但不能越过人的责任边界。</w:t>
+      </w:r>
+    </w:p>
+    <w:p>
+      <w:pPr>
+        <w:pStyle w:val="Heading3"/>
+      </w:pPr>
+      <w:r>
+        <w:rPr>
+          <w:rFonts w:ascii="Heiti SC" w:hAnsi="Heiti SC" w:eastAsia="Heiti SC" w:cs="Heiti SC" w:hint="eastAsia"/>
+        </w:rPr>
+        <w:t>5.5 异步通知为什么重要</w:t>
       </w:r>
     </w:p>
     <w:p>
@@ -7046,7 +8231,7 @@
         <w:rPr>
           <w:rFonts w:ascii="Heiti SC" w:hAnsi="Heiti SC" w:eastAsia="Heiti SC" w:cs="Heiti SC" w:hint="eastAsia"/>
         </w:rPr>
-        <w:t>5.5 awiki.ai 不替代哪些模块</w:t>
+        <w:t>5.6 awiki.ai 不替代哪些模块</w:t>
       </w:r>
     </w:p>
     <w:p>
@@ -7471,6 +8656,80 @@
                 <w:rFonts w:ascii="Heiti SC" w:hAnsi="Heiti SC" w:eastAsia="Heiti SC" w:cs="Heiti SC" w:hint="eastAsia"/>
                 <w:sz w:val="18"/>
               </w:rPr>
+              <w:t>动态本体建模平台</w:t>
+            </w:r>
+          </w:p>
+        </w:tc>
+        <w:tc>
+          <w:tcPr>
+            <w:tcW w:type="dxa" w:w="3331"/>
+            <w:vAlign w:val="center"/>
+            <w:tcMar>
+              <w:top w:w="90" w:type="dxa"/>
+              <w:start w:w="100" w:type="dxa"/>
+              <w:bottom w:w="90" w:type="dxa"/>
+              <w:end w:w="100" w:type="dxa"/>
+            </w:tcMar>
+          </w:tcPr>
+          <w:p>
+            <w:pPr>
+              <w:spacing w:after="0"/>
+            </w:pPr>
+            <w:r>
+              <w:rPr>
+                <w:rFonts w:ascii="Heiti SC" w:hAnsi="Heiti SC" w:eastAsia="Heiti SC" w:cs="Heiti SC" w:hint="eastAsia"/>
+                <w:sz w:val="18"/>
+              </w:rPr>
+              <w:t>不必替代</w:t>
+            </w:r>
+          </w:p>
+        </w:tc>
+        <w:tc>
+          <w:tcPr>
+            <w:tcW w:type="dxa" w:w="3331"/>
+            <w:vAlign w:val="center"/>
+            <w:tcMar>
+              <w:top w:w="90" w:type="dxa"/>
+              <w:start w:w="100" w:type="dxa"/>
+              <w:bottom w:w="90" w:type="dxa"/>
+              <w:end w:w="100" w:type="dxa"/>
+            </w:tcMar>
+          </w:tcPr>
+          <w:p>
+            <w:pPr>
+              <w:spacing w:after="0"/>
+            </w:pPr>
+            <w:r>
+              <w:rPr>
+                <w:rFonts w:ascii="Heiti SC" w:hAnsi="Heiti SC" w:eastAsia="Heiti SC" w:cs="Heiti SC" w:hint="eastAsia"/>
+                <w:sz w:val="18"/>
+              </w:rPr>
+              <w:t>OntoFlow / 其他动态本体平台 / 数据平台能力</w:t>
+            </w:r>
+          </w:p>
+        </w:tc>
+      </w:tr>
+      <w:tr>
+        <w:tc>
+          <w:tcPr>
+            <w:tcW w:type="dxa" w:w="3331"/>
+            <w:vAlign w:val="center"/>
+            <w:tcMar>
+              <w:top w:w="90" w:type="dxa"/>
+              <w:start w:w="100" w:type="dxa"/>
+              <w:bottom w:w="90" w:type="dxa"/>
+              <w:end w:w="100" w:type="dxa"/>
+            </w:tcMar>
+          </w:tcPr>
+          <w:p>
+            <w:pPr>
+              <w:spacing w:after="0"/>
+            </w:pPr>
+            <w:r>
+              <w:rPr>
+                <w:rFonts w:ascii="Heiti SC" w:hAnsi="Heiti SC" w:eastAsia="Heiti SC" w:cs="Heiti SC" w:hint="eastAsia"/>
+                <w:sz w:val="18"/>
+              </w:rPr>
               <w:t>授权最终裁决</w:t>
             </w:r>
           </w:p>
@@ -7808,7 +9067,306 @@
         <w:rPr>
           <w:rFonts w:ascii="Heiti SC" w:hAnsi="Heiti SC" w:eastAsia="Heiti SC" w:cs="Heiti SC" w:hint="eastAsia"/>
         </w:rPr>
-        <w:t>5.6 Demo 应该新增的 awiki.ai 视角</w:t>
+        <w:t>5.7 OntoFlow / 动态本体平台在技术框架中的位置</w:t>
+      </w:r>
+    </w:p>
+    <w:p>
+      <w:r>
+        <w:rPr>
+          <w:rFonts w:ascii="Heiti SC" w:hAnsi="Heiti SC" w:eastAsia="Heiti SC" w:cs="Heiti SC" w:hint="eastAsia"/>
+          <w:b w:val="0"/>
+        </w:rPr>
+        <w:t>从技术框架上，我们应该把自己的边界做清楚：awiki.ai 不需要重做所有动态本体平台能力；Product OSDK 也不应该直接取代 OntoFlow、知识图谱平台、数据中台、湖仓、GIS 平台或规则引擎。</w:t>
+      </w:r>
+    </w:p>
+    <w:p>
+      <w:r>
+        <w:rPr>
+          <w:rFonts w:ascii="Heiti SC" w:hAnsi="Heiti SC" w:eastAsia="Heiti SC" w:cs="Heiti SC" w:hint="eastAsia"/>
+          <w:b w:val="0"/>
+        </w:rPr>
+        <w:t>更稳妥的定位是：</w:t>
+      </w:r>
+    </w:p>
+    <w:tbl>
+      <w:tblPr>
+        <w:tblW w:type="auto" w:w="0"/>
+        <w:jc w:val="left"/>
+        <w:tblLayout w:type="autofit"/>
+        <w:tblLook w:firstColumn="1" w:firstRow="1" w:lastColumn="0" w:lastRow="0" w:noHBand="0" w:noVBand="1" w:val="04A0"/>
+      </w:tblPr>
+      <w:tblGrid>
+        <w:gridCol w:w="9994"/>
+      </w:tblGrid>
+      <w:tr>
+        <w:tc>
+          <w:tcPr>
+            <w:tcW w:type="dxa" w:w="9994"/>
+            <w:shd w:fill="F6F8FA"/>
+            <w:tcMar>
+              <w:top w:w="110" w:type="dxa"/>
+              <w:start w:w="120" w:type="dxa"/>
+              <w:bottom w:w="110" w:type="dxa"/>
+              <w:end w:w="120" w:type="dxa"/>
+            </w:tcMar>
+          </w:tcPr>
+          <w:p>
+            <w:pPr>
+              <w:spacing w:after="0"/>
+            </w:pPr>
+            <w:r>
+              <w:rPr>
+                <w:rFonts w:ascii="Heiti SC" w:hAnsi="Heiti SC" w:eastAsia="Heiti SC" w:cs="Heiti SC" w:hint="eastAsia"/>
+                <w:color w:val="111827"/>
+                <w:sz w:val="16"/>
+              </w:rPr>
+              <w:t>OntoFlow 或其他动态本体平台，是 OSDK 的上游生产系统；</w:t>
+              <w:br/>
+              <w:t>这些平台提供建模、加工、实例化、图关系和动作编排能力；</w:t>
+              <w:br/>
+              <w:t>我们的 Product Compiler 把其中适合对外服务的能力裁剪成数据产品；</w:t>
+              <w:br/>
+              <w:t>awiki.ai Agent 网络把这些上游能力注册成可操作 skill，让数据运营 Agent 可以协同生产、质检和发布。</w:t>
+            </w:r>
+          </w:p>
+        </w:tc>
+      </w:tr>
+    </w:tbl>
+    <w:p/>
+    <w:p>
+      <w:pPr>
+        <w:jc w:val="center"/>
+      </w:pPr>
+      <w:r>
+        <w:drawing>
+          <wp:inline xmlns:a="http://schemas.openxmlformats.org/drawingml/2006/main" xmlns:pic="http://schemas.openxmlformats.org/drawingml/2006/picture">
+            <wp:extent cx="5074920" cy="3365473"/>
+            <wp:docPr id="3" name="Picture 3"/>
+            <wp:cNvGraphicFramePr>
+              <a:graphicFrameLocks noChangeAspect="1"/>
+            </wp:cNvGraphicFramePr>
+            <a:graphic>
+              <a:graphicData uri="http://schemas.openxmlformats.org/drawingml/2006/picture">
+                <pic:pic>
+                  <pic:nvPicPr>
+                    <pic:cNvPr id="0" name="upstream-ontology-skill-boundary.png"/>
+                    <pic:cNvPicPr/>
+                  </pic:nvPicPr>
+                  <pic:blipFill>
+                    <a:blip r:embed="rId11"/>
+                    <a:stretch>
+                      <a:fillRect/>
+                    </a:stretch>
+                  </pic:blipFill>
+                  <pic:spPr>
+                    <a:xfrm>
+                      <a:off x="0" y="0"/>
+                      <a:ext cx="5074920" cy="3365473"/>
+                    </a:xfrm>
+                    <a:prstGeom prst="rect"/>
+                  </pic:spPr>
+                </pic:pic>
+              </a:graphicData>
+            </a:graphic>
+          </wp:inline>
+        </w:drawing>
+      </w:r>
+    </w:p>
+    <w:p>
+      <w:pPr>
+        <w:spacing w:after="200"/>
+        <w:jc w:val="center"/>
+      </w:pPr>
+      <w:r>
+        <w:rPr>
+          <w:rFonts w:ascii="Heiti SC" w:hAnsi="Heiti SC" w:eastAsia="Heiti SC" w:cs="Heiti SC" w:hint="eastAsia"/>
+          <w:color w:val="475569"/>
+          <w:sz w:val="17"/>
+        </w:rPr>
+        <w:t>图：上游动态本体平台、Agent Skill 与 OSDK 产品层分工</w:t>
+      </w:r>
+    </w:p>
+    <w:p>
+      <w:pPr>
+        <w:spacing w:after="40"/>
+      </w:pPr>
+      <w:r>
+        <w:rPr>
+          <w:rFonts w:ascii="Heiti SC" w:hAnsi="Heiti SC" w:eastAsia="Heiti SC" w:cs="Heiti SC" w:hint="eastAsia"/>
+          <w:b/>
+          <w:color w:val="475569"/>
+          <w:sz w:val="18"/>
+        </w:rPr>
+        <w:t>Mermaid 源图（Markdown 中可直接渲染）</w:t>
+      </w:r>
+    </w:p>
+    <w:tbl>
+      <w:tblPr>
+        <w:tblW w:type="auto" w:w="0"/>
+        <w:jc w:val="left"/>
+        <w:tblLayout w:type="autofit"/>
+        <w:tblLook w:firstColumn="1" w:firstRow="1" w:lastColumn="0" w:lastRow="0" w:noHBand="0" w:noVBand="1" w:val="04A0"/>
+      </w:tblPr>
+      <w:tblGrid>
+        <w:gridCol w:w="9994"/>
+      </w:tblGrid>
+      <w:tr>
+        <w:tc>
+          <w:tcPr>
+            <w:tcW w:type="dxa" w:w="9994"/>
+            <w:shd w:fill="F6F8FA"/>
+            <w:tcMar>
+              <w:top w:w="110" w:type="dxa"/>
+              <w:start w:w="120" w:type="dxa"/>
+              <w:bottom w:w="110" w:type="dxa"/>
+              <w:end w:w="120" w:type="dxa"/>
+            </w:tcMar>
+          </w:tcPr>
+          <w:p>
+            <w:pPr>
+              <w:spacing w:after="0"/>
+            </w:pPr>
+            <w:r>
+              <w:rPr>
+                <w:rFonts w:ascii="Heiti SC" w:hAnsi="Heiti SC" w:eastAsia="Heiti SC" w:cs="Heiti SC" w:hint="eastAsia"/>
+                <w:color w:val="111827"/>
+                <w:sz w:val="16"/>
+              </w:rPr>
+              <w:t>flowchart LR</w:t>
+              <w:br/>
+              <w:t xml:space="preserve">    subgraph Provider["数据提供方内部生产域"]</w:t>
+              <w:br/>
+              <w:t xml:space="preserve">        Catalog["数据目录 / 湖仓 / GIS / 图数据库"]</w:t>
+              <w:br/>
+              <w:t xml:space="preserve">        OntoFlow["OntoFlow / 动态本体平台&lt;br/&gt;建模、映射、实例化、动作编排"]</w:t>
+              <w:br/>
+              <w:t xml:space="preserve">        Quality["质量检查 / 分类分级 / 血缘"]</w:t>
+              <w:br/>
+              <w:t xml:space="preserve">        DOIR["DOIR / Product Projection&lt;br/&gt;中间表示与产品投影"]</w:t>
+              <w:br/>
+              <w:t xml:space="preserve">    end</w:t>
+              <w:br/>
+              <w:br/>
+              <w:t xml:space="preserve">    subgraph Awiki["awiki.ai Agent 网络"]</w:t>
+              <w:br/>
+              <w:t xml:space="preserve">        OpsAgent["数据运营 Agent"]</w:t>
+              <w:br/>
+              <w:t xml:space="preserve">        SkillRegistry["Skill Registry&lt;br/&gt;建模、质检、编译、发布、审计"]</w:t>
+              <w:br/>
+              <w:t xml:space="preserve">        Human["人工审批 / 复核"]</w:t>
+              <w:br/>
+              <w:t xml:space="preserve">    end</w:t>
+              <w:br/>
+              <w:br/>
+              <w:t xml:space="preserve">    subgraph ProductLayer["我们的可信数据产品层"]</w:t>
+              <w:br/>
+              <w:t xml:space="preserve">        Compiler["Product Compiler"]</w:t>
+              <w:br/>
+              <w:t xml:space="preserve">        OSDKGen["OSDK / MCP / OpenAPI Generator"]</w:t>
+              <w:br/>
+              <w:t xml:space="preserve">        Gateway["可信数据空间网关"]</w:t>
+              <w:br/>
+              <w:t xml:space="preserve">        Runtime["Provider Runtime"]</w:t>
+              <w:br/>
+              <w:t xml:space="preserve">        Receipt["Execution Receipt"]</w:t>
+              <w:br/>
+              <w:t xml:space="preserve">    end</w:t>
+              <w:br/>
+              <w:br/>
+              <w:t xml:space="preserve">    Catalog --&gt; OntoFlow</w:t>
+              <w:br/>
+              <w:t xml:space="preserve">    OntoFlow --&gt; DOIR</w:t>
+              <w:br/>
+              <w:t xml:space="preserve">    Quality --&gt; DOIR</w:t>
+              <w:br/>
+              <w:t xml:space="preserve">    OpsAgent --&gt; SkillRegistry</w:t>
+              <w:br/>
+              <w:t xml:space="preserve">    SkillRegistry --&gt; OntoFlow</w:t>
+              <w:br/>
+              <w:t xml:space="preserve">    SkillRegistry --&gt; Quality</w:t>
+              <w:br/>
+              <w:t xml:space="preserve">    SkillRegistry --&gt; Compiler</w:t>
+              <w:br/>
+              <w:t xml:space="preserve">    Human --&gt; Compiler</w:t>
+              <w:br/>
+              <w:t xml:space="preserve">    DOIR --&gt; Compiler</w:t>
+              <w:br/>
+              <w:t xml:space="preserve">    Compiler --&gt; OSDKGen</w:t>
+              <w:br/>
+              <w:t xml:space="preserve">    OSDKGen --&gt; Gateway</w:t>
+              <w:br/>
+              <w:t xml:space="preserve">    Gateway --&gt; Runtime</w:t>
+              <w:br/>
+              <w:t xml:space="preserve">    Runtime --&gt; Receipt</w:t>
+            </w:r>
+          </w:p>
+        </w:tc>
+      </w:tr>
+    </w:tbl>
+    <w:p/>
+    <w:p>
+      <w:r>
+        <w:rPr>
+          <w:rFonts w:ascii="Heiti SC" w:hAnsi="Heiti SC" w:eastAsia="Heiti SC" w:cs="Heiti SC" w:hint="eastAsia"/>
+          <w:b w:val="0"/>
+        </w:rPr>
+        <w:t>这条分工有两个好处：</w:t>
+      </w:r>
+    </w:p>
+    <w:p>
+      <w:pPr>
+        <w:pStyle w:val="ListBullet"/>
+      </w:pPr>
+      <w:r>
+        <w:rPr>
+          <w:rFonts w:ascii="Heiti SC" w:hAnsi="Heiti SC" w:eastAsia="Heiti SC" w:cs="Heiti SC" w:hint="eastAsia"/>
+          <w:b w:val="0"/>
+        </w:rPr>
+        <w:t>对数据提供方友好：它们可以继续使用已有数据平台或 OntoFlow 类平台，不需要为了接入 awiki.ai 推倒重来。</w:t>
+      </w:r>
+    </w:p>
+    <w:p>
+      <w:pPr>
+        <w:pStyle w:val="ListBullet"/>
+      </w:pPr>
+      <w:r>
+        <w:rPr>
+          <w:rFonts w:ascii="Heiti SC" w:hAnsi="Heiti SC" w:eastAsia="Heiti SC" w:cs="Heiti SC" w:hint="eastAsia"/>
+          <w:b w:val="0"/>
+        </w:rPr>
+        <w:t>对 Agent 网络友好：Agent 不只是调用最终 OSDK，还能在提供方内部调用“建模、质检、编译、发布、审计”等 skill，形成真正的数据服务生产链。</w:t>
+      </w:r>
+    </w:p>
+    <w:p>
+      <w:pPr>
+        <w:pStyle w:val="ListBullet"/>
+      </w:pPr>
+      <w:r>
+        <w:rPr>
+          <w:rFonts w:ascii="Heiti SC" w:hAnsi="Heiti SC" w:eastAsia="Heiti SC" w:cs="Heiti SC" w:hint="eastAsia"/>
+          <w:b w:val="0"/>
+        </w:rPr>
+        <w:t>对可信边界友好：上游平台可以复杂、灵活、全栈；对外暴露的 OSDK 必须收敛、授权、可审计、可验证。</w:t>
+      </w:r>
+    </w:p>
+    <w:p>
+      <w:r>
+        <w:rPr>
+          <w:rFonts w:ascii="Heiti SC" w:hAnsi="Heiti SC" w:eastAsia="Heiti SC" w:cs="Heiti SC" w:hint="eastAsia"/>
+          <w:b w:val="0"/>
+        </w:rPr>
+        <w:t>所以我们要做的是“把上游动态本体平台生产出的能力产品化、可信化、Agent 化”，而不是和上游平台争夺同一层。</w:t>
+      </w:r>
+    </w:p>
+    <w:p>
+      <w:pPr>
+        <w:pStyle w:val="Heading3"/>
+      </w:pPr>
+      <w:r>
+        <w:rPr>
+          <w:rFonts w:ascii="Heiti SC" w:hAnsi="Heiti SC" w:eastAsia="Heiti SC" w:cs="Heiti SC" w:hint="eastAsia"/>
+        </w:rPr>
+        <w:t>5.8 Demo 应该新增的 awiki.ai 视角</w:t>
       </w:r>
     </w:p>
     <w:p>
@@ -9132,7 +10690,7 @@
         <w:drawing>
           <wp:inline xmlns:a="http://schemas.openxmlformats.org/drawingml/2006/main" xmlns:pic="http://schemas.openxmlformats.org/drawingml/2006/picture">
             <wp:extent cx="5715000" cy="3651250"/>
-            <wp:docPr id="3" name="Picture 3"/>
+            <wp:docPr id="4" name="Picture 4"/>
             <wp:cNvGraphicFramePr>
               <a:graphicFrameLocks noChangeAspect="1"/>
             </wp:cNvGraphicFramePr>
@@ -9144,7 +10702,7 @@
                     <pic:cNvPicPr/>
                   </pic:nvPicPr>
                   <pic:blipFill>
-                    <a:blip r:embed="rId11"/>
+                    <a:blip r:embed="rId12"/>
                     <a:stretch>
                       <a:fillRect/>
                     </a:stretch>
@@ -9944,7 +11502,7 @@
         <w:drawing>
           <wp:inline xmlns:a="http://schemas.openxmlformats.org/drawingml/2006/main" xmlns:pic="http://schemas.openxmlformats.org/drawingml/2006/picture">
             <wp:extent cx="5715000" cy="3651250"/>
-            <wp:docPr id="4" name="Picture 4"/>
+            <wp:docPr id="5" name="Picture 5"/>
             <wp:cNvGraphicFramePr>
               <a:graphicFrameLocks noChangeAspect="1"/>
             </wp:cNvGraphicFramePr>
@@ -9956,7 +11514,7 @@
                     <pic:cNvPicPr/>
                   </pic:nvPicPr>
                   <pic:blipFill>
-                    <a:blip r:embed="rId12"/>
+                    <a:blip r:embed="rId13"/>
                     <a:stretch>
                       <a:fillRect/>
                     </a:stretch>
@@ -10700,7 +12258,7 @@
         <w:drawing>
           <wp:inline xmlns:a="http://schemas.openxmlformats.org/drawingml/2006/main" xmlns:pic="http://schemas.openxmlformats.org/drawingml/2006/picture">
             <wp:extent cx="5715000" cy="3651250"/>
-            <wp:docPr id="5" name="Picture 5"/>
+            <wp:docPr id="6" name="Picture 6"/>
             <wp:cNvGraphicFramePr>
               <a:graphicFrameLocks noChangeAspect="1"/>
             </wp:cNvGraphicFramePr>
@@ -10712,7 +12270,7 @@
                     <pic:cNvPicPr/>
                   </pic:nvPicPr>
                   <pic:blipFill>
-                    <a:blip r:embed="rId13"/>
+                    <a:blip r:embed="rId14"/>
                     <a:stretch>
                       <a:fillRect/>
                     </a:stretch>
@@ -10974,7 +12532,7 @@
         <w:drawing>
           <wp:inline xmlns:a="http://schemas.openxmlformats.org/drawingml/2006/main" xmlns:pic="http://schemas.openxmlformats.org/drawingml/2006/picture">
             <wp:extent cx="5715000" cy="3651250"/>
-            <wp:docPr id="6" name="Picture 6"/>
+            <wp:docPr id="7" name="Picture 7"/>
             <wp:cNvGraphicFramePr>
               <a:graphicFrameLocks noChangeAspect="1"/>
             </wp:cNvGraphicFramePr>
@@ -10986,7 +12544,7 @@
                     <pic:cNvPicPr/>
                   </pic:nvPicPr>
                   <pic:blipFill>
-                    <a:blip r:embed="rId14"/>
+                    <a:blip r:embed="rId15"/>
                     <a:stretch>
                       <a:fillRect/>
                     </a:stretch>
@@ -11027,7 +12585,7 @@
         <w:drawing>
           <wp:inline xmlns:a="http://schemas.openxmlformats.org/drawingml/2006/main" xmlns:pic="http://schemas.openxmlformats.org/drawingml/2006/picture">
             <wp:extent cx="5715000" cy="3651250"/>
-            <wp:docPr id="7" name="Picture 7"/>
+            <wp:docPr id="8" name="Picture 8"/>
             <wp:cNvGraphicFramePr>
               <a:graphicFrameLocks noChangeAspect="1"/>
             </wp:cNvGraphicFramePr>
@@ -11039,7 +12597,7 @@
                     <pic:cNvPicPr/>
                   </pic:nvPicPr>
                   <pic:blipFill>
-                    <a:blip r:embed="rId15"/>
+                    <a:blip r:embed="rId16"/>
                     <a:stretch>
                       <a:fillRect/>
                     </a:stretch>
@@ -12462,6 +14020,631 @@
     <w:p/>
     <w:p>
       <w:pPr>
+        <w:pStyle w:val="Heading3"/>
+      </w:pPr>
+      <w:r>
+        <w:rPr>
+          <w:rFonts w:ascii="Heiti SC" w:hAnsi="Heiti SC" w:eastAsia="Heiti SC" w:cs="Heiti SC" w:hint="eastAsia"/>
+        </w:rPr>
+        <w:t>9.3 数据运营 Agent 的实施风险</w:t>
+      </w:r>
+    </w:p>
+    <w:p>
+      <w:r>
+        <w:rPr>
+          <w:rFonts w:ascii="Heiti SC" w:hAnsi="Heiti SC" w:eastAsia="Heiti SC" w:cs="Heiti SC" w:hint="eastAsia"/>
+          <w:b w:val="0"/>
+        </w:rPr>
+        <w:t>数据运营 Agent 的技术风险不在“能不能让 Agent 调工具”，而在“工具权限如何分层、动作如何审计、关键节点如何人工介入”。如果做成 Agent 直接连库、直接改表、直接发布产品，风险会迅速超过收益。</w:t>
+      </w:r>
+    </w:p>
+    <w:p>
+      <w:r>
+        <w:rPr>
+          <w:rFonts w:ascii="Heiti SC" w:hAnsi="Heiti SC" w:eastAsia="Heiti SC" w:cs="Heiti SC" w:hint="eastAsia"/>
+          <w:b w:val="0"/>
+        </w:rPr>
+        <w:t>建议采用四级实施路线：</w:t>
+      </w:r>
+    </w:p>
+    <w:tbl>
+      <w:tblPr>
+        <w:tblStyle w:val="TableGrid"/>
+        <w:tblW w:type="auto" w:w="0"/>
+        <w:jc w:val="center"/>
+        <w:tblLayout w:type="autofit"/>
+        <w:tblLook w:firstColumn="1" w:firstRow="1" w:lastColumn="0" w:lastRow="0" w:noHBand="0" w:noVBand="1" w:val="04A0"/>
+      </w:tblPr>
+      <w:tblGrid>
+        <w:gridCol w:w="2498"/>
+        <w:gridCol w:w="2498"/>
+        <w:gridCol w:w="2498"/>
+        <w:gridCol w:w="2498"/>
+      </w:tblGrid>
+      <w:tr>
+        <w:tc>
+          <w:tcPr>
+            <w:tcW w:type="dxa" w:w="2498"/>
+            <w:vAlign w:val="center"/>
+            <w:tcMar>
+              <w:top w:w="90" w:type="dxa"/>
+              <w:start w:w="100" w:type="dxa"/>
+              <w:bottom w:w="90" w:type="dxa"/>
+              <w:end w:w="100" w:type="dxa"/>
+            </w:tcMar>
+            <w:shd w:fill="EAF2FF"/>
+          </w:tcPr>
+          <w:p>
+            <w:pPr>
+              <w:spacing w:after="0"/>
+            </w:pPr>
+            <w:r>
+              <w:rPr>
+                <w:rFonts w:ascii="Heiti SC" w:hAnsi="Heiti SC" w:eastAsia="Heiti SC" w:cs="Heiti SC" w:hint="eastAsia"/>
+                <w:b/>
+                <w:color w:val="1E40AF"/>
+                <w:sz w:val="17"/>
+              </w:rPr>
+              <w:t>阶段</w:t>
+            </w:r>
+          </w:p>
+        </w:tc>
+        <w:tc>
+          <w:tcPr>
+            <w:tcW w:type="dxa" w:w="2498"/>
+            <w:vAlign w:val="center"/>
+            <w:tcMar>
+              <w:top w:w="90" w:type="dxa"/>
+              <w:start w:w="100" w:type="dxa"/>
+              <w:bottom w:w="90" w:type="dxa"/>
+              <w:end w:w="100" w:type="dxa"/>
+            </w:tcMar>
+            <w:shd w:fill="EAF2FF"/>
+          </w:tcPr>
+          <w:p>
+            <w:pPr>
+              <w:spacing w:after="0"/>
+            </w:pPr>
+            <w:r>
+              <w:rPr>
+                <w:rFonts w:ascii="Heiti SC" w:hAnsi="Heiti SC" w:eastAsia="Heiti SC" w:cs="Heiti SC" w:hint="eastAsia"/>
+                <w:b/>
+                <w:color w:val="1E40AF"/>
+                <w:sz w:val="17"/>
+              </w:rPr>
+              <w:t>Agent 能做什么</w:t>
+            </w:r>
+          </w:p>
+        </w:tc>
+        <w:tc>
+          <w:tcPr>
+            <w:tcW w:type="dxa" w:w="2498"/>
+            <w:vAlign w:val="center"/>
+            <w:tcMar>
+              <w:top w:w="90" w:type="dxa"/>
+              <w:start w:w="100" w:type="dxa"/>
+              <w:bottom w:w="90" w:type="dxa"/>
+              <w:end w:w="100" w:type="dxa"/>
+            </w:tcMar>
+            <w:shd w:fill="EAF2FF"/>
+          </w:tcPr>
+          <w:p>
+            <w:pPr>
+              <w:spacing w:after="0"/>
+            </w:pPr>
+            <w:r>
+              <w:rPr>
+                <w:rFonts w:ascii="Heiti SC" w:hAnsi="Heiti SC" w:eastAsia="Heiti SC" w:cs="Heiti SC" w:hint="eastAsia"/>
+                <w:b/>
+                <w:color w:val="1E40AF"/>
+                <w:sz w:val="17"/>
+              </w:rPr>
+              <w:t>技术风险</w:t>
+            </w:r>
+          </w:p>
+        </w:tc>
+        <w:tc>
+          <w:tcPr>
+            <w:tcW w:type="dxa" w:w="2498"/>
+            <w:vAlign w:val="center"/>
+            <w:tcMar>
+              <w:top w:w="90" w:type="dxa"/>
+              <w:start w:w="100" w:type="dxa"/>
+              <w:bottom w:w="90" w:type="dxa"/>
+              <w:end w:w="100" w:type="dxa"/>
+            </w:tcMar>
+            <w:shd w:fill="EAF2FF"/>
+          </w:tcPr>
+          <w:p>
+            <w:pPr>
+              <w:spacing w:after="0"/>
+            </w:pPr>
+            <w:r>
+              <w:rPr>
+                <w:rFonts w:ascii="Heiti SC" w:hAnsi="Heiti SC" w:eastAsia="Heiti SC" w:cs="Heiti SC" w:hint="eastAsia"/>
+                <w:b/>
+                <w:color w:val="1E40AF"/>
+                <w:sz w:val="17"/>
+              </w:rPr>
+              <w:t>人工介入</w:t>
+            </w:r>
+          </w:p>
+        </w:tc>
+      </w:tr>
+      <w:tr>
+        <w:tc>
+          <w:tcPr>
+            <w:tcW w:type="dxa" w:w="2498"/>
+            <w:vAlign w:val="center"/>
+            <w:tcMar>
+              <w:top w:w="90" w:type="dxa"/>
+              <w:start w:w="100" w:type="dxa"/>
+              <w:bottom w:w="90" w:type="dxa"/>
+              <w:end w:w="100" w:type="dxa"/>
+            </w:tcMar>
+          </w:tcPr>
+          <w:p>
+            <w:pPr>
+              <w:spacing w:after="0"/>
+            </w:pPr>
+            <w:r>
+              <w:rPr>
+                <w:rFonts w:ascii="Heiti SC" w:hAnsi="Heiti SC" w:eastAsia="Heiti SC" w:cs="Heiti SC" w:hint="eastAsia"/>
+                <w:sz w:val="17"/>
+              </w:rPr>
+              <w:t>L1 辅助说明</w:t>
+            </w:r>
+          </w:p>
+        </w:tc>
+        <w:tc>
+          <w:tcPr>
+            <w:tcW w:type="dxa" w:w="2498"/>
+            <w:vAlign w:val="center"/>
+            <w:tcMar>
+              <w:top w:w="90" w:type="dxa"/>
+              <w:start w:w="100" w:type="dxa"/>
+              <w:bottom w:w="90" w:type="dxa"/>
+              <w:end w:w="100" w:type="dxa"/>
+            </w:tcMar>
+          </w:tcPr>
+          <w:p>
+            <w:pPr>
+              <w:spacing w:after="0"/>
+            </w:pPr>
+            <w:r>
+              <w:rPr>
+                <w:rFonts w:ascii="Heiti SC" w:hAnsi="Heiti SC" w:eastAsia="Heiti SC" w:cs="Heiti SC" w:hint="eastAsia"/>
+                <w:sz w:val="17"/>
+              </w:rPr>
+              <w:t>读取产品文档、解释口径、生成 FAQ、整理审批材料</w:t>
+            </w:r>
+          </w:p>
+        </w:tc>
+        <w:tc>
+          <w:tcPr>
+            <w:tcW w:type="dxa" w:w="2498"/>
+            <w:vAlign w:val="center"/>
+            <w:tcMar>
+              <w:top w:w="90" w:type="dxa"/>
+              <w:start w:w="100" w:type="dxa"/>
+              <w:bottom w:w="90" w:type="dxa"/>
+              <w:end w:w="100" w:type="dxa"/>
+            </w:tcMar>
+          </w:tcPr>
+          <w:p>
+            <w:pPr>
+              <w:spacing w:after="0"/>
+            </w:pPr>
+            <w:r>
+              <w:rPr>
+                <w:rFonts w:ascii="Heiti SC" w:hAnsi="Heiti SC" w:eastAsia="Heiti SC" w:cs="Heiti SC" w:hint="eastAsia"/>
+                <w:sz w:val="17"/>
+              </w:rPr>
+              <w:t>低</w:t>
+            </w:r>
+          </w:p>
+        </w:tc>
+        <w:tc>
+          <w:tcPr>
+            <w:tcW w:type="dxa" w:w="2498"/>
+            <w:vAlign w:val="center"/>
+            <w:tcMar>
+              <w:top w:w="90" w:type="dxa"/>
+              <w:start w:w="100" w:type="dxa"/>
+              <w:bottom w:w="90" w:type="dxa"/>
+              <w:end w:w="100" w:type="dxa"/>
+            </w:tcMar>
+          </w:tcPr>
+          <w:p>
+            <w:pPr>
+              <w:spacing w:after="0"/>
+            </w:pPr>
+            <w:r>
+              <w:rPr>
+                <w:rFonts w:ascii="Heiti SC" w:hAnsi="Heiti SC" w:eastAsia="Heiti SC" w:cs="Heiti SC" w:hint="eastAsia"/>
+                <w:sz w:val="17"/>
+              </w:rPr>
+              <w:t>抽样复核</w:t>
+            </w:r>
+          </w:p>
+        </w:tc>
+      </w:tr>
+      <w:tr>
+        <w:tc>
+          <w:tcPr>
+            <w:tcW w:type="dxa" w:w="2498"/>
+            <w:vAlign w:val="center"/>
+            <w:tcMar>
+              <w:top w:w="90" w:type="dxa"/>
+              <w:start w:w="100" w:type="dxa"/>
+              <w:bottom w:w="90" w:type="dxa"/>
+              <w:end w:w="100" w:type="dxa"/>
+            </w:tcMar>
+          </w:tcPr>
+          <w:p>
+            <w:pPr>
+              <w:spacing w:after="0"/>
+            </w:pPr>
+            <w:r>
+              <w:rPr>
+                <w:rFonts w:ascii="Heiti SC" w:hAnsi="Heiti SC" w:eastAsia="Heiti SC" w:cs="Heiti SC" w:hint="eastAsia"/>
+                <w:sz w:val="17"/>
+              </w:rPr>
+              <w:t>L2 只读分析</w:t>
+            </w:r>
+          </w:p>
+        </w:tc>
+        <w:tc>
+          <w:tcPr>
+            <w:tcW w:type="dxa" w:w="2498"/>
+            <w:vAlign w:val="center"/>
+            <w:tcMar>
+              <w:top w:w="90" w:type="dxa"/>
+              <w:start w:w="100" w:type="dxa"/>
+              <w:bottom w:w="90" w:type="dxa"/>
+              <w:end w:w="100" w:type="dxa"/>
+            </w:tcMar>
+          </w:tcPr>
+          <w:p>
+            <w:pPr>
+              <w:spacing w:after="0"/>
+            </w:pPr>
+            <w:r>
+              <w:rPr>
+                <w:rFonts w:ascii="Heiti SC" w:hAnsi="Heiti SC" w:eastAsia="Heiti SC" w:cs="Heiti SC" w:hint="eastAsia"/>
+                <w:sz w:val="17"/>
+              </w:rPr>
+              <w:t>读取元数据、质量指标、血缘、样例统计，提出建模和分类建议</w:t>
+            </w:r>
+          </w:p>
+        </w:tc>
+        <w:tc>
+          <w:tcPr>
+            <w:tcW w:type="dxa" w:w="2498"/>
+            <w:vAlign w:val="center"/>
+            <w:tcMar>
+              <w:top w:w="90" w:type="dxa"/>
+              <w:start w:w="100" w:type="dxa"/>
+              <w:bottom w:w="90" w:type="dxa"/>
+              <w:end w:w="100" w:type="dxa"/>
+            </w:tcMar>
+          </w:tcPr>
+          <w:p>
+            <w:pPr>
+              <w:spacing w:after="0"/>
+            </w:pPr>
+            <w:r>
+              <w:rPr>
+                <w:rFonts w:ascii="Heiti SC" w:hAnsi="Heiti SC" w:eastAsia="Heiti SC" w:cs="Heiti SC" w:hint="eastAsia"/>
+                <w:sz w:val="17"/>
+              </w:rPr>
+              <w:t>中</w:t>
+            </w:r>
+          </w:p>
+        </w:tc>
+        <w:tc>
+          <w:tcPr>
+            <w:tcW w:type="dxa" w:w="2498"/>
+            <w:vAlign w:val="center"/>
+            <w:tcMar>
+              <w:top w:w="90" w:type="dxa"/>
+              <w:start w:w="100" w:type="dxa"/>
+              <w:bottom w:w="90" w:type="dxa"/>
+              <w:end w:w="100" w:type="dxa"/>
+            </w:tcMar>
+          </w:tcPr>
+          <w:p>
+            <w:pPr>
+              <w:spacing w:after="0"/>
+            </w:pPr>
+            <w:r>
+              <w:rPr>
+                <w:rFonts w:ascii="Heiti SC" w:hAnsi="Heiti SC" w:eastAsia="Heiti SC" w:cs="Heiti SC" w:hint="eastAsia"/>
+                <w:sz w:val="17"/>
+              </w:rPr>
+              <w:t>建模负责人确认</w:t>
+            </w:r>
+          </w:p>
+        </w:tc>
+      </w:tr>
+      <w:tr>
+        <w:tc>
+          <w:tcPr>
+            <w:tcW w:type="dxa" w:w="2498"/>
+            <w:vAlign w:val="center"/>
+            <w:tcMar>
+              <w:top w:w="90" w:type="dxa"/>
+              <w:start w:w="100" w:type="dxa"/>
+              <w:bottom w:w="90" w:type="dxa"/>
+              <w:end w:w="100" w:type="dxa"/>
+            </w:tcMar>
+          </w:tcPr>
+          <w:p>
+            <w:pPr>
+              <w:spacing w:after="0"/>
+            </w:pPr>
+            <w:r>
+              <w:rPr>
+                <w:rFonts w:ascii="Heiti SC" w:hAnsi="Heiti SC" w:eastAsia="Heiti SC" w:cs="Heiti SC" w:hint="eastAsia"/>
+                <w:sz w:val="17"/>
+              </w:rPr>
+              <w:t>L3 受控生产</w:t>
+            </w:r>
+          </w:p>
+        </w:tc>
+        <w:tc>
+          <w:tcPr>
+            <w:tcW w:type="dxa" w:w="2498"/>
+            <w:vAlign w:val="center"/>
+            <w:tcMar>
+              <w:top w:w="90" w:type="dxa"/>
+              <w:start w:w="100" w:type="dxa"/>
+              <w:bottom w:w="90" w:type="dxa"/>
+              <w:end w:w="100" w:type="dxa"/>
+            </w:tcMar>
+          </w:tcPr>
+          <w:p>
+            <w:pPr>
+              <w:spacing w:after="0"/>
+            </w:pPr>
+            <w:r>
+              <w:rPr>
+                <w:rFonts w:ascii="Heiti SC" w:hAnsi="Heiti SC" w:eastAsia="Heiti SC" w:cs="Heiti SC" w:hint="eastAsia"/>
+                <w:sz w:val="17"/>
+              </w:rPr>
+              <w:t>触发质量任务、生成 DOIR 草案、调用 Product Compiler、生成 OSDK 草案</w:t>
+            </w:r>
+          </w:p>
+        </w:tc>
+        <w:tc>
+          <w:tcPr>
+            <w:tcW w:type="dxa" w:w="2498"/>
+            <w:vAlign w:val="center"/>
+            <w:tcMar>
+              <w:top w:w="90" w:type="dxa"/>
+              <w:start w:w="100" w:type="dxa"/>
+              <w:bottom w:w="90" w:type="dxa"/>
+              <w:end w:w="100" w:type="dxa"/>
+            </w:tcMar>
+          </w:tcPr>
+          <w:p>
+            <w:pPr>
+              <w:spacing w:after="0"/>
+            </w:pPr>
+            <w:r>
+              <w:rPr>
+                <w:rFonts w:ascii="Heiti SC" w:hAnsi="Heiti SC" w:eastAsia="Heiti SC" w:cs="Heiti SC" w:hint="eastAsia"/>
+                <w:sz w:val="17"/>
+              </w:rPr>
+              <w:t>中到高</w:t>
+            </w:r>
+          </w:p>
+        </w:tc>
+        <w:tc>
+          <w:tcPr>
+            <w:tcW w:type="dxa" w:w="2498"/>
+            <w:vAlign w:val="center"/>
+            <w:tcMar>
+              <w:top w:w="90" w:type="dxa"/>
+              <w:start w:w="100" w:type="dxa"/>
+              <w:bottom w:w="90" w:type="dxa"/>
+              <w:end w:w="100" w:type="dxa"/>
+            </w:tcMar>
+          </w:tcPr>
+          <w:p>
+            <w:pPr>
+              <w:spacing w:after="0"/>
+            </w:pPr>
+            <w:r>
+              <w:rPr>
+                <w:rFonts w:ascii="Heiti SC" w:hAnsi="Heiti SC" w:eastAsia="Heiti SC" w:cs="Heiti SC" w:hint="eastAsia"/>
+                <w:sz w:val="17"/>
+              </w:rPr>
+              <w:t>发布前强制审批</w:t>
+            </w:r>
+          </w:p>
+        </w:tc>
+      </w:tr>
+      <w:tr>
+        <w:tc>
+          <w:tcPr>
+            <w:tcW w:type="dxa" w:w="2498"/>
+            <w:vAlign w:val="center"/>
+            <w:tcMar>
+              <w:top w:w="90" w:type="dxa"/>
+              <w:start w:w="100" w:type="dxa"/>
+              <w:bottom w:w="90" w:type="dxa"/>
+              <w:end w:w="100" w:type="dxa"/>
+            </w:tcMar>
+          </w:tcPr>
+          <w:p>
+            <w:pPr>
+              <w:spacing w:after="0"/>
+            </w:pPr>
+            <w:r>
+              <w:rPr>
+                <w:rFonts w:ascii="Heiti SC" w:hAnsi="Heiti SC" w:eastAsia="Heiti SC" w:cs="Heiti SC" w:hint="eastAsia"/>
+                <w:sz w:val="17"/>
+              </w:rPr>
+              <w:t>L4 有限自治运营</w:t>
+            </w:r>
+          </w:p>
+        </w:tc>
+        <w:tc>
+          <w:tcPr>
+            <w:tcW w:type="dxa" w:w="2498"/>
+            <w:vAlign w:val="center"/>
+            <w:tcMar>
+              <w:top w:w="90" w:type="dxa"/>
+              <w:start w:w="100" w:type="dxa"/>
+              <w:bottom w:w="90" w:type="dxa"/>
+              <w:end w:w="100" w:type="dxa"/>
+            </w:tcMar>
+          </w:tcPr>
+          <w:p>
+            <w:pPr>
+              <w:spacing w:after="0"/>
+            </w:pPr>
+            <w:r>
+              <w:rPr>
+                <w:rFonts w:ascii="Heiti SC" w:hAnsi="Heiti SC" w:eastAsia="Heiti SC" w:cs="Heiti SC" w:hint="eastAsia"/>
+                <w:sz w:val="17"/>
+              </w:rPr>
+              <w:t>对低风险产品自动重跑质检、重编译、通知客户和登记 Receipt 验证结果</w:t>
+            </w:r>
+          </w:p>
+        </w:tc>
+        <w:tc>
+          <w:tcPr>
+            <w:tcW w:type="dxa" w:w="2498"/>
+            <w:vAlign w:val="center"/>
+            <w:tcMar>
+              <w:top w:w="90" w:type="dxa"/>
+              <w:start w:w="100" w:type="dxa"/>
+              <w:bottom w:w="90" w:type="dxa"/>
+              <w:end w:w="100" w:type="dxa"/>
+            </w:tcMar>
+          </w:tcPr>
+          <w:p>
+            <w:pPr>
+              <w:spacing w:after="0"/>
+            </w:pPr>
+            <w:r>
+              <w:rPr>
+                <w:rFonts w:ascii="Heiti SC" w:hAnsi="Heiti SC" w:eastAsia="Heiti SC" w:cs="Heiti SC" w:hint="eastAsia"/>
+                <w:sz w:val="17"/>
+              </w:rPr>
+              <w:t>高</w:t>
+            </w:r>
+          </w:p>
+        </w:tc>
+        <w:tc>
+          <w:tcPr>
+            <w:tcW w:type="dxa" w:w="2498"/>
+            <w:vAlign w:val="center"/>
+            <w:tcMar>
+              <w:top w:w="90" w:type="dxa"/>
+              <w:start w:w="100" w:type="dxa"/>
+              <w:bottom w:w="90" w:type="dxa"/>
+              <w:end w:w="100" w:type="dxa"/>
+            </w:tcMar>
+          </w:tcPr>
+          <w:p>
+            <w:pPr>
+              <w:spacing w:after="0"/>
+            </w:pPr>
+            <w:r>
+              <w:rPr>
+                <w:rFonts w:ascii="Heiti SC" w:hAnsi="Heiti SC" w:eastAsia="Heiti SC" w:cs="Heiti SC" w:hint="eastAsia"/>
+                <w:sz w:val="17"/>
+              </w:rPr>
+              <w:t>需要白名单、配额、回滚和审计</w:t>
+            </w:r>
+          </w:p>
+        </w:tc>
+      </w:tr>
+    </w:tbl>
+    <w:p/>
+    <w:p>
+      <w:r>
+        <w:rPr>
+          <w:rFonts w:ascii="Heiti SC" w:hAnsi="Heiti SC" w:eastAsia="Heiti SC" w:cs="Heiti SC" w:hint="eastAsia"/>
+          <w:b w:val="0"/>
+        </w:rPr>
+        <w:t>落地时应优先建设这些控制能力：</w:t>
+      </w:r>
+    </w:p>
+    <w:p>
+      <w:pPr>
+        <w:pStyle w:val="ListBullet"/>
+      </w:pPr>
+      <w:r>
+        <w:rPr>
+          <w:rFonts w:ascii="Heiti SC" w:hAnsi="Heiti SC" w:eastAsia="Heiti SC" w:cs="Heiti SC" w:hint="eastAsia"/>
+          <w:b w:val="0"/>
+        </w:rPr>
+        <w:t>Skill Registry：所有可调用工具都必须登记用途、输入输出、权限和风险级别。</w:t>
+      </w:r>
+    </w:p>
+    <w:p>
+      <w:pPr>
+        <w:pStyle w:val="ListBullet"/>
+      </w:pPr>
+      <w:r>
+        <w:rPr>
+          <w:rFonts w:ascii="Heiti SC" w:hAnsi="Heiti SC" w:eastAsia="Heiti SC" w:cs="Heiti SC" w:hint="eastAsia"/>
+          <w:b w:val="0"/>
+        </w:rPr>
+        <w:t>最小权限凭证：Agent 不持有人的长期凭证，只拿短期、限定动作、可撤销的 token。</w:t>
+      </w:r>
+    </w:p>
+    <w:p>
+      <w:pPr>
+        <w:pStyle w:val="ListBullet"/>
+      </w:pPr>
+      <w:r>
+        <w:rPr>
+          <w:rFonts w:ascii="Heiti SC" w:hAnsi="Heiti SC" w:eastAsia="Heiti SC" w:cs="Heiti SC" w:hint="eastAsia"/>
+          <w:b w:val="0"/>
+        </w:rPr>
+        <w:t>人工审批钩子：发布产品、扩大权限、批准特殊用途、外发结果、修改生产绑定必须进入人审。</w:t>
+      </w:r>
+    </w:p>
+    <w:p>
+      <w:pPr>
+        <w:pStyle w:val="ListBullet"/>
+      </w:pPr>
+      <w:r>
+        <w:rPr>
+          <w:rFonts w:ascii="Heiti SC" w:hAnsi="Heiti SC" w:eastAsia="Heiti SC" w:cs="Heiti SC" w:hint="eastAsia"/>
+          <w:b w:val="0"/>
+        </w:rPr>
+        <w:t>审计回放：每个 Agent 动作记录输入、输出、版本、操作者、审批人和结果 hash。</w:t>
+      </w:r>
+    </w:p>
+    <w:p>
+      <w:pPr>
+        <w:pStyle w:val="ListBullet"/>
+      </w:pPr>
+      <w:r>
+        <w:rPr>
+          <w:rFonts w:ascii="Heiti SC" w:hAnsi="Heiti SC" w:eastAsia="Heiti SC" w:cs="Heiti SC" w:hint="eastAsia"/>
+          <w:b w:val="0"/>
+        </w:rPr>
+        <w:t>沙箱验证：编译、测试、样例执行先在沙箱完成，不能直接影响生产 Runtime。</w:t>
+      </w:r>
+    </w:p>
+    <w:p>
+      <w:r>
+        <w:rPr>
+          <w:rFonts w:ascii="Heiti SC" w:hAnsi="Heiti SC" w:eastAsia="Heiti SC" w:cs="Heiti SC" w:hint="eastAsia"/>
+          <w:b w:val="0"/>
+        </w:rPr>
+        <w:t>这意味着：数据运营 Agent 需要“更多全栈能力”，但这些能力应该被产品化成可治理的 skill，而不是把底层平台权限裸露给 Agent。</w:t>
+      </w:r>
+    </w:p>
+    <w:p>
+      <w:pPr>
         <w:pStyle w:val="Heading2"/>
       </w:pPr>
       <w:r>
@@ -12707,7 +14890,7 @@
         <w:drawing>
           <wp:inline xmlns:a="http://schemas.openxmlformats.org/drawingml/2006/main" xmlns:pic="http://schemas.openxmlformats.org/drawingml/2006/picture">
             <wp:extent cx="5715000" cy="3651250"/>
-            <wp:docPr id="8" name="Picture 8"/>
+            <wp:docPr id="9" name="Picture 9"/>
             <wp:cNvGraphicFramePr>
               <a:graphicFrameLocks noChangeAspect="1"/>
             </wp:cNvGraphicFramePr>
@@ -12719,7 +14902,7 @@
                     <pic:cNvPicPr/>
                   </pic:nvPicPr>
                   <pic:blipFill>
-                    <a:blip r:embed="rId11"/>
+                    <a:blip r:embed="rId12"/>
                     <a:stretch>
                       <a:fillRect/>
                     </a:stretch>
@@ -12771,7 +14954,7 @@
         <w:drawing>
           <wp:inline xmlns:a="http://schemas.openxmlformats.org/drawingml/2006/main" xmlns:pic="http://schemas.openxmlformats.org/drawingml/2006/picture">
             <wp:extent cx="5715000" cy="3651250"/>
-            <wp:docPr id="9" name="Picture 9"/>
+            <wp:docPr id="10" name="Picture 10"/>
             <wp:cNvGraphicFramePr>
               <a:graphicFrameLocks noChangeAspect="1"/>
             </wp:cNvGraphicFramePr>
@@ -12783,7 +14966,7 @@
                     <pic:cNvPicPr/>
                   </pic:nvPicPr>
                   <pic:blipFill>
-                    <a:blip r:embed="rId12"/>
+                    <a:blip r:embed="rId13"/>
                     <a:stretch>
                       <a:fillRect/>
                     </a:stretch>
@@ -12835,7 +15018,7 @@
         <w:drawing>
           <wp:inline xmlns:a="http://schemas.openxmlformats.org/drawingml/2006/main" xmlns:pic="http://schemas.openxmlformats.org/drawingml/2006/picture">
             <wp:extent cx="5715000" cy="3651250"/>
-            <wp:docPr id="10" name="Picture 10"/>
+            <wp:docPr id="11" name="Picture 11"/>
             <wp:cNvGraphicFramePr>
               <a:graphicFrameLocks noChangeAspect="1"/>
             </wp:cNvGraphicFramePr>
@@ -12847,7 +15030,7 @@
                     <pic:cNvPicPr/>
                   </pic:nvPicPr>
                   <pic:blipFill>
-                    <a:blip r:embed="rId13"/>
+                    <a:blip r:embed="rId14"/>
                     <a:stretch>
                       <a:fillRect/>
                     </a:stretch>
@@ -12899,7 +15082,7 @@
         <w:drawing>
           <wp:inline xmlns:a="http://schemas.openxmlformats.org/drawingml/2006/main" xmlns:pic="http://schemas.openxmlformats.org/drawingml/2006/picture">
             <wp:extent cx="5715000" cy="3651250"/>
-            <wp:docPr id="11" name="Picture 11"/>
+            <wp:docPr id="12" name="Picture 12"/>
             <wp:cNvGraphicFramePr>
               <a:graphicFrameLocks noChangeAspect="1"/>
             </wp:cNvGraphicFramePr>
@@ -12911,7 +15094,7 @@
                     <pic:cNvPicPr/>
                   </pic:nvPicPr>
                   <pic:blipFill>
-                    <a:blip r:embed="rId14"/>
+                    <a:blip r:embed="rId15"/>
                     <a:stretch>
                       <a:fillRect/>
                     </a:stretch>
@@ -12963,7 +15146,7 @@
         <w:drawing>
           <wp:inline xmlns:a="http://schemas.openxmlformats.org/drawingml/2006/main" xmlns:pic="http://schemas.openxmlformats.org/drawingml/2006/picture">
             <wp:extent cx="5715000" cy="3651250"/>
-            <wp:docPr id="12" name="Picture 12"/>
+            <wp:docPr id="13" name="Picture 13"/>
             <wp:cNvGraphicFramePr>
               <a:graphicFrameLocks noChangeAspect="1"/>
             </wp:cNvGraphicFramePr>
@@ -12975,7 +15158,7 @@
                     <pic:cNvPicPr/>
                   </pic:nvPicPr>
                   <pic:blipFill>
-                    <a:blip r:embed="rId15"/>
+                    <a:blip r:embed="rId16"/>
                     <a:stretch>
                       <a:fillRect/>
                     </a:stretch>
@@ -13633,6 +15816,106 @@
                 <w:sz w:val="18"/>
               </w:rPr>
               <w:t>数据提供方内部的一组 Agent，负责数据产品生产、授权运营、交付和复核</w:t>
+            </w:r>
+          </w:p>
+        </w:tc>
+      </w:tr>
+      <w:tr>
+        <w:tc>
+          <w:tcPr>
+            <w:tcW w:type="dxa" w:w="4997"/>
+            <w:vAlign w:val="center"/>
+            <w:tcMar>
+              <w:top w:w="90" w:type="dxa"/>
+              <w:start w:w="100" w:type="dxa"/>
+              <w:bottom w:w="90" w:type="dxa"/>
+              <w:end w:w="100" w:type="dxa"/>
+            </w:tcMar>
+          </w:tcPr>
+          <w:p>
+            <w:pPr>
+              <w:spacing w:after="0"/>
+            </w:pPr>
+            <w:r>
+              <w:rPr>
+                <w:rFonts w:ascii="Heiti SC" w:hAnsi="Heiti SC" w:eastAsia="Heiti SC" w:cs="Heiti SC" w:hint="eastAsia"/>
+                <w:sz w:val="18"/>
+              </w:rPr>
+              <w:t>数据运营 Agent</w:t>
+            </w:r>
+          </w:p>
+        </w:tc>
+        <w:tc>
+          <w:tcPr>
+            <w:tcW w:type="dxa" w:w="4997"/>
+            <w:vAlign w:val="center"/>
+            <w:tcMar>
+              <w:top w:w="90" w:type="dxa"/>
+              <w:start w:w="100" w:type="dxa"/>
+              <w:bottom w:w="90" w:type="dxa"/>
+              <w:end w:w="100" w:type="dxa"/>
+            </w:tcMar>
+          </w:tcPr>
+          <w:p>
+            <w:pPr>
+              <w:spacing w:after="0"/>
+            </w:pPr>
+            <w:r>
+              <w:rPr>
+                <w:rFonts w:ascii="Heiti SC" w:hAnsi="Heiti SC" w:eastAsia="Heiti SC" w:cs="Heiti SC" w:hint="eastAsia"/>
+                <w:sz w:val="18"/>
+              </w:rPr>
+              <w:t>数据提供方内部的技术型 Agent，受控调用数据目录、动态本体平台、质量、编译、发布和审计工具</w:t>
+            </w:r>
+          </w:p>
+        </w:tc>
+      </w:tr>
+      <w:tr>
+        <w:tc>
+          <w:tcPr>
+            <w:tcW w:type="dxa" w:w="4997"/>
+            <w:vAlign w:val="center"/>
+            <w:tcMar>
+              <w:top w:w="90" w:type="dxa"/>
+              <w:start w:w="100" w:type="dxa"/>
+              <w:bottom w:w="90" w:type="dxa"/>
+              <w:end w:w="100" w:type="dxa"/>
+            </w:tcMar>
+          </w:tcPr>
+          <w:p>
+            <w:pPr>
+              <w:spacing w:after="0"/>
+            </w:pPr>
+            <w:r>
+              <w:rPr>
+                <w:rFonts w:ascii="Heiti SC" w:hAnsi="Heiti SC" w:eastAsia="Heiti SC" w:cs="Heiti SC" w:hint="eastAsia"/>
+                <w:sz w:val="18"/>
+              </w:rPr>
+              <w:t>OntoFlow / 动态本体平台</w:t>
+            </w:r>
+          </w:p>
+        </w:tc>
+        <w:tc>
+          <w:tcPr>
+            <w:tcW w:type="dxa" w:w="4997"/>
+            <w:vAlign w:val="center"/>
+            <w:tcMar>
+              <w:top w:w="90" w:type="dxa"/>
+              <w:start w:w="100" w:type="dxa"/>
+              <w:bottom w:w="90" w:type="dxa"/>
+              <w:end w:w="100" w:type="dxa"/>
+            </w:tcMar>
+          </w:tcPr>
+          <w:p>
+            <w:pPr>
+              <w:spacing w:after="0"/>
+            </w:pPr>
+            <w:r>
+              <w:rPr>
+                <w:rFonts w:ascii="Heiti SC" w:hAnsi="Heiti SC" w:eastAsia="Heiti SC" w:cs="Heiti SC" w:hint="eastAsia"/>
+                <w:sz w:val="18"/>
+              </w:rPr>
+              <w:t>OSDK 的上游生产系统，负责建模、映射、实例化、图关系和动作编排，可注册为 awiki.ai Agent 网络中的 skill</w:t>
             </w:r>
           </w:p>
         </w:tc>

</xml_diff>